<commit_message>
fix(export): Footnote bidirectional hyperlinks, native collapsible headings, and clean ASCII/tree monospace blocks without per-word borders
</commit_message>
<xml_diff>
--- a/media/massive-markdown-showcase.docx
+++ b/media/massive-markdown-showcase.docx
@@ -358,7 +358,7 @@
         </w:rPr>
         <w:t xml:space="preserve">, and a </w:t>
       </w:r>
-      <w:hyperlink xmlns:r="http://schemas.openxmlformats.org/officeDocument/2006/relationships" r:id="Ref00acd3d05b4445">
+      <w:hyperlink xmlns:r="http://schemas.openxmlformats.org/officeDocument/2006/relationships" r:id="R03477b80b6844ce5">
         <w:r>
           <w:rPr>
             <w:color w:val="0563C1"/>
@@ -1068,6 +1068,7 @@
         </w:pBdr>
         <w:shd w:val="clear" w:color="auto" w:fill="F6F8FA"/>
         <w:wordWrap w:val="false"/>
+        <w:spacing w:before="60" w:after="60" w:line="240" w:lineRule="auto"/>
       </w:pPr>
       <w:r>
         <w:rPr>
@@ -1214,6 +1215,7 @@
         </w:pBdr>
         <w:shd w:val="clear" w:color="auto" w:fill="F6F8FA"/>
         <w:wordWrap w:val="false"/>
+        <w:spacing w:before="60" w:after="60" w:line="240" w:lineRule="auto"/>
       </w:pPr>
       <w:r>
         <w:rPr>
@@ -1379,6 +1381,7 @@
         </w:pBdr>
         <w:shd w:val="clear" w:color="auto" w:fill="F6F8FA"/>
         <w:wordWrap w:val="false"/>
+        <w:spacing w:before="60" w:after="60" w:line="240" w:lineRule="auto"/>
       </w:pPr>
       <w:r>
         <w:rPr>
@@ -1577,6 +1580,7 @@
         </w:pBdr>
         <w:shd w:val="clear" w:color="auto" w:fill="F6F8FA"/>
         <w:wordWrap w:val="false"/>
+        <w:spacing w:before="60" w:after="60" w:line="240" w:lineRule="auto"/>
       </w:pPr>
       <w:r>
         <w:rPr>
@@ -2962,20 +2966,25 @@
         </w:rPr>
         <w:t xml:space="preserve">Here's a sentence with a reference.</w:t>
       </w:r>
-      <w:r>
-        <w:rPr>
-          <w:vertAlign w:val="superscript"/>
-          <mc:AlternateContent>
-            <mc:Choice Requires="w14">
-              <w14:ligatures w14:val="standardContextual"/>
-              <w14:numForm w14:val="oldStyle"/>
-              <w14:numSpacing w14:val="proportional"/>
-              <w14:cntxtAlts/>
-            </mc:Choice>
-          </mc:AlternateContent>
-        </w:rPr>
-        <w:t xml:space="preserve">[1]</w:t>
-      </w:r>
+      <w:bookmarkStart w:name="_fnref_1" w:id="20"/>
+      <w:bookmarkEnd w:id="20"/>
+      <w:hyperlink w:history="true" w:anchor="_fn_1">
+        <w:r>
+          <w:rPr>
+            <w:color w:val="0563C1"/>
+            <w:vertAlign w:val="superscript"/>
+            <mc:AlternateContent>
+              <mc:Choice Requires="w14">
+                <w14:ligatures w14:val="standardContextual"/>
+                <w14:numForm w14:val="oldStyle"/>
+                <w14:numSpacing w14:val="proportional"/>
+                <w14:cntxtAlts/>
+              </mc:Choice>
+            </mc:AlternateContent>
+          </w:rPr>
+          <w:t xml:space="preserve">[1]</w:t>
+        </w:r>
+      </w:hyperlink>
     </w:p>
     <w:p>
       <w:pPr>
@@ -2988,7 +2997,7 @@
       <w:pPr>
         <w:pStyle w:val="Heading2"/>
       </w:pPr>
-      <w:bookmarkStart w:name="H_collapsible_section" w:id="20"/>
+      <w:bookmarkStart w:name="H_collapsible_section" w:id="21"/>
       <w:r>
         <w:rPr>
           <mc:AlternateContent>
@@ -3002,11 +3011,12 @@
         </w:rPr>
         <w:t xml:space="preserve">Collapsible Section</w:t>
       </w:r>
-      <w:bookmarkEnd w:id="20"/>
-    </w:p>
-    <w:p>
-      <w:pPr>
-        <w:outlineLvl w:val="8"/>
+      <w:bookmarkEnd w:id="21"/>
+    </w:p>
+    <w:p>
+      <w:pPr>
+        <w:pStyle w:val="Heading4"/>
+        <w:outlineLvl w:val="3"/>
         <w15:collapsed w:val="true"/>
       </w:pPr>
       <w:r>
@@ -3103,6 +3113,7 @@
         </w:pBdr>
         <w:shd w:val="clear" w:color="auto" w:fill="F6F8FA"/>
         <w:wordWrap w:val="false"/>
+        <w:spacing w:before="60" w:after="60" w:line="240" w:lineRule="auto"/>
       </w:pPr>
       <w:r>
         <w:rPr>
@@ -3148,7 +3159,7 @@
       <w:pPr>
         <w:pStyle w:val="Heading1"/>
       </w:pPr>
-      <w:bookmarkStart w:name="H_mermaid_diagrams_shapeforgetm" w:id="21"/>
+      <w:bookmarkStart w:name="H_mermaid_diagrams_shapeforgetm" w:id="22"/>
       <w:r>
         <w:rPr>
           <mc:AlternateContent>
@@ -3189,13 +3200,13 @@
         </w:rPr>
         <w:t xml:space="preserve">)</w:t>
       </w:r>
-      <w:bookmarkEnd w:id="21"/>
+      <w:bookmarkEnd w:id="22"/>
     </w:p>
     <w:p>
       <w:pPr>
         <w:pStyle w:val="Heading2"/>
       </w:pPr>
-      <w:bookmarkStart w:name="H_architecture_flowchart" w:id="22"/>
+      <w:bookmarkStart w:name="H_architecture_flowchart" w:id="23"/>
       <w:r>
         <w:rPr>
           <mc:AlternateContent>
@@ -3209,7 +3220,7 @@
         </w:rPr>
         <w:t xml:space="preserve">Architecture Flowchart</w:t>
       </w:r>
-      <w:bookmarkEnd w:id="22"/>
+      <w:bookmarkEnd w:id="23"/>
     </w:p>
     <w:p>
       <w:pPr>
@@ -3800,7 +3811,7 @@
       <w:pPr>
         <w:pStyle w:val="Heading2"/>
       </w:pPr>
-      <w:bookmarkStart w:name="H_sequence_diagram" w:id="23"/>
+      <w:bookmarkStart w:name="H_sequence_diagram" w:id="24"/>
       <w:r>
         <w:rPr>
           <mc:AlternateContent>
@@ -3814,7 +3825,7 @@
         </w:rPr>
         <w:t xml:space="preserve">Sequence Diagram</w:t>
       </w:r>
-      <w:bookmarkEnd w:id="23"/>
+      <w:bookmarkEnd w:id="24"/>
     </w:p>
     <w:p>
       <w:pPr>
@@ -4961,7 +4972,7 @@
       <w:pPr>
         <w:pStyle w:val="Heading1"/>
       </w:pPr>
-      <w:bookmarkStart w:name="H_mathematical_equations_native_omm" w:id="24"/>
+      <w:bookmarkStart w:name="H_mathematical_equations_native_omm" w:id="25"/>
       <w:r>
         <w:rPr>
           <mc:AlternateContent>
@@ -4975,7 +4986,7 @@
         </w:rPr>
         <w:t xml:space="preserve">Mathematical Equations (Native OMML)</w:t>
       </w:r>
-      <w:bookmarkEnd w:id="24"/>
+      <w:bookmarkEnd w:id="25"/>
     </w:p>
     <w:p>
       <w:r>
@@ -5257,7 +5268,7 @@
       <w:pPr>
         <w:pStyle w:val="Heading1"/>
       </w:pPr>
-      <w:bookmarkStart w:name="H_ascii_architecture_diagram" w:id="25"/>
+      <w:bookmarkStart w:name="H_ascii_architecture_diagram" w:id="26"/>
       <w:r>
         <w:rPr>
           <mc:AlternateContent>
@@ -5271,7 +5282,7 @@
         </w:rPr>
         <w:t xml:space="preserve">ASCII Architecture Diagram</w:t>
       </w:r>
-      <w:bookmarkEnd w:id="25"/>
+      <w:bookmarkEnd w:id="26"/>
     </w:p>
     <w:p>
       <w:pPr>
@@ -5284,6 +5295,7 @@
         </w:pBdr>
         <w:shd w:val="clear" w:color="auto" w:fill="F6F8FA"/>
         <w:wordWrap w:val="false"/>
+        <w:spacing w:before="60" w:after="60" w:line="240" w:lineRule="auto"/>
       </w:pPr>
       <w:r>
         <w:rPr>
@@ -5291,8 +5303,6 @@
           <w:noProof/>
           <w:color w:val="1b1f23"/>
           <w:sz w:val="20"/>
-          <w:bdr w:val="single" w:color="auto" w:sz="4" w:space="1"/>
-          <w:shd w:val="clear" w:color="auto" w:fill="auto"/>
         </w:rPr>
         <w:t xml:space="preserve">Internet</w:t>
       </w:r>
@@ -5305,8 +5315,6 @@
           <w:noProof/>
           <w:color w:val="1b1f23"/>
           <w:sz w:val="20"/>
-          <w:bdr w:val="single" w:color="auto" w:sz="4" w:space="1"/>
-          <w:shd w:val="clear" w:color="auto" w:fill="auto"/>
         </w:rPr>
         <w:t xml:space="preserve">   |</w:t>
       </w:r>
@@ -5322,8 +5330,6 @@
           <w:noProof/>
           <w:color w:val="1b1f23"/>
           <w:sz w:val="20"/>
-          <w:bdr w:val="single" w:color="auto" w:sz="4" w:space="1"/>
-          <w:shd w:val="clear" w:color="auto" w:fill="auto"/>
         </w:rPr>
         <w:t xml:space="preserve">|   Firewall    |</w:t>
       </w:r>
@@ -5339,8 +5345,6 @@
           <w:noProof/>
           <w:color w:val="1b1f23"/>
           <w:sz w:val="20"/>
-          <w:bdr w:val="single" w:color="auto" w:sz="4" w:space="1"/>
-          <w:shd w:val="clear" w:color="auto" w:fill="auto"/>
         </w:rPr>
         <w:t xml:space="preserve">   |</w:t>
       </w:r>
@@ -5356,8 +5360,6 @@
           <w:noProof/>
           <w:color w:val="1b1f23"/>
           <w:sz w:val="20"/>
-          <w:bdr w:val="single" w:color="auto" w:sz="4" w:space="1"/>
-          <w:shd w:val="clear" w:color="auto" w:fill="auto"/>
         </w:rPr>
         <w:t xml:space="preserve">|                 |</w:t>
       </w:r>
@@ -5373,8 +5375,6 @@
           <w:noProof/>
           <w:color w:val="1b1f23"/>
           <w:sz w:val="20"/>
-          <w:bdr w:val="single" w:color="auto" w:sz="4" w:space="1"/>
-          <w:shd w:val="clear" w:color="auto" w:fill="auto"/>
         </w:rPr>
         <w:t xml:space="preserve">| Server1 |      | Server2 |</w:t>
       </w:r>
@@ -5390,8 +5390,6 @@
           <w:noProof/>
           <w:color w:val="1b1f23"/>
           <w:sz w:val="20"/>
-          <w:bdr w:val="single" w:color="auto" w:sz="4" w:space="1"/>
-          <w:shd w:val="clear" w:color="auto" w:fill="auto"/>
         </w:rPr>
         <w:t xml:space="preserve">    \             /</w:t>
       </w:r>
@@ -5404,8 +5402,6 @@
           <w:noProof/>
           <w:color w:val="1b1f23"/>
           <w:sz w:val="20"/>
-          <w:bdr w:val="single" w:color="auto" w:sz="4" w:space="1"/>
-          <w:shd w:val="clear" w:color="auto" w:fill="auto"/>
         </w:rPr>
         <w:t xml:space="preserve">     \           /</w:t>
       </w:r>
@@ -5418,8 +5414,6 @@
           <w:noProof/>
           <w:color w:val="1b1f23"/>
           <w:sz w:val="20"/>
-          <w:bdr w:val="single" w:color="auto" w:sz="4" w:space="1"/>
-          <w:shd w:val="clear" w:color="auto" w:fill="auto"/>
         </w:rPr>
         <w:t xml:space="preserve">      +---------+</w:t>
       </w:r>
@@ -5432,8 +5426,6 @@
           <w:noProof/>
           <w:color w:val="1b1f23"/>
           <w:sz w:val="20"/>
-          <w:bdr w:val="single" w:color="auto" w:sz="4" w:space="1"/>
-          <w:shd w:val="clear" w:color="auto" w:fill="auto"/>
         </w:rPr>
         <w:t xml:space="preserve">      | Database|</w:t>
       </w:r>
@@ -5446,8 +5438,6 @@
           <w:noProof/>
           <w:color w:val="1b1f23"/>
           <w:sz w:val="20"/>
-          <w:bdr w:val="single" w:color="auto" w:sz="4" w:space="1"/>
-          <w:shd w:val="clear" w:color="auto" w:fill="auto"/>
         </w:rPr>
         <w:t xml:space="preserve">      +---------+</w:t>
       </w:r>
@@ -5463,7 +5453,7 @@
       <w:pPr>
         <w:pStyle w:val="Heading1"/>
       </w:pPr>
-      <w:bookmarkStart w:name="H_project_tree_structure" w:id="26"/>
+      <w:bookmarkStart w:name="H_project_tree_structure" w:id="27"/>
       <w:r>
         <w:rPr>
           <mc:AlternateContent>
@@ -5477,7 +5467,7 @@
         </w:rPr>
         <w:t xml:space="preserve">Project Tree Structure</w:t>
       </w:r>
-      <w:bookmarkEnd w:id="26"/>
+      <w:bookmarkEnd w:id="27"/>
     </w:p>
     <w:p>
       <w:pPr>
@@ -5490,6 +5480,7 @@
         </w:pBdr>
         <w:shd w:val="clear" w:color="auto" w:fill="F6F8FA"/>
         <w:wordWrap w:val="false"/>
+        <w:spacing w:before="60" w:after="60" w:line="240" w:lineRule="auto"/>
       </w:pPr>
       <w:r>
         <w:rPr>
@@ -5497,8 +5488,6 @@
           <w:noProof/>
           <w:color w:val="1b1f23"/>
           <w:sz w:val="20"/>
-          <w:bdr w:val="single" w:color="auto" w:sz="4" w:space="1"/>
-          <w:shd w:val="clear" w:color="auto" w:fill="auto"/>
         </w:rPr>
         <w:t xml:space="preserve">marksmith/</w:t>
       </w:r>
@@ -5511,8 +5500,6 @@
           <w:rFonts w:ascii="Consolas" w:hAnsi="Consolas"/>
           <w:noProof/>
           <w:sz w:val="20"/>
-          <w:bdr w:val="single" w:color="auto" w:sz="4" w:space="1"/>
-          <w:shd w:val="clear" w:color="auto" w:fill="auto"/>
         </w:rPr>
         <w:t xml:space="preserve">│</w:t>
       </w:r>
@@ -5525,8 +5512,6 @@
           <w:rFonts w:ascii="Consolas" w:hAnsi="Consolas"/>
           <w:noProof/>
           <w:sz w:val="20"/>
-          <w:bdr w:val="single" w:color="auto" w:sz="4" w:space="1"/>
-          <w:shd w:val="clear" w:color="auto" w:fill="auto"/>
         </w:rPr>
         <w:t xml:space="preserve">├</w:t>
       </w:r>
@@ -5536,8 +5521,6 @@
           <w:rFonts w:ascii="Consolas" w:hAnsi="Consolas"/>
           <w:noProof/>
           <w:sz w:val="20"/>
-          <w:bdr w:val="single" w:color="auto" w:sz="4" w:space="1"/>
-          <w:shd w:val="clear" w:color="auto" w:fill="auto"/>
         </w:rPr>
         <w:t xml:space="preserve">─</w:t>
       </w:r>
@@ -5547,8 +5530,6 @@
           <w:rFonts w:ascii="Consolas" w:hAnsi="Consolas"/>
           <w:noProof/>
           <w:sz w:val="20"/>
-          <w:bdr w:val="single" w:color="auto" w:sz="4" w:space="1"/>
-          <w:shd w:val="clear" w:color="auto" w:fill="auto"/>
         </w:rPr>
         <w:t xml:space="preserve">─</w:t>
       </w:r>
@@ -5558,8 +5539,6 @@
           <w:noProof/>
           <w:color w:val="1b1f23"/>
           <w:sz w:val="20"/>
-          <w:bdr w:val="single" w:color="auto" w:sz="4" w:space="1"/>
-          <w:shd w:val="clear" w:color="auto" w:fill="auto"/>
         </w:rPr>
         <w:t xml:space="preserve"> README.md</w:t>
       </w:r>
@@ -5572,8 +5551,6 @@
           <w:rFonts w:ascii="Consolas" w:hAnsi="Consolas"/>
           <w:noProof/>
           <w:sz w:val="20"/>
-          <w:bdr w:val="single" w:color="auto" w:sz="4" w:space="1"/>
-          <w:shd w:val="clear" w:color="auto" w:fill="auto"/>
         </w:rPr>
         <w:t xml:space="preserve">├</w:t>
       </w:r>
@@ -5583,8 +5560,6 @@
           <w:rFonts w:ascii="Consolas" w:hAnsi="Consolas"/>
           <w:noProof/>
           <w:sz w:val="20"/>
-          <w:bdr w:val="single" w:color="auto" w:sz="4" w:space="1"/>
-          <w:shd w:val="clear" w:color="auto" w:fill="auto"/>
         </w:rPr>
         <w:t xml:space="preserve">─</w:t>
       </w:r>
@@ -5594,8 +5569,6 @@
           <w:rFonts w:ascii="Consolas" w:hAnsi="Consolas"/>
           <w:noProof/>
           <w:sz w:val="20"/>
-          <w:bdr w:val="single" w:color="auto" w:sz="4" w:space="1"/>
-          <w:shd w:val="clear" w:color="auto" w:fill="auto"/>
         </w:rPr>
         <w:t xml:space="preserve">─</w:t>
       </w:r>
@@ -5605,8 +5578,6 @@
           <w:noProof/>
           <w:color w:val="1b1f23"/>
           <w:sz w:val="20"/>
-          <w:bdr w:val="single" w:color="auto" w:sz="4" w:space="1"/>
-          <w:shd w:val="clear" w:color="auto" w:fill="auto"/>
         </w:rPr>
         <w:t xml:space="preserve"> LICENSE</w:t>
       </w:r>
@@ -5619,8 +5590,6 @@
           <w:rFonts w:ascii="Consolas" w:hAnsi="Consolas"/>
           <w:noProof/>
           <w:sz w:val="20"/>
-          <w:bdr w:val="single" w:color="auto" w:sz="4" w:space="1"/>
-          <w:shd w:val="clear" w:color="auto" w:fill="auto"/>
         </w:rPr>
         <w:t xml:space="preserve">├</w:t>
       </w:r>
@@ -5630,8 +5599,6 @@
           <w:rFonts w:ascii="Consolas" w:hAnsi="Consolas"/>
           <w:noProof/>
           <w:sz w:val="20"/>
-          <w:bdr w:val="single" w:color="auto" w:sz="4" w:space="1"/>
-          <w:shd w:val="clear" w:color="auto" w:fill="auto"/>
         </w:rPr>
         <w:t xml:space="preserve">─</w:t>
       </w:r>
@@ -5641,8 +5608,6 @@
           <w:rFonts w:ascii="Consolas" w:hAnsi="Consolas"/>
           <w:noProof/>
           <w:sz w:val="20"/>
-          <w:bdr w:val="single" w:color="auto" w:sz="4" w:space="1"/>
-          <w:shd w:val="clear" w:color="auto" w:fill="auto"/>
         </w:rPr>
         <w:t xml:space="preserve">─</w:t>
       </w:r>
@@ -5652,8 +5617,6 @@
           <w:noProof/>
           <w:color w:val="1b1f23"/>
           <w:sz w:val="20"/>
-          <w:bdr w:val="single" w:color="auto" w:sz="4" w:space="1"/>
-          <w:shd w:val="clear" w:color="auto" w:fill="auto"/>
         </w:rPr>
         <w:t xml:space="preserve"> docs/</w:t>
       </w:r>
@@ -5666,8 +5629,6 @@
           <w:rFonts w:ascii="Consolas" w:hAnsi="Consolas"/>
           <w:noProof/>
           <w:sz w:val="20"/>
-          <w:bdr w:val="single" w:color="auto" w:sz="4" w:space="1"/>
-          <w:shd w:val="clear" w:color="auto" w:fill="auto"/>
         </w:rPr>
         <w:t xml:space="preserve">│</w:t>
       </w:r>
@@ -5677,8 +5638,6 @@
           <w:noProof/>
           <w:color w:val="1b1f23"/>
           <w:sz w:val="20"/>
-          <w:bdr w:val="single" w:color="auto" w:sz="4" w:space="1"/>
-          <w:shd w:val="clear" w:color="auto" w:fill="auto"/>
         </w:rPr>
         <w:t xml:space="preserve">   </w:t>
       </w:r>
@@ -5688,8 +5647,6 @@
           <w:rFonts w:ascii="Consolas" w:hAnsi="Consolas"/>
           <w:noProof/>
           <w:sz w:val="20"/>
-          <w:bdr w:val="single" w:color="auto" w:sz="4" w:space="1"/>
-          <w:shd w:val="clear" w:color="auto" w:fill="auto"/>
         </w:rPr>
         <w:t xml:space="preserve">├</w:t>
       </w:r>
@@ -5699,8 +5656,6 @@
           <w:rFonts w:ascii="Consolas" w:hAnsi="Consolas"/>
           <w:noProof/>
           <w:sz w:val="20"/>
-          <w:bdr w:val="single" w:color="auto" w:sz="4" w:space="1"/>
-          <w:shd w:val="clear" w:color="auto" w:fill="auto"/>
         </w:rPr>
         <w:t xml:space="preserve">─</w:t>
       </w:r>
@@ -5710,8 +5665,6 @@
           <w:rFonts w:ascii="Consolas" w:hAnsi="Consolas"/>
           <w:noProof/>
           <w:sz w:val="20"/>
-          <w:bdr w:val="single" w:color="auto" w:sz="4" w:space="1"/>
-          <w:shd w:val="clear" w:color="auto" w:fill="auto"/>
         </w:rPr>
         <w:t xml:space="preserve">─</w:t>
       </w:r>
@@ -5721,8 +5674,6 @@
           <w:noProof/>
           <w:color w:val="1b1f23"/>
           <w:sz w:val="20"/>
-          <w:bdr w:val="single" w:color="auto" w:sz="4" w:space="1"/>
-          <w:shd w:val="clear" w:color="auto" w:fill="auto"/>
         </w:rPr>
         <w:t xml:space="preserve"> architecture.md</w:t>
       </w:r>
@@ -5735,8 +5686,6 @@
           <w:rFonts w:ascii="Consolas" w:hAnsi="Consolas"/>
           <w:noProof/>
           <w:sz w:val="20"/>
-          <w:bdr w:val="single" w:color="auto" w:sz="4" w:space="1"/>
-          <w:shd w:val="clear" w:color="auto" w:fill="auto"/>
         </w:rPr>
         <w:t xml:space="preserve">│</w:t>
       </w:r>
@@ -5746,8 +5695,6 @@
           <w:noProof/>
           <w:color w:val="1b1f23"/>
           <w:sz w:val="20"/>
-          <w:bdr w:val="single" w:color="auto" w:sz="4" w:space="1"/>
-          <w:shd w:val="clear" w:color="auto" w:fill="auto"/>
         </w:rPr>
         <w:t xml:space="preserve">   </w:t>
       </w:r>
@@ -5757,8 +5704,6 @@
           <w:rFonts w:ascii="Consolas" w:hAnsi="Consolas"/>
           <w:noProof/>
           <w:sz w:val="20"/>
-          <w:bdr w:val="single" w:color="auto" w:sz="4" w:space="1"/>
-          <w:shd w:val="clear" w:color="auto" w:fill="auto"/>
         </w:rPr>
         <w:t xml:space="preserve">└</w:t>
       </w:r>
@@ -5768,8 +5713,6 @@
           <w:rFonts w:ascii="Consolas" w:hAnsi="Consolas"/>
           <w:noProof/>
           <w:sz w:val="20"/>
-          <w:bdr w:val="single" w:color="auto" w:sz="4" w:space="1"/>
-          <w:shd w:val="clear" w:color="auto" w:fill="auto"/>
         </w:rPr>
         <w:t xml:space="preserve">─</w:t>
       </w:r>
@@ -5779,8 +5722,6 @@
           <w:rFonts w:ascii="Consolas" w:hAnsi="Consolas"/>
           <w:noProof/>
           <w:sz w:val="20"/>
-          <w:bdr w:val="single" w:color="auto" w:sz="4" w:space="1"/>
-          <w:shd w:val="clear" w:color="auto" w:fill="auto"/>
         </w:rPr>
         <w:t xml:space="preserve">─</w:t>
       </w:r>
@@ -5790,8 +5731,6 @@
           <w:noProof/>
           <w:color w:val="1b1f23"/>
           <w:sz w:val="20"/>
-          <w:bdr w:val="single" w:color="auto" w:sz="4" w:space="1"/>
-          <w:shd w:val="clear" w:color="auto" w:fill="auto"/>
         </w:rPr>
         <w:t xml:space="preserve"> openxml-schema.md</w:t>
       </w:r>
@@ -5804,8 +5743,6 @@
           <w:rFonts w:ascii="Consolas" w:hAnsi="Consolas"/>
           <w:noProof/>
           <w:sz w:val="20"/>
-          <w:bdr w:val="single" w:color="auto" w:sz="4" w:space="1"/>
-          <w:shd w:val="clear" w:color="auto" w:fill="auto"/>
         </w:rPr>
         <w:t xml:space="preserve">├</w:t>
       </w:r>
@@ -5815,8 +5752,6 @@
           <w:rFonts w:ascii="Consolas" w:hAnsi="Consolas"/>
           <w:noProof/>
           <w:sz w:val="20"/>
-          <w:bdr w:val="single" w:color="auto" w:sz="4" w:space="1"/>
-          <w:shd w:val="clear" w:color="auto" w:fill="auto"/>
         </w:rPr>
         <w:t xml:space="preserve">─</w:t>
       </w:r>
@@ -5826,8 +5761,6 @@
           <w:rFonts w:ascii="Consolas" w:hAnsi="Consolas"/>
           <w:noProof/>
           <w:sz w:val="20"/>
-          <w:bdr w:val="single" w:color="auto" w:sz="4" w:space="1"/>
-          <w:shd w:val="clear" w:color="auto" w:fill="auto"/>
         </w:rPr>
         <w:t xml:space="preserve">─</w:t>
       </w:r>
@@ -5837,8 +5770,6 @@
           <w:noProof/>
           <w:color w:val="1b1f23"/>
           <w:sz w:val="20"/>
-          <w:bdr w:val="single" w:color="auto" w:sz="4" w:space="1"/>
-          <w:shd w:val="clear" w:color="auto" w:fill="auto"/>
         </w:rPr>
         <w:t xml:space="preserve"> src/</w:t>
       </w:r>
@@ -5851,8 +5782,6 @@
           <w:rFonts w:ascii="Consolas" w:hAnsi="Consolas"/>
           <w:noProof/>
           <w:sz w:val="20"/>
-          <w:bdr w:val="single" w:color="auto" w:sz="4" w:space="1"/>
-          <w:shd w:val="clear" w:color="auto" w:fill="auto"/>
         </w:rPr>
         <w:t xml:space="preserve">│</w:t>
       </w:r>
@@ -5862,8 +5791,6 @@
           <w:noProof/>
           <w:color w:val="1b1f23"/>
           <w:sz w:val="20"/>
-          <w:bdr w:val="single" w:color="auto" w:sz="4" w:space="1"/>
-          <w:shd w:val="clear" w:color="auto" w:fill="auto"/>
         </w:rPr>
         <w:t xml:space="preserve">   </w:t>
       </w:r>
@@ -5873,8 +5800,6 @@
           <w:rFonts w:ascii="Consolas" w:hAnsi="Consolas"/>
           <w:noProof/>
           <w:sz w:val="20"/>
-          <w:bdr w:val="single" w:color="auto" w:sz="4" w:space="1"/>
-          <w:shd w:val="clear" w:color="auto" w:fill="auto"/>
         </w:rPr>
         <w:t xml:space="preserve">├</w:t>
       </w:r>
@@ -5884,8 +5809,6 @@
           <w:rFonts w:ascii="Consolas" w:hAnsi="Consolas"/>
           <w:noProof/>
           <w:sz w:val="20"/>
-          <w:bdr w:val="single" w:color="auto" w:sz="4" w:space="1"/>
-          <w:shd w:val="clear" w:color="auto" w:fill="auto"/>
         </w:rPr>
         <w:t xml:space="preserve">─</w:t>
       </w:r>
@@ -5895,8 +5818,6 @@
           <w:rFonts w:ascii="Consolas" w:hAnsi="Consolas"/>
           <w:noProof/>
           <w:sz w:val="20"/>
-          <w:bdr w:val="single" w:color="auto" w:sz="4" w:space="1"/>
-          <w:shd w:val="clear" w:color="auto" w:fill="auto"/>
         </w:rPr>
         <w:t xml:space="preserve">─</w:t>
       </w:r>
@@ -5906,8 +5827,6 @@
           <w:noProof/>
           <w:color w:val="1b1f23"/>
           <w:sz w:val="20"/>
-          <w:bdr w:val="single" w:color="auto" w:sz="4" w:space="1"/>
-          <w:shd w:val="clear" w:color="auto" w:fill="auto"/>
         </w:rPr>
         <w:t xml:space="preserve"> MarkSmith.Core/</w:t>
       </w:r>
@@ -5920,8 +5839,6 @@
           <w:rFonts w:ascii="Consolas" w:hAnsi="Consolas"/>
           <w:noProof/>
           <w:sz w:val="20"/>
-          <w:bdr w:val="single" w:color="auto" w:sz="4" w:space="1"/>
-          <w:shd w:val="clear" w:color="auto" w:fill="auto"/>
         </w:rPr>
         <w:t xml:space="preserve">│</w:t>
       </w:r>
@@ -5931,8 +5848,6 @@
           <w:noProof/>
           <w:color w:val="1b1f23"/>
           <w:sz w:val="20"/>
-          <w:bdr w:val="single" w:color="auto" w:sz="4" w:space="1"/>
-          <w:shd w:val="clear" w:color="auto" w:fill="auto"/>
         </w:rPr>
         <w:t xml:space="preserve">   </w:t>
       </w:r>
@@ -5942,8 +5857,6 @@
           <w:rFonts w:ascii="Consolas" w:hAnsi="Consolas"/>
           <w:noProof/>
           <w:sz w:val="20"/>
-          <w:bdr w:val="single" w:color="auto" w:sz="4" w:space="1"/>
-          <w:shd w:val="clear" w:color="auto" w:fill="auto"/>
         </w:rPr>
         <w:t xml:space="preserve">├</w:t>
       </w:r>
@@ -5953,8 +5866,6 @@
           <w:rFonts w:ascii="Consolas" w:hAnsi="Consolas"/>
           <w:noProof/>
           <w:sz w:val="20"/>
-          <w:bdr w:val="single" w:color="auto" w:sz="4" w:space="1"/>
-          <w:shd w:val="clear" w:color="auto" w:fill="auto"/>
         </w:rPr>
         <w:t xml:space="preserve">─</w:t>
       </w:r>
@@ -5964,8 +5875,6 @@
           <w:rFonts w:ascii="Consolas" w:hAnsi="Consolas"/>
           <w:noProof/>
           <w:sz w:val="20"/>
-          <w:bdr w:val="single" w:color="auto" w:sz="4" w:space="1"/>
-          <w:shd w:val="clear" w:color="auto" w:fill="auto"/>
         </w:rPr>
         <w:t xml:space="preserve">─</w:t>
       </w:r>
@@ -5975,8 +5884,6 @@
           <w:noProof/>
           <w:color w:val="1b1f23"/>
           <w:sz w:val="20"/>
-          <w:bdr w:val="single" w:color="auto" w:sz="4" w:space="1"/>
-          <w:shd w:val="clear" w:color="auto" w:fill="auto"/>
         </w:rPr>
         <w:t xml:space="preserve"> MarkSmith.Desktop/</w:t>
       </w:r>
@@ -5989,8 +5896,6 @@
           <w:rFonts w:ascii="Consolas" w:hAnsi="Consolas"/>
           <w:noProof/>
           <w:sz w:val="20"/>
-          <w:bdr w:val="single" w:color="auto" w:sz="4" w:space="1"/>
-          <w:shd w:val="clear" w:color="auto" w:fill="auto"/>
         </w:rPr>
         <w:t xml:space="preserve">│</w:t>
       </w:r>
@@ -6000,8 +5905,6 @@
           <w:noProof/>
           <w:color w:val="1b1f23"/>
           <w:sz w:val="20"/>
-          <w:bdr w:val="single" w:color="auto" w:sz="4" w:space="1"/>
-          <w:shd w:val="clear" w:color="auto" w:fill="auto"/>
         </w:rPr>
         <w:t xml:space="preserve">   </w:t>
       </w:r>
@@ -6011,8 +5914,6 @@
           <w:rFonts w:ascii="Consolas" w:hAnsi="Consolas"/>
           <w:noProof/>
           <w:sz w:val="20"/>
-          <w:bdr w:val="single" w:color="auto" w:sz="4" w:space="1"/>
-          <w:shd w:val="clear" w:color="auto" w:fill="auto"/>
         </w:rPr>
         <w:t xml:space="preserve">└</w:t>
       </w:r>
@@ -6022,8 +5923,6 @@
           <w:rFonts w:ascii="Consolas" w:hAnsi="Consolas"/>
           <w:noProof/>
           <w:sz w:val="20"/>
-          <w:bdr w:val="single" w:color="auto" w:sz="4" w:space="1"/>
-          <w:shd w:val="clear" w:color="auto" w:fill="auto"/>
         </w:rPr>
         <w:t xml:space="preserve">─</w:t>
       </w:r>
@@ -6033,8 +5932,6 @@
           <w:rFonts w:ascii="Consolas" w:hAnsi="Consolas"/>
           <w:noProof/>
           <w:sz w:val="20"/>
-          <w:bdr w:val="single" w:color="auto" w:sz="4" w:space="1"/>
-          <w:shd w:val="clear" w:color="auto" w:fill="auto"/>
         </w:rPr>
         <w:t xml:space="preserve">─</w:t>
       </w:r>
@@ -6044,8 +5941,6 @@
           <w:noProof/>
           <w:color w:val="1b1f23"/>
           <w:sz w:val="20"/>
-          <w:bdr w:val="single" w:color="auto" w:sz="4" w:space="1"/>
-          <w:shd w:val="clear" w:color="auto" w:fill="auto"/>
         </w:rPr>
         <w:t xml:space="preserve"> MarkSmith.Cli/</w:t>
       </w:r>
@@ -6058,8 +5953,6 @@
           <w:rFonts w:ascii="Consolas" w:hAnsi="Consolas"/>
           <w:noProof/>
           <w:sz w:val="20"/>
-          <w:bdr w:val="single" w:color="auto" w:sz="4" w:space="1"/>
-          <w:shd w:val="clear" w:color="auto" w:fill="auto"/>
         </w:rPr>
         <w:t xml:space="preserve">└</w:t>
       </w:r>
@@ -6069,8 +5962,6 @@
           <w:rFonts w:ascii="Consolas" w:hAnsi="Consolas"/>
           <w:noProof/>
           <w:sz w:val="20"/>
-          <w:bdr w:val="single" w:color="auto" w:sz="4" w:space="1"/>
-          <w:shd w:val="clear" w:color="auto" w:fill="auto"/>
         </w:rPr>
         <w:t xml:space="preserve">─</w:t>
       </w:r>
@@ -6080,8 +5971,6 @@
           <w:rFonts w:ascii="Consolas" w:hAnsi="Consolas"/>
           <w:noProof/>
           <w:sz w:val="20"/>
-          <w:bdr w:val="single" w:color="auto" w:sz="4" w:space="1"/>
-          <w:shd w:val="clear" w:color="auto" w:fill="auto"/>
         </w:rPr>
         <w:t xml:space="preserve">─</w:t>
       </w:r>
@@ -6091,8 +5980,6 @@
           <w:noProof/>
           <w:color w:val="1b1f23"/>
           <w:sz w:val="20"/>
-          <w:bdr w:val="single" w:color="auto" w:sz="4" w:space="1"/>
-          <w:shd w:val="clear" w:color="auto" w:fill="auto"/>
         </w:rPr>
         <w:t xml:space="preserve"> tests/</w:t>
       </w:r>
@@ -6105,8 +5992,6 @@
           <w:noProof/>
           <w:color w:val="1b1f23"/>
           <w:sz w:val="20"/>
-          <w:bdr w:val="single" w:color="auto" w:sz="4" w:space="1"/>
-          <w:shd w:val="clear" w:color="auto" w:fill="auto"/>
         </w:rPr>
         <w:t xml:space="preserve">    </w:t>
       </w:r>
@@ -6116,8 +6001,6 @@
           <w:rFonts w:ascii="Consolas" w:hAnsi="Consolas"/>
           <w:noProof/>
           <w:sz w:val="20"/>
-          <w:bdr w:val="single" w:color="auto" w:sz="4" w:space="1"/>
-          <w:shd w:val="clear" w:color="auto" w:fill="auto"/>
         </w:rPr>
         <w:t xml:space="preserve">├</w:t>
       </w:r>
@@ -6127,8 +6010,6 @@
           <w:rFonts w:ascii="Consolas" w:hAnsi="Consolas"/>
           <w:noProof/>
           <w:sz w:val="20"/>
-          <w:bdr w:val="single" w:color="auto" w:sz="4" w:space="1"/>
-          <w:shd w:val="clear" w:color="auto" w:fill="auto"/>
         </w:rPr>
         <w:t xml:space="preserve">─</w:t>
       </w:r>
@@ -6138,8 +6019,6 @@
           <w:rFonts w:ascii="Consolas" w:hAnsi="Consolas"/>
           <w:noProof/>
           <w:sz w:val="20"/>
-          <w:bdr w:val="single" w:color="auto" w:sz="4" w:space="1"/>
-          <w:shd w:val="clear" w:color="auto" w:fill="auto"/>
         </w:rPr>
         <w:t xml:space="preserve">─</w:t>
       </w:r>
@@ -6149,8 +6028,6 @@
           <w:noProof/>
           <w:color w:val="1b1f23"/>
           <w:sz w:val="20"/>
-          <w:bdr w:val="single" w:color="auto" w:sz="4" w:space="1"/>
-          <w:shd w:val="clear" w:color="auto" w:fill="auto"/>
         </w:rPr>
         <w:t xml:space="preserve"> DocxExportTests.cs</w:t>
       </w:r>
@@ -6163,8 +6040,6 @@
           <w:noProof/>
           <w:color w:val="1b1f23"/>
           <w:sz w:val="20"/>
-          <w:bdr w:val="single" w:color="auto" w:sz="4" w:space="1"/>
-          <w:shd w:val="clear" w:color="auto" w:fill="auto"/>
         </w:rPr>
         <w:t xml:space="preserve">    </w:t>
       </w:r>
@@ -6174,8 +6049,6 @@
           <w:rFonts w:ascii="Consolas" w:hAnsi="Consolas"/>
           <w:noProof/>
           <w:sz w:val="20"/>
-          <w:bdr w:val="single" w:color="auto" w:sz="4" w:space="1"/>
-          <w:shd w:val="clear" w:color="auto" w:fill="auto"/>
         </w:rPr>
         <w:t xml:space="preserve">└</w:t>
       </w:r>
@@ -6185,8 +6058,6 @@
           <w:rFonts w:ascii="Consolas" w:hAnsi="Consolas"/>
           <w:noProof/>
           <w:sz w:val="20"/>
-          <w:bdr w:val="single" w:color="auto" w:sz="4" w:space="1"/>
-          <w:shd w:val="clear" w:color="auto" w:fill="auto"/>
         </w:rPr>
         <w:t xml:space="preserve">─</w:t>
       </w:r>
@@ -6196,8 +6067,6 @@
           <w:rFonts w:ascii="Consolas" w:hAnsi="Consolas"/>
           <w:noProof/>
           <w:sz w:val="20"/>
-          <w:bdr w:val="single" w:color="auto" w:sz="4" w:space="1"/>
-          <w:shd w:val="clear" w:color="auto" w:fill="auto"/>
         </w:rPr>
         <w:t xml:space="preserve">─</w:t>
       </w:r>
@@ -6207,8 +6076,6 @@
           <w:noProof/>
           <w:color w:val="1b1f23"/>
           <w:sz w:val="20"/>
-          <w:bdr w:val="single" w:color="auto" w:sz="4" w:space="1"/>
-          <w:shd w:val="clear" w:color="auto" w:fill="auto"/>
         </w:rPr>
         <w:t xml:space="preserve"> ReverseImportTests.cs</w:t>
       </w:r>
@@ -6224,7 +6091,7 @@
       <w:pPr>
         <w:pStyle w:val="Heading1"/>
       </w:pPr>
-      <w:bookmarkStart w:name="H_callout_blocks" w:id="27"/>
+      <w:bookmarkStart w:name="H_callout_blocks" w:id="28"/>
       <w:r>
         <w:rPr>
           <mc:AlternateContent>
@@ -6238,7 +6105,7 @@
         </w:rPr>
         <w:t xml:space="preserve">Callout Blocks</w:t>
       </w:r>
-      <w:bookmarkEnd w:id="27"/>
+      <w:bookmarkEnd w:id="28"/>
     </w:p>
     <w:tbl>
       <w:tblPr>
@@ -6522,7 +6389,7 @@
       <w:pPr>
         <w:pStyle w:val="Heading1"/>
       </w:pPr>
-      <w:bookmarkStart w:name="H_nested_example" w:id="28"/>
+      <w:bookmarkStart w:name="H_nested_example" w:id="29"/>
       <w:r>
         <w:rPr>
           <mc:AlternateContent>
@@ -6536,7 +6403,7 @@
         </w:rPr>
         <w:t xml:space="preserve">Nested Example</w:t>
       </w:r>
-      <w:bookmarkEnd w:id="28"/>
+      <w:bookmarkEnd w:id="29"/>
     </w:p>
     <w:p>
       <w:pPr>
@@ -6547,7 +6414,7 @@
         <w:shd w:val="clear" w:color="auto" w:fill="F6F8FA"/>
         <w:ind w:left="360"/>
       </w:pPr>
-      <w:bookmarkStart w:name="H_quarterly_milestone_summary" w:id="29"/>
+      <w:bookmarkStart w:name="H_quarterly_milestone_summary" w:id="30"/>
       <w:r>
         <w:rPr>
           <mc:AlternateContent>
@@ -6561,7 +6428,7 @@
         </w:rPr>
         <w:t xml:space="preserve">Quarterly Milestone Summary</w:t>
       </w:r>
-      <w:bookmarkEnd w:id="29"/>
+      <w:bookmarkEnd w:id="30"/>
     </w:p>
     <w:p>
       <w:pPr>
@@ -6961,9 +6828,25 @@
       </w:pPr>
     </w:p>
     <w:p>
-      <w:r>
-        <w:t xml:space="preserve">[1] </w:t>
-      </w:r>
+      <w:bookmarkStart w:name="_fn_1" w:id="32"/>
+      <w:hyperlink w:history="true" w:anchor="_fnref_1">
+        <w:r>
+          <w:rPr>
+            <w:b/>
+            <w:color w:val="0563C1"/>
+            <mc:AlternateContent>
+              <mc:Choice Requires="w14">
+                <w14:ligatures w14:val="standardContextual"/>
+                <w14:numForm w14:val="oldStyle"/>
+                <w14:numSpacing w14:val="proportional"/>
+                <w14:cntxtAlts/>
+              </mc:Choice>
+            </mc:AlternateContent>
+          </w:rPr>
+          <w:t xml:space="preserve">[1] </w:t>
+        </w:r>
+      </w:hyperlink>
+      <w:bookmarkEnd w:id="32"/>
       <w:r>
         <w:rPr>
           <mc:AlternateContent>
@@ -6977,24 +6860,59 @@
         </w:rPr>
         <w:t xml:space="preserve">This is the footnote text compiled into Word's native footnote collection.</w:t>
       </w:r>
-      <w:r>
-        <w:rPr>
-          <w:vertAlign w:val="superscript"/>
-          <mc:AlternateContent>
-            <mc:Choice Requires="w14">
-              <w14:ligatures w14:val="standardContextual"/>
-              <w14:numForm w14:val="oldStyle"/>
-              <w14:numSpacing w14:val="proportional"/>
-              <w14:cntxtAlts/>
-            </mc:Choice>
-          </mc:AlternateContent>
-        </w:rPr>
-        <w:t xml:space="preserve">[1]</w:t>
-      </w:r>
+      <w:bookmarkStart w:name="_fnref_1" w:id="31"/>
+      <w:bookmarkEnd w:id="31"/>
+      <w:hyperlink w:history="true" w:anchor="_fn_1">
+        <w:r>
+          <w:rPr>
+            <w:color w:val="0563C1"/>
+            <w:vertAlign w:val="superscript"/>
+            <mc:AlternateContent>
+              <mc:Choice Requires="w14">
+                <w14:ligatures w14:val="standardContextual"/>
+                <w14:numForm w14:val="oldStyle"/>
+                <w14:numSpacing w14:val="proportional"/>
+                <w14:cntxtAlts/>
+              </mc:Choice>
+            </mc:AlternateContent>
+          </w:rPr>
+          <w:t xml:space="preserve">[1]</w:t>
+        </w:r>
+      </w:hyperlink>
+      <w:hyperlink w:history="true" w:anchor="_fnref_1">
+        <w:r>
+          <w:rPr>
+            <w:color w:val="0563C1"/>
+            <mc:AlternateContent>
+              <mc:Choice Requires="w14">
+                <w14:ligatures w14:val="standardContextual"/>
+                <w14:numForm w14:val="oldStyle"/>
+                <w14:numSpacing w14:val="proportional"/>
+                <w14:cntxtAlts/>
+              </mc:Choice>
+            </mc:AlternateContent>
+          </w:rPr>
+          <w:t xml:space="preserve"> </w:t>
+        </w:r>
+        <w:r>
+          <w:rPr>
+            <w:rFonts w:ascii="Segoe UI Emoji" w:hAnsi="Segoe UI Emoji" w:eastAsia="Segoe UI Emoji" w:cs="Segoe UI Emoji"/>
+            <mc:AlternateContent>
+              <mc:Choice Requires="w14">
+                <w14:ligatures w14:val="standardContextual"/>
+                <w14:numForm w14:val="oldStyle"/>
+                <w14:numSpacing w14:val="proportional"/>
+                <w14:cntxtAlts/>
+              </mc:Choice>
+            </mc:AlternateContent>
+          </w:rPr>
+          <w:t xml:space="preserve">↩</w:t>
+        </w:r>
+      </w:hyperlink>
     </w:p>
     <w:sectPr>
-      <w:headerReference xmlns:r="http://schemas.openxmlformats.org/officeDocument/2006/relationships" w:type="default" r:id="Rb5ea9836f0304bce"/>
-      <w:footerReference xmlns:r="http://schemas.openxmlformats.org/officeDocument/2006/relationships" w:type="default" r:id="R8e60fa98c8974087"/>
+      <w:headerReference xmlns:r="http://schemas.openxmlformats.org/officeDocument/2006/relationships" w:type="default" r:id="Ra04d5bd6fc404376"/>
+      <w:footerReference xmlns:r="http://schemas.openxmlformats.org/officeDocument/2006/relationships" w:type="default" r:id="Rbc5b2af185e2456b"/>
       <w:pgSz w:w="11906" w:h="16838"/>
       <w:pgMar w:top="1440" w:right="1440" w:bottom="1440" w:left="1440" w:header="576" w:footer="576" w:gutter="0"/>
     </w:sectPr>
@@ -7426,7 +7344,7 @@
 </file>
 
 <file path=customXml/item.xml><?xml version="1.0" encoding="utf-8"?>
-<marksmithSource schema="marksmith-source-v1" version="2.0.0.0" exportedUtc="2026-09-02T07:24:20.6025517Z" theme="GitHub Light" mermaidMode="1">
+<marksmithSource schema="marksmith-source-v1" version="2.0.0.0" exportedUtc="2026-09-02T07:59:34.6886298Z" theme="GitHub Light" mermaidMode="1">
   <markdown><![CDATA[# Massive Markdown Showcase
 A comprehensive demonstration of Markdown syntax and extensions compiled to native ECMA-376 Microsoft Word OpenXML by **MarkSmith**.
 ---

</xml_diff>

<commit_message>
feat: Add Gemini 3.8 & Frontier Reasoning Dialect card and update showcase docx
</commit_message>
<xml_diff>
--- a/media/massive-markdown-showcase.docx
+++ b/media/massive-markdown-showcase.docx
@@ -358,7 +358,7 @@
         </w:rPr>
         <w:t xml:space="preserve">, and a </w:t>
       </w:r>
-      <w:hyperlink xmlns:r="http://schemas.openxmlformats.org/officeDocument/2006/relationships" r:id="R03477b80b6844ce5">
+      <w:hyperlink xmlns:r="http://schemas.openxmlformats.org/officeDocument/2006/relationships" r:id="Rbde5cf39ba474b1b">
         <w:r>
           <w:rPr>
             <w:color w:val="0563C1"/>
@@ -741,13 +741,6 @@
       <w:bookmarkEnd w:id="12"/>
     </w:p>
     <w:p>
-      <w:pPr>
-        <w:numPr>
-          <w:ilvl w:val="0"/>
-          <w:numId w:val="1"/>
-        </w:numPr>
-        <w:contextualSpacing/>
-      </w:pPr>
       <w:sdt>
         <w:sdtPr>
           <w14:checkbox>
@@ -778,15 +771,19 @@
         </w:rPr>
         <w:t xml:space="preserve"> Write Markdown</w:t>
       </w:r>
-    </w:p>
-    <w:p>
-      <w:pPr>
-        <w:numPr>
-          <w:ilvl w:val="0"/>
-          <w:numId w:val="1"/>
-        </w:numPr>
-        <w:contextualSpacing/>
-      </w:pPr>
+      <w:r>
+        <w:rPr>
+          <mc:AlternateContent>
+            <mc:Choice Requires="w14">
+              <w14:ligatures w14:val="standardContextual"/>
+              <w14:numForm w14:val="oldStyle"/>
+              <w14:numSpacing w14:val="proportional"/>
+              <w14:cntxtAlts/>
+            </mc:Choice>
+          </mc:AlternateContent>
+        </w:rPr>
+        <w:t xml:space="preserve"> </w:t>
+      </w:r>
       <w:sdt>
         <w:sdtPr>
           <w14:checkbox>
@@ -817,15 +814,19 @@
         </w:rPr>
         <w:t xml:space="preserve"> Learn tables</w:t>
       </w:r>
-    </w:p>
-    <w:p>
-      <w:pPr>
-        <w:numPr>
-          <w:ilvl w:val="0"/>
-          <w:numId w:val="1"/>
-        </w:numPr>
-        <w:contextualSpacing/>
-      </w:pPr>
+      <w:r>
+        <w:rPr>
+          <mc:AlternateContent>
+            <mc:Choice Requires="w14">
+              <w14:ligatures w14:val="standardContextual"/>
+              <w14:numForm w14:val="oldStyle"/>
+              <w14:numSpacing w14:val="proportional"/>
+              <w14:cntxtAlts/>
+            </mc:Choice>
+          </mc:AlternateContent>
+        </w:rPr>
+        <w:t xml:space="preserve"> </w:t>
+      </w:r>
       <w:sdt>
         <w:sdtPr>
           <w14:checkbox>
@@ -856,15 +857,19 @@
         </w:rPr>
         <w:t xml:space="preserve"> Master diagrams</w:t>
       </w:r>
-    </w:p>
-    <w:p>
-      <w:pPr>
-        <w:numPr>
-          <w:ilvl w:val="0"/>
-          <w:numId w:val="1"/>
-        </w:numPr>
-        <w:contextualSpacing/>
-      </w:pPr>
+      <w:r>
+        <w:rPr>
+          <mc:AlternateContent>
+            <mc:Choice Requires="w14">
+              <w14:ligatures w14:val="standardContextual"/>
+              <w14:numForm w14:val="oldStyle"/>
+              <w14:numSpacing w14:val="proportional"/>
+              <w14:cntxtAlts/>
+            </mc:Choice>
+          </mc:AlternateContent>
+        </w:rPr>
+        <w:t xml:space="preserve"> </w:t>
+      </w:r>
       <w:sdt>
         <w:sdtPr>
           <w14:checkbox>
@@ -1686,8 +1691,6 @@
           <w:insideH w:val="single" w:color="D1D5DA" w:sz="6"/>
           <w:insideV w:val="single" w:color="D1D5DA" w:sz="6"/>
         </w:tblBorders>
-        <w:tblCaption w:val="Table exported from Markdown"/>
-        <w:tblDescription w:val="Table exported from Markdown by MarkSmith"/>
       </w:tblPr>
       <w:tblGrid>
         <w:gridCol/>
@@ -1708,6 +1711,8 @@
           <w:p>
             <w:r>
               <w:rPr>
+                <w:b/>
+                <w:color w:val="1b1f23"/>
                 <mc:AlternateContent>
                   <mc:Choice Requires="w14">
                     <w14:ligatures w14:val="standardContextual"/>
@@ -1716,8 +1721,6 @@
                     <w14:cntxtAlts/>
                   </mc:Choice>
                 </mc:AlternateContent>
-                <w:b/>
-                <w:color w:val="1b1f23"/>
               </w:rPr>
               <w:t xml:space="preserve">Name</w:t>
             </w:r>
@@ -1733,6 +1736,8 @@
             </w:pPr>
             <w:r>
               <w:rPr>
+                <w:b/>
+                <w:color w:val="1b1f23"/>
                 <mc:AlternateContent>
                   <mc:Choice Requires="w14">
                     <w14:ligatures w14:val="standardContextual"/>
@@ -1741,8 +1746,6 @@
                     <w14:cntxtAlts/>
                   </mc:Choice>
                 </mc:AlternateContent>
-                <w:b/>
-                <w:color w:val="1b1f23"/>
               </w:rPr>
               <w:t xml:space="preserve">Age</w:t>
             </w:r>
@@ -1755,6 +1758,8 @@
           <w:p>
             <w:r>
               <w:rPr>
+                <w:b/>
+                <w:color w:val="1b1f23"/>
                 <mc:AlternateContent>
                   <mc:Choice Requires="w14">
                     <w14:ligatures w14:val="standardContextual"/>
@@ -1763,8 +1768,6 @@
                     <w14:cntxtAlts/>
                   </mc:Choice>
                 </mc:AlternateContent>
-                <w:b/>
-                <w:color w:val="1b1f23"/>
               </w:rPr>
               <w:t xml:space="preserve">Country</w:t>
             </w:r>
@@ -1780,6 +1783,8 @@
             </w:pPr>
             <w:r>
               <w:rPr>
+                <w:b/>
+                <w:color w:val="1b1f23"/>
                 <mc:AlternateContent>
                   <mc:Choice Requires="w14">
                     <w14:ligatures w14:val="standardContextual"/>
@@ -1788,8 +1793,6 @@
                     <w14:cntxtAlts/>
                   </mc:Choice>
                 </mc:AlternateContent>
-                <w:b/>
-                <w:color w:val="1b1f23"/>
               </w:rPr>
               <w:t xml:space="preserve">Status</w:t>
             </w:r>
@@ -1804,6 +1807,7 @@
           <w:p>
             <w:r>
               <w:rPr>
+                <w:color w:val="1b1f23"/>
                 <mc:AlternateContent>
                   <mc:Choice Requires="w14">
                     <w14:ligatures w14:val="standardContextual"/>
@@ -1812,7 +1816,6 @@
                     <w14:cntxtAlts/>
                   </mc:Choice>
                 </mc:AlternateContent>
-                <w:color w:val="1b1f23"/>
               </w:rPr>
               <w:t xml:space="preserve">Alice</w:t>
             </w:r>
@@ -1825,6 +1828,7 @@
             </w:pPr>
             <w:r>
               <w:rPr>
+                <w:color w:val="1b1f23"/>
                 <mc:AlternateContent>
                   <mc:Choice Requires="w14">
                     <w14:ligatures w14:val="standardContextual"/>
@@ -1833,7 +1837,6 @@
                     <w14:cntxtAlts/>
                   </mc:Choice>
                 </mc:AlternateContent>
-                <w:color w:val="1b1f23"/>
               </w:rPr>
               <w:t xml:space="preserve">25</w:t>
             </w:r>
@@ -1843,6 +1846,7 @@
           <w:p>
             <w:r>
               <w:rPr>
+                <w:color w:val="1b1f23"/>
                 <mc:AlternateContent>
                   <mc:Choice Requires="w14">
                     <w14:ligatures w14:val="standardContextual"/>
@@ -1851,7 +1855,6 @@
                     <w14:cntxtAlts/>
                   </mc:Choice>
                 </mc:AlternateContent>
-                <w:color w:val="1b1f23"/>
               </w:rPr>
               <w:t xml:space="preserve">Canada</w:t>
             </w:r>
@@ -1864,6 +1867,7 @@
             </w:pPr>
             <w:r>
               <w:rPr>
+                <w:color w:val="1b1f23"/>
                 <mc:AlternateContent>
                   <mc:Choice Requires="w14">
                     <w14:ligatures w14:val="standardContextual"/>
@@ -1872,7 +1876,6 @@
                     <w14:cntxtAlts/>
                   </mc:Choice>
                 </mc:AlternateContent>
-                <w:color w:val="1b1f23"/>
               </w:rPr>
               <w:t xml:space="preserve">Active</w:t>
             </w:r>
@@ -1890,6 +1893,7 @@
           <w:p>
             <w:r>
               <w:rPr>
+                <w:color w:val="1b1f23"/>
                 <mc:AlternateContent>
                   <mc:Choice Requires="w14">
                     <w14:ligatures w14:val="standardContextual"/>
@@ -1898,7 +1902,6 @@
                     <w14:cntxtAlts/>
                   </mc:Choice>
                 </mc:AlternateContent>
-                <w:color w:val="1b1f23"/>
               </w:rPr>
               <w:t xml:space="preserve">Bob</w:t>
             </w:r>
@@ -1914,6 +1917,7 @@
             </w:pPr>
             <w:r>
               <w:rPr>
+                <w:color w:val="1b1f23"/>
                 <mc:AlternateContent>
                   <mc:Choice Requires="w14">
                     <w14:ligatures w14:val="standardContextual"/>
@@ -1922,7 +1926,6 @@
                     <w14:cntxtAlts/>
                   </mc:Choice>
                 </mc:AlternateContent>
-                <w:color w:val="1b1f23"/>
               </w:rPr>
               <w:t xml:space="preserve">31</w:t>
             </w:r>
@@ -1935,6 +1938,7 @@
           <w:p>
             <w:r>
               <w:rPr>
+                <w:color w:val="1b1f23"/>
                 <mc:AlternateContent>
                   <mc:Choice Requires="w14">
                     <w14:ligatures w14:val="standardContextual"/>
@@ -1943,7 +1947,6 @@
                     <w14:cntxtAlts/>
                   </mc:Choice>
                 </mc:AlternateContent>
-                <w:color w:val="1b1f23"/>
               </w:rPr>
               <w:t xml:space="preserve">USA</w:t>
             </w:r>
@@ -1959,6 +1962,7 @@
             </w:pPr>
             <w:r>
               <w:rPr>
+                <w:color w:val="1b1f23"/>
                 <mc:AlternateContent>
                   <mc:Choice Requires="w14">
                     <w14:ligatures w14:val="standardContextual"/>
@@ -1967,7 +1971,6 @@
                     <w14:cntxtAlts/>
                   </mc:Choice>
                 </mc:AlternateContent>
-                <w:color w:val="1b1f23"/>
               </w:rPr>
               <w:t xml:space="preserve">Verified</w:t>
             </w:r>
@@ -1982,6 +1985,7 @@
           <w:p>
             <w:r>
               <w:rPr>
+                <w:color w:val="1b1f23"/>
                 <mc:AlternateContent>
                   <mc:Choice Requires="w14">
                     <w14:ligatures w14:val="standardContextual"/>
@@ -1990,7 +1994,6 @@
                     <w14:cntxtAlts/>
                   </mc:Choice>
                 </mc:AlternateContent>
-                <w:color w:val="1b1f23"/>
               </w:rPr>
               <w:t xml:space="preserve">Charlie</w:t>
             </w:r>
@@ -2003,6 +2006,7 @@
             </w:pPr>
             <w:r>
               <w:rPr>
+                <w:color w:val="1b1f23"/>
                 <mc:AlternateContent>
                   <mc:Choice Requires="w14">
                     <w14:ligatures w14:val="standardContextual"/>
@@ -2011,7 +2015,6 @@
                     <w14:cntxtAlts/>
                   </mc:Choice>
                 </mc:AlternateContent>
-                <w:color w:val="1b1f23"/>
               </w:rPr>
               <w:t xml:space="preserve">42</w:t>
             </w:r>
@@ -2021,6 +2024,7 @@
           <w:p>
             <w:r>
               <w:rPr>
+                <w:color w:val="1b1f23"/>
                 <mc:AlternateContent>
                   <mc:Choice Requires="w14">
                     <w14:ligatures w14:val="standardContextual"/>
@@ -2029,7 +2033,6 @@
                     <w14:cntxtAlts/>
                   </mc:Choice>
                 </mc:AlternateContent>
-                <w:color w:val="1b1f23"/>
               </w:rPr>
               <w:t xml:space="preserve">UK</w:t>
             </w:r>
@@ -2042,6 +2045,7 @@
             </w:pPr>
             <w:r>
               <w:rPr>
+                <w:color w:val="1b1f23"/>
                 <mc:AlternateContent>
                   <mc:Choice Requires="w14">
                     <w14:ligatures w14:val="standardContextual"/>
@@ -2050,7 +2054,6 @@
                     <w14:cntxtAlts/>
                   </mc:Choice>
                 </mc:AlternateContent>
-                <w:color w:val="1b1f23"/>
               </w:rPr>
               <w:t xml:space="preserve">Enterprise</w:t>
             </w:r>
@@ -2068,6 +2071,7 @@
           <w:p>
             <w:r>
               <w:rPr>
+                <w:color w:val="1b1f23"/>
                 <mc:AlternateContent>
                   <mc:Choice Requires="w14">
                     <w14:ligatures w14:val="standardContextual"/>
@@ -2076,7 +2080,6 @@
                     <w14:cntxtAlts/>
                   </mc:Choice>
                 </mc:AlternateContent>
-                <w:color w:val="1b1f23"/>
               </w:rPr>
               <w:t xml:space="preserve">Diana</w:t>
             </w:r>
@@ -2092,6 +2095,7 @@
             </w:pPr>
             <w:r>
               <w:rPr>
+                <w:color w:val="1b1f23"/>
                 <mc:AlternateContent>
                   <mc:Choice Requires="w14">
                     <w14:ligatures w14:val="standardContextual"/>
@@ -2100,7 +2104,6 @@
                     <w14:cntxtAlts/>
                   </mc:Choice>
                 </mc:AlternateContent>
-                <w:color w:val="1b1f23"/>
               </w:rPr>
               <w:t xml:space="preserve">28</w:t>
             </w:r>
@@ -2113,6 +2116,7 @@
           <w:p>
             <w:r>
               <w:rPr>
+                <w:color w:val="1b1f23"/>
                 <mc:AlternateContent>
                   <mc:Choice Requires="w14">
                     <w14:ligatures w14:val="standardContextual"/>
@@ -2121,7 +2125,6 @@
                     <w14:cntxtAlts/>
                   </mc:Choice>
                 </mc:AlternateContent>
-                <w:color w:val="1b1f23"/>
               </w:rPr>
               <w:t xml:space="preserve">Australia</w:t>
             </w:r>
@@ -2137,6 +2140,7 @@
             </w:pPr>
             <w:r>
               <w:rPr>
+                <w:color w:val="1b1f23"/>
                 <mc:AlternateContent>
                   <mc:Choice Requires="w14">
                     <w14:ligatures w14:val="standardContextual"/>
@@ -2145,7 +2149,6 @@
                     <w14:cntxtAlts/>
                   </mc:Choice>
                 </mc:AlternateContent>
-                <w:color w:val="1b1f23"/>
               </w:rPr>
               <w:t xml:space="preserve">Champion</w:t>
             </w:r>
@@ -2156,9 +2159,6 @@
     <w:p>
       <w:pPr>
         <w:spacing w:before="0" w:after="0"/>
-        <w:rPr>
-          <w:sz w:val="8"/>
-        </w:rPr>
       </w:pPr>
     </w:p>
     <w:p>
@@ -2199,8 +2199,6 @@
           <w:insideH w:val="single" w:color="D1D5DA" w:sz="6"/>
           <w:insideV w:val="single" w:color="D1D5DA" w:sz="6"/>
         </w:tblBorders>
-        <w:tblCaption w:val="Table exported from Markdown"/>
-        <w:tblDescription w:val="Table exported from Markdown by MarkSmith"/>
       </w:tblPr>
       <w:tblGrid>
         <w:gridCol/>
@@ -2220,6 +2218,8 @@
           <w:p>
             <w:r>
               <w:rPr>
+                <w:b/>
+                <w:color w:val="1b1f23"/>
                 <mc:AlternateContent>
                   <mc:Choice Requires="w14">
                     <w14:ligatures w14:val="standardContextual"/>
@@ -2228,8 +2228,6 @@
                     <w14:cntxtAlts/>
                   </mc:Choice>
                 </mc:AlternateContent>
-                <w:b/>
-                <w:color w:val="1b1f23"/>
               </w:rPr>
               <w:t xml:space="preserve">Left Aligned</w:t>
             </w:r>
@@ -2245,6 +2243,8 @@
             </w:pPr>
             <w:r>
               <w:rPr>
+                <w:b/>
+                <w:color w:val="1b1f23"/>
                 <mc:AlternateContent>
                   <mc:Choice Requires="w14">
                     <w14:ligatures w14:val="standardContextual"/>
@@ -2253,8 +2253,6 @@
                     <w14:cntxtAlts/>
                   </mc:Choice>
                 </mc:AlternateContent>
-                <w:b/>
-                <w:color w:val="1b1f23"/>
               </w:rPr>
               <w:t xml:space="preserve">Center Aligned</w:t>
             </w:r>
@@ -2270,6 +2268,8 @@
             </w:pPr>
             <w:r>
               <w:rPr>
+                <w:b/>
+                <w:color w:val="1b1f23"/>
                 <mc:AlternateContent>
                   <mc:Choice Requires="w14">
                     <w14:ligatures w14:val="standardContextual"/>
@@ -2278,8 +2278,6 @@
                     <w14:cntxtAlts/>
                   </mc:Choice>
                 </mc:AlternateContent>
-                <w:b/>
-                <w:color w:val="1b1f23"/>
               </w:rPr>
               <w:t xml:space="preserve">Right Aligned</w:t>
             </w:r>
@@ -2294,6 +2292,7 @@
           <w:p>
             <w:r>
               <w:rPr>
+                <w:color w:val="1b1f23"/>
                 <mc:AlternateContent>
                   <mc:Choice Requires="w14">
                     <w14:ligatures w14:val="standardContextual"/>
@@ -2302,7 +2301,6 @@
                     <w14:cntxtAlts/>
                   </mc:Choice>
                 </mc:AlternateContent>
-                <w:color w:val="1b1f23"/>
               </w:rPr>
               <w:t xml:space="preserve">Apple</w:t>
             </w:r>
@@ -2315,6 +2313,7 @@
             </w:pPr>
             <w:r>
               <w:rPr>
+                <w:color w:val="1b1f23"/>
                 <mc:AlternateContent>
                   <mc:Choice Requires="w14">
                     <w14:ligatures w14:val="standardContextual"/>
@@ -2323,7 +2322,6 @@
                     <w14:cntxtAlts/>
                   </mc:Choice>
                 </mc:AlternateContent>
-                <w:color w:val="1b1f23"/>
               </w:rPr>
               <w:t xml:space="preserve">Orange</w:t>
             </w:r>
@@ -2336,6 +2334,7 @@
             </w:pPr>
             <w:r>
               <w:rPr>
+                <w:color w:val="1b1f23"/>
                 <mc:AlternateContent>
                   <mc:Choice Requires="w14">
                     <w14:ligatures w14:val="standardContextual"/>
@@ -2344,7 +2343,6 @@
                     <w14:cntxtAlts/>
                   </mc:Choice>
                 </mc:AlternateContent>
-                <w:color w:val="1b1f23"/>
               </w:rPr>
               <w:t xml:space="preserve">Banana</w:t>
             </w:r>
@@ -2362,6 +2360,7 @@
           <w:p>
             <w:r>
               <w:rPr>
+                <w:color w:val="1b1f23"/>
                 <mc:AlternateContent>
                   <mc:Choice Requires="w14">
                     <w14:ligatures w14:val="standardContextual"/>
@@ -2370,7 +2369,6 @@
                     <w14:cntxtAlts/>
                   </mc:Choice>
                 </mc:AlternateContent>
-                <w:color w:val="1b1f23"/>
               </w:rPr>
               <w:t xml:space="preserve">Cat</w:t>
             </w:r>
@@ -2386,6 +2384,7 @@
             </w:pPr>
             <w:r>
               <w:rPr>
+                <w:color w:val="1b1f23"/>
                 <mc:AlternateContent>
                   <mc:Choice Requires="w14">
                     <w14:ligatures w14:val="standardContextual"/>
@@ -2394,7 +2393,6 @@
                     <w14:cntxtAlts/>
                   </mc:Choice>
                 </mc:AlternateContent>
-                <w:color w:val="1b1f23"/>
               </w:rPr>
               <w:t xml:space="preserve">Dog</w:t>
             </w:r>
@@ -2410,6 +2408,7 @@
             </w:pPr>
             <w:r>
               <w:rPr>
+                <w:color w:val="1b1f23"/>
                 <mc:AlternateContent>
                   <mc:Choice Requires="w14">
                     <w14:ligatures w14:val="standardContextual"/>
@@ -2418,7 +2417,6 @@
                     <w14:cntxtAlts/>
                   </mc:Choice>
                 </mc:AlternateContent>
-                <w:color w:val="1b1f23"/>
               </w:rPr>
               <w:t xml:space="preserve">Mouse</w:t>
             </w:r>
@@ -2433,6 +2431,7 @@
           <w:p>
             <w:r>
               <w:rPr>
+                <w:color w:val="1b1f23"/>
                 <mc:AlternateContent>
                   <mc:Choice Requires="w14">
                     <w14:ligatures w14:val="standardContextual"/>
@@ -2441,7 +2440,6 @@
                     <w14:cntxtAlts/>
                   </mc:Choice>
                 </mc:AlternateContent>
-                <w:color w:val="1b1f23"/>
               </w:rPr>
               <w:t xml:space="preserve">One</w:t>
             </w:r>
@@ -2454,6 +2452,7 @@
             </w:pPr>
             <w:r>
               <w:rPr>
+                <w:color w:val="1b1f23"/>
                 <mc:AlternateContent>
                   <mc:Choice Requires="w14">
                     <w14:ligatures w14:val="standardContextual"/>
@@ -2462,7 +2461,6 @@
                     <w14:cntxtAlts/>
                   </mc:Choice>
                 </mc:AlternateContent>
-                <w:color w:val="1b1f23"/>
               </w:rPr>
               <w:t xml:space="preserve">Two</w:t>
             </w:r>
@@ -2475,6 +2473,7 @@
             </w:pPr>
             <w:r>
               <w:rPr>
+                <w:color w:val="1b1f23"/>
                 <mc:AlternateContent>
                   <mc:Choice Requires="w14">
                     <w14:ligatures w14:val="standardContextual"/>
@@ -2483,7 +2482,6 @@
                     <w14:cntxtAlts/>
                   </mc:Choice>
                 </mc:AlternateContent>
-                <w:color w:val="1b1f23"/>
               </w:rPr>
               <w:t xml:space="preserve">Three</w:t>
             </w:r>
@@ -2494,9 +2492,6 @@
     <w:p>
       <w:pPr>
         <w:spacing w:before="0" w:after="0"/>
-        <w:rPr>
-          <w:sz w:val="8"/>
-        </w:rPr>
       </w:pPr>
     </w:p>
     <w:p>
@@ -5117,8 +5112,8 @@
     </w:p>
     <w:p>
       <w:pPr>
+        <w:spacing w:before="120" w:after="120"/>
         <w:jc w:val="center"/>
-        <w:spacing w:before="120" w:after="120"/>
       </w:pPr>
       <m:oMath xmlns:m="http://schemas.openxmlformats.org/officeDocument/2006/math">
         <m:nary>
@@ -5187,8 +5182,8 @@
     </w:p>
     <w:p>
       <w:pPr>
+        <w:spacing w:before="120" w:after="120"/>
         <w:jc w:val="center"/>
-        <w:spacing w:before="120" w:after="120"/>
       </w:pPr>
       <m:oMath xmlns:m="http://schemas.openxmlformats.org/officeDocument/2006/math">
         <m:d>
@@ -6522,8 +6517,6 @@
           <w:insideH w:val="single" w:color="D1D5DA" w:sz="6"/>
           <w:insideV w:val="single" w:color="D1D5DA" w:sz="6"/>
         </w:tblBorders>
-        <w:tblCaption w:val="Table exported from Markdown"/>
-        <w:tblDescription w:val="Table exported from Markdown by MarkSmith"/>
       </w:tblPr>
       <w:tblGrid>
         <w:gridCol/>
@@ -6543,6 +6536,8 @@
           <w:p>
             <w:r>
               <w:rPr>
+                <w:b/>
+                <w:color w:val="1b1f23"/>
                 <mc:AlternateContent>
                   <mc:Choice Requires="w14">
                     <w14:ligatures w14:val="standardContextual"/>
@@ -6551,8 +6546,6 @@
                     <w14:cntxtAlts/>
                   </mc:Choice>
                 </mc:AlternateContent>
-                <w:b/>
-                <w:color w:val="1b1f23"/>
               </w:rPr>
               <w:t xml:space="preserve">Phase</w:t>
             </w:r>
@@ -6568,6 +6561,8 @@
             </w:pPr>
             <w:r>
               <w:rPr>
+                <w:b/>
+                <w:color w:val="1b1f23"/>
                 <mc:AlternateContent>
                   <mc:Choice Requires="w14">
                     <w14:ligatures w14:val="standardContextual"/>
@@ -6576,8 +6571,6 @@
                     <w14:cntxtAlts/>
                   </mc:Choice>
                 </mc:AlternateContent>
-                <w:b/>
-                <w:color w:val="1b1f23"/>
               </w:rPr>
               <w:t xml:space="preserve">Completion</w:t>
             </w:r>
@@ -6593,6 +6586,8 @@
             </w:pPr>
             <w:r>
               <w:rPr>
+                <w:b/>
+                <w:color w:val="1b1f23"/>
                 <mc:AlternateContent>
                   <mc:Choice Requires="w14">
                     <w14:ligatures w14:val="standardContextual"/>
@@ -6601,8 +6596,6 @@
                     <w14:cntxtAlts/>
                   </mc:Choice>
                 </mc:AlternateContent>
-                <w:b/>
-                <w:color w:val="1b1f23"/>
               </w:rPr>
               <w:t xml:space="preserve">Status</w:t>
             </w:r>
@@ -6617,6 +6610,7 @@
           <w:p>
             <w:r>
               <w:rPr>
+                <w:color w:val="1b1f23"/>
                 <mc:AlternateContent>
                   <mc:Choice Requires="w14">
                     <w14:ligatures w14:val="standardContextual"/>
@@ -6625,7 +6619,6 @@
                     <w14:cntxtAlts/>
                   </mc:Choice>
                 </mc:AlternateContent>
-                <w:color w:val="1b1f23"/>
               </w:rPr>
               <w:t xml:space="preserve">Core Engine</w:t>
             </w:r>
@@ -6638,6 +6631,7 @@
             </w:pPr>
             <w:r>
               <w:rPr>
+                <w:color w:val="1b1f23"/>
                 <mc:AlternateContent>
                   <mc:Choice Requires="w14">
                     <w14:ligatures w14:val="standardContextual"/>
@@ -6646,7 +6640,6 @@
                     <w14:cntxtAlts/>
                   </mc:Choice>
                 </mc:AlternateContent>
-                <w:color w:val="1b1f23"/>
               </w:rPr>
               <w:t xml:space="preserve">100%</w:t>
             </w:r>
@@ -6659,6 +6652,7 @@
             </w:pPr>
             <w:r>
               <w:rPr>
+                <w:color w:val="1b1f23"/>
                 <mc:AlternateContent>
                   <mc:Choice Requires="w14">
                     <w14:ligatures w14:val="standardContextual"/>
@@ -6667,7 +6661,6 @@
                     <w14:cntxtAlts/>
                   </mc:Choice>
                 </mc:AlternateContent>
-                <w:color w:val="1b1f23"/>
               </w:rPr>
               <w:t xml:space="preserve">Verified</w:t>
             </w:r>
@@ -6685,6 +6678,7 @@
           <w:p>
             <w:r>
               <w:rPr>
+                <w:color w:val="1b1f23"/>
                 <mc:AlternateContent>
                   <mc:Choice Requires="w14">
                     <w14:ligatures w14:val="standardContextual"/>
@@ -6693,7 +6687,6 @@
                     <w14:cntxtAlts/>
                   </mc:Choice>
                 </mc:AlternateContent>
-                <w:color w:val="1b1f23"/>
               </w:rPr>
               <w:t xml:space="preserve">ShapeForge</w:t>
             </w:r>
@@ -6709,6 +6702,7 @@
             </w:pPr>
             <w:r>
               <w:rPr>
+                <w:color w:val="1b1f23"/>
                 <mc:AlternateContent>
                   <mc:Choice Requires="w14">
                     <w14:ligatures w14:val="standardContextual"/>
@@ -6717,7 +6711,6 @@
                     <w14:cntxtAlts/>
                   </mc:Choice>
                 </mc:AlternateContent>
-                <w:color w:val="1b1f23"/>
               </w:rPr>
               <w:t xml:space="preserve">100%</w:t>
             </w:r>
@@ -6733,6 +6726,7 @@
             </w:pPr>
             <w:r>
               <w:rPr>
+                <w:color w:val="1b1f23"/>
                 <mc:AlternateContent>
                   <mc:Choice Requires="w14">
                     <w14:ligatures w14:val="standardContextual"/>
@@ -6741,7 +6735,6 @@
                     <w14:cntxtAlts/>
                   </mc:Choice>
                 </mc:AlternateContent>
-                <w:color w:val="1b1f23"/>
               </w:rPr>
               <w:t xml:space="preserve">Verified</w:t>
             </w:r>
@@ -6756,6 +6749,7 @@
           <w:p>
             <w:r>
               <w:rPr>
+                <w:color w:val="1b1f23"/>
                 <mc:AlternateContent>
                   <mc:Choice Requires="w14">
                     <w14:ligatures w14:val="standardContextual"/>
@@ -6764,7 +6758,6 @@
                     <w14:cntxtAlts/>
                   </mc:Choice>
                 </mc:AlternateContent>
-                <w:color w:val="1b1f23"/>
               </w:rPr>
               <w:t xml:space="preserve">OMML Math</w:t>
             </w:r>
@@ -6777,6 +6770,7 @@
             </w:pPr>
             <w:r>
               <w:rPr>
+                <w:color w:val="1b1f23"/>
                 <mc:AlternateContent>
                   <mc:Choice Requires="w14">
                     <w14:ligatures w14:val="standardContextual"/>
@@ -6785,7 +6779,6 @@
                     <w14:cntxtAlts/>
                   </mc:Choice>
                 </mc:AlternateContent>
-                <w:color w:val="1b1f23"/>
               </w:rPr>
               <w:t xml:space="preserve">100%</w:t>
             </w:r>
@@ -6798,6 +6791,7 @@
             </w:pPr>
             <w:r>
               <w:rPr>
+                <w:color w:val="1b1f23"/>
                 <mc:AlternateContent>
                   <mc:Choice Requires="w14">
                     <w14:ligatures w14:val="standardContextual"/>
@@ -6806,7 +6800,6 @@
                     <w14:cntxtAlts/>
                   </mc:Choice>
                 </mc:AlternateContent>
-                <w:color w:val="1b1f23"/>
               </w:rPr>
               <w:t xml:space="preserve">Verified</w:t>
             </w:r>
@@ -6822,9 +6815,6 @@
         <w:shd w:val="clear" w:color="auto" w:fill="F6F8FA"/>
         <w:spacing w:before="0" w:after="0"/>
         <w:ind w:left="360"/>
-        <w:rPr>
-          <w:sz w:val="8"/>
-        </w:rPr>
       </w:pPr>
     </w:p>
     <w:p>
@@ -6911,8 +6901,8 @@
       </w:hyperlink>
     </w:p>
     <w:sectPr>
-      <w:headerReference xmlns:r="http://schemas.openxmlformats.org/officeDocument/2006/relationships" w:type="default" r:id="Ra04d5bd6fc404376"/>
-      <w:footerReference xmlns:r="http://schemas.openxmlformats.org/officeDocument/2006/relationships" w:type="default" r:id="Rbc5b2af185e2456b"/>
+      <w:headerReference xmlns:r="http://schemas.openxmlformats.org/officeDocument/2006/relationships" w:type="default" r:id="R946883944b8a4db9"/>
+      <w:footerReference xmlns:r="http://schemas.openxmlformats.org/officeDocument/2006/relationships" w:type="default" r:id="R113eaec6fed348da"/>
       <w:pgSz w:w="11906" w:h="16838"/>
       <w:pgMar w:top="1440" w:right="1440" w:bottom="1440" w:left="1440" w:header="576" w:footer="576" w:gutter="0"/>
     </w:sectPr>
@@ -7344,7 +7334,7 @@
 </file>
 
 <file path=customXml/item.xml><?xml version="1.0" encoding="utf-8"?>
-<marksmithSource schema="marksmith-source-v1" version="2.0.0.0" exportedUtc="2026-09-02T07:59:34.6886298Z" theme="GitHub Light" mermaidMode="1">
+<marksmithSource schema="marksmith-source-v1" version="3.1.0.0" exportedUtc="2026-09-02T20:41:57.4123460Z" theme="GitHub Light" mermaidMode="1">
   <markdown><![CDATA[# Massive Markdown Showcase
 A comprehensive demonstration of Markdown syntax and extensions compiled to native ECMA-376 Microsoft Word OpenXML by **MarkSmith**.
 ---

</xml_diff>

<commit_message>
feat: Update massive showcase docx with Gemini 3.8 reasoning & callouts, update comparison audit with tracked revisions & frontier AI dialect
</commit_message>
<xml_diff>
--- a/media/massive-markdown-showcase.docx
+++ b/media/massive-markdown-showcase.docx
@@ -1,6 +1,6 @@
 
 <file path=word/document.xml><?xml version="1.0" encoding="utf-8"?>
-<w:document xmlns:wp="http://schemas.openxmlformats.org/drawingml/2006/wordprocessingDrawing" xmlns:a="http://schemas.openxmlformats.org/drawingml/2006/main" xmlns:wpg="http://schemas.microsoft.com/office/word/2010/wordprocessingGroup" xmlns:wps="http://schemas.microsoft.com/office/word/2010/wordprocessingShape" xmlns:w="http://schemas.openxmlformats.org/wordprocessingml/2006/main" xmlns:w14="http://schemas.microsoft.com/office/word/2010/wordml" xmlns:w15="http://schemas.microsoft.com/office/word/2012/wordml" xmlns:mc="http://schemas.openxmlformats.org/markup-compatibility/2006" mc:Ignorable="w14 w15">
+<w:document xmlns:w="http://schemas.openxmlformats.org/wordprocessingml/2006/main" xmlns:r="http://schemas.openxmlformats.org/officeDocument/2006/relationships" xmlns:m="http://schemas.openxmlformats.org/officeDocument/2006/math" xmlns:w14="http://schemas.microsoft.com/office/word/2010/wordml" xmlns:w15="http://schemas.microsoft.com/office/word/2012/wordml" xmlns:a="http://schemas.openxmlformats.org/drawingml/2006/main" xmlns:wp="http://schemas.openxmlformats.org/drawingml/2006/wordprocessingDrawing" xmlns:pic="http://schemas.openxmlformats.org/drawingml/2006/picture" xmlns:c="http://schemas.openxmlformats.org/drawingml/2006/chart" xmlns:dgm="http://schemas.openxmlformats.org/drawingml/2006/diagram" xmlns:wpg="http://schemas.microsoft.com/office/word/2010/wordprocessingGroup" xmlns:wps="http://schemas.microsoft.com/office/word/2010/wordprocessingShape" xmlns:mc="http://schemas.openxmlformats.org/markup-compatibility/2006" mc:Ignorable="w14 w15">
   <w:background w:color="FFFFFF"/>
   <w:body>
     <w:p>
@@ -358,7 +358,7 @@
         </w:rPr>
         <w:t xml:space="preserve">, and a </w:t>
       </w:r>
-      <w:hyperlink xmlns:r="http://schemas.openxmlformats.org/officeDocument/2006/relationships" r:id="Rbde5cf39ba474b1b">
+      <w:hyperlink r:id="R6a9579358f224a98">
         <w:r>
           <w:rPr>
             <w:color w:val="0563C1"/>
@@ -1691,6 +1691,12 @@
           <w:insideH w:val="single" w:color="D1D5DA" w:sz="6"/>
           <w:insideV w:val="single" w:color="D1D5DA" w:sz="6"/>
         </w:tblBorders>
+        <w:tblCellMar>
+          <w:top w:w="120" w:type="dxa"/>
+          <w:bottom w:w="120" w:type="dxa"/>
+          <w:left w:w="180" w:type="dxa"/>
+          <w:right w:w="180" w:type="dxa"/>
+        </w:tblCellMar>
       </w:tblPr>
       <w:tblGrid>
         <w:gridCol/>
@@ -2199,6 +2205,12 @@
           <w:insideH w:val="single" w:color="D1D5DA" w:sz="6"/>
           <w:insideV w:val="single" w:color="D1D5DA" w:sz="6"/>
         </w:tblBorders>
+        <w:tblCellMar>
+          <w:top w:w="120" w:type="dxa"/>
+          <w:bottom w:w="120" w:type="dxa"/>
+          <w:left w:w="180" w:type="dxa"/>
+          <w:right w:w="180" w:type="dxa"/>
+        </w:tblCellMar>
       </w:tblPr>
       <w:tblGrid>
         <w:gridCol/>
@@ -3166,34 +3178,7 @@
             </mc:Choice>
           </mc:AlternateContent>
         </w:rPr>
-        <w:t xml:space="preserve">Mermaid Diagrams (ShapeForge</w:t>
-      </w:r>
-      <w:r>
-        <w:rPr>
-          <w:rFonts w:ascii="Segoe UI Emoji" w:hAnsi="Segoe UI Emoji" w:eastAsia="Segoe UI Emoji" w:cs="Segoe UI Emoji"/>
-          <mc:AlternateContent>
-            <mc:Choice Requires="w14">
-              <w14:ligatures w14:val="standardContextual"/>
-              <w14:numForm w14:val="oldStyle"/>
-              <w14:numSpacing w14:val="proportional"/>
-              <w14:cntxtAlts/>
-            </mc:Choice>
-          </mc:AlternateContent>
-        </w:rPr>
-        <w:t xml:space="preserve">™</w:t>
-      </w:r>
-      <w:r>
-        <w:rPr>
-          <mc:AlternateContent>
-            <mc:Choice Requires="w14">
-              <w14:ligatures w14:val="standardContextual"/>
-              <w14:numForm w14:val="oldStyle"/>
-              <w14:numSpacing w14:val="proportional"/>
-              <w14:cntxtAlts/>
-            </mc:Choice>
-          </mc:AlternateContent>
-        </w:rPr>
-        <w:t xml:space="preserve">)</w:t>
+        <w:t xml:space="preserve">Mermaid Diagrams (ShapeForge™)</w:t>
       </w:r>
       <w:bookmarkEnd w:id="22"/>
     </w:p>
@@ -4997,7 +4982,7 @@
         </w:rPr>
         <w:t xml:space="preserve">Inline equation: </w:t>
       </w:r>
-      <m:oMath xmlns:m="http://schemas.openxmlformats.org/officeDocument/2006/math">
+      <m:oMath>
         <m:r>
           <m:t xml:space="preserve">E</m:t>
         </m:r>
@@ -5033,7 +5018,7 @@
         </w:rPr>
         <w:t xml:space="preserve"> and </w:t>
       </w:r>
-      <m:oMath xmlns:m="http://schemas.openxmlformats.org/officeDocument/2006/math">
+      <m:oMath>
         <m:r>
           <m:t xml:space="preserve">R</m:t>
         </m:r>
@@ -5115,7 +5100,7 @@
         <w:spacing w:before="120" w:after="120"/>
         <w:jc w:val="center"/>
       </w:pPr>
-      <m:oMath xmlns:m="http://schemas.openxmlformats.org/officeDocument/2006/math">
+      <m:oMath>
         <m:nary>
           <m:naryPr>
             <m:chr m:val="∫"/>
@@ -5185,7 +5170,7 @@
         <w:spacing w:before="120" w:after="120"/>
         <w:jc w:val="center"/>
       </w:pPr>
-      <m:oMath xmlns:m="http://schemas.openxmlformats.org/officeDocument/2006/math">
+      <m:oMath>
         <m:d>
           <m:dPr>
             <m:begChr m:val="["/>
@@ -5491,81 +5476,15 @@
       </w:r>
       <w:r>
         <w:rPr>
-          <w:rFonts w:ascii="Segoe UI Emoji" w:hAnsi="Segoe UI Emoji" w:eastAsia="Segoe UI Emoji" w:cs="Segoe UI Emoji"/>
-          <w:rFonts w:ascii="Consolas" w:hAnsi="Consolas"/>
-          <w:noProof/>
-          <w:sz w:val="20"/>
-        </w:rPr>
-        <w:t xml:space="preserve">│</w:t>
-      </w:r>
-      <w:r>
-        <w:br/>
-      </w:r>
-      <w:r>
-        <w:rPr>
-          <w:rFonts w:ascii="Segoe UI Emoji" w:hAnsi="Segoe UI Emoji" w:eastAsia="Segoe UI Emoji" w:cs="Segoe UI Emoji"/>
-          <w:rFonts w:ascii="Consolas" w:hAnsi="Consolas"/>
-          <w:noProof/>
-          <w:sz w:val="20"/>
-        </w:rPr>
-        <w:t xml:space="preserve">├</w:t>
-      </w:r>
-      <w:r>
-        <w:rPr>
-          <w:rFonts w:ascii="Segoe UI Emoji" w:hAnsi="Segoe UI Emoji" w:eastAsia="Segoe UI Emoji" w:cs="Segoe UI Emoji"/>
-          <w:rFonts w:ascii="Consolas" w:hAnsi="Consolas"/>
-          <w:noProof/>
-          <w:sz w:val="20"/>
-        </w:rPr>
-        <w:t xml:space="preserve">─</w:t>
-      </w:r>
-      <w:r>
-        <w:rPr>
-          <w:rFonts w:ascii="Segoe UI Emoji" w:hAnsi="Segoe UI Emoji" w:eastAsia="Segoe UI Emoji" w:cs="Segoe UI Emoji"/>
-          <w:rFonts w:ascii="Consolas" w:hAnsi="Consolas"/>
-          <w:noProof/>
-          <w:sz w:val="20"/>
-        </w:rPr>
-        <w:t xml:space="preserve">─</w:t>
-      </w:r>
-      <w:r>
-        <w:rPr>
           <w:rFonts w:ascii="Consolas" w:hAnsi="Consolas"/>
           <w:noProof/>
           <w:color w:val="1b1f23"/>
           <w:sz w:val="20"/>
         </w:rPr>
-        <w:t xml:space="preserve"> README.md</w:t>
+        <w:t xml:space="preserve">│</w:t>
       </w:r>
       <w:r>
         <w:br/>
-      </w:r>
-      <w:r>
-        <w:rPr>
-          <w:rFonts w:ascii="Segoe UI Emoji" w:hAnsi="Segoe UI Emoji" w:eastAsia="Segoe UI Emoji" w:cs="Segoe UI Emoji"/>
-          <w:rFonts w:ascii="Consolas" w:hAnsi="Consolas"/>
-          <w:noProof/>
-          <w:sz w:val="20"/>
-        </w:rPr>
-        <w:t xml:space="preserve">├</w:t>
-      </w:r>
-      <w:r>
-        <w:rPr>
-          <w:rFonts w:ascii="Segoe UI Emoji" w:hAnsi="Segoe UI Emoji" w:eastAsia="Segoe UI Emoji" w:cs="Segoe UI Emoji"/>
-          <w:rFonts w:ascii="Consolas" w:hAnsi="Consolas"/>
-          <w:noProof/>
-          <w:sz w:val="20"/>
-        </w:rPr>
-        <w:t xml:space="preserve">─</w:t>
-      </w:r>
-      <w:r>
-        <w:rPr>
-          <w:rFonts w:ascii="Segoe UI Emoji" w:hAnsi="Segoe UI Emoji" w:eastAsia="Segoe UI Emoji" w:cs="Segoe UI Emoji"/>
-          <w:rFonts w:ascii="Consolas" w:hAnsi="Consolas"/>
-          <w:noProof/>
-          <w:sz w:val="20"/>
-        </w:rPr>
-        <w:t xml:space="preserve">─</w:t>
       </w:r>
       <w:r>
         <w:rPr>
@@ -5574,37 +5493,10 @@
           <w:color w:val="1b1f23"/>
           <w:sz w:val="20"/>
         </w:rPr>
-        <w:t xml:space="preserve"> LICENSE</w:t>
+        <w:t xml:space="preserve">├── README.md</w:t>
       </w:r>
       <w:r>
         <w:br/>
-      </w:r>
-      <w:r>
-        <w:rPr>
-          <w:rFonts w:ascii="Segoe UI Emoji" w:hAnsi="Segoe UI Emoji" w:eastAsia="Segoe UI Emoji" w:cs="Segoe UI Emoji"/>
-          <w:rFonts w:ascii="Consolas" w:hAnsi="Consolas"/>
-          <w:noProof/>
-          <w:sz w:val="20"/>
-        </w:rPr>
-        <w:t xml:space="preserve">├</w:t>
-      </w:r>
-      <w:r>
-        <w:rPr>
-          <w:rFonts w:ascii="Segoe UI Emoji" w:hAnsi="Segoe UI Emoji" w:eastAsia="Segoe UI Emoji" w:cs="Segoe UI Emoji"/>
-          <w:rFonts w:ascii="Consolas" w:hAnsi="Consolas"/>
-          <w:noProof/>
-          <w:sz w:val="20"/>
-        </w:rPr>
-        <w:t xml:space="preserve">─</w:t>
-      </w:r>
-      <w:r>
-        <w:rPr>
-          <w:rFonts w:ascii="Segoe UI Emoji" w:hAnsi="Segoe UI Emoji" w:eastAsia="Segoe UI Emoji" w:cs="Segoe UI Emoji"/>
-          <w:rFonts w:ascii="Consolas" w:hAnsi="Consolas"/>
-          <w:noProof/>
-          <w:sz w:val="20"/>
-        </w:rPr>
-        <w:t xml:space="preserve">─</w:t>
       </w:r>
       <w:r>
         <w:rPr>
@@ -5613,19 +5505,10 @@
           <w:color w:val="1b1f23"/>
           <w:sz w:val="20"/>
         </w:rPr>
-        <w:t xml:space="preserve"> docs/</w:t>
+        <w:t xml:space="preserve">├── LICENSE</w:t>
       </w:r>
       <w:r>
         <w:br/>
-      </w:r>
-      <w:r>
-        <w:rPr>
-          <w:rFonts w:ascii="Segoe UI Emoji" w:hAnsi="Segoe UI Emoji" w:eastAsia="Segoe UI Emoji" w:cs="Segoe UI Emoji"/>
-          <w:rFonts w:ascii="Consolas" w:hAnsi="Consolas"/>
-          <w:noProof/>
-          <w:sz w:val="20"/>
-        </w:rPr>
-        <w:t xml:space="preserve">│</w:t>
       </w:r>
       <w:r>
         <w:rPr>
@@ -5634,34 +5517,10 @@
           <w:color w:val="1b1f23"/>
           <w:sz w:val="20"/>
         </w:rPr>
-        <w:t xml:space="preserve">   </w:t>
-      </w:r>
-      <w:r>
-        <w:rPr>
-          <w:rFonts w:ascii="Segoe UI Emoji" w:hAnsi="Segoe UI Emoji" w:eastAsia="Segoe UI Emoji" w:cs="Segoe UI Emoji"/>
-          <w:rFonts w:ascii="Consolas" w:hAnsi="Consolas"/>
-          <w:noProof/>
-          <w:sz w:val="20"/>
-        </w:rPr>
-        <w:t xml:space="preserve">├</w:t>
-      </w:r>
-      <w:r>
-        <w:rPr>
-          <w:rFonts w:ascii="Segoe UI Emoji" w:hAnsi="Segoe UI Emoji" w:eastAsia="Segoe UI Emoji" w:cs="Segoe UI Emoji"/>
-          <w:rFonts w:ascii="Consolas" w:hAnsi="Consolas"/>
-          <w:noProof/>
-          <w:sz w:val="20"/>
-        </w:rPr>
-        <w:t xml:space="preserve">─</w:t>
-      </w:r>
-      <w:r>
-        <w:rPr>
-          <w:rFonts w:ascii="Segoe UI Emoji" w:hAnsi="Segoe UI Emoji" w:eastAsia="Segoe UI Emoji" w:cs="Segoe UI Emoji"/>
-          <w:rFonts w:ascii="Consolas" w:hAnsi="Consolas"/>
-          <w:noProof/>
-          <w:sz w:val="20"/>
-        </w:rPr>
-        <w:t xml:space="preserve">─</w:t>
+        <w:t xml:space="preserve">├── docs/</w:t>
+      </w:r>
+      <w:r>
+        <w:br/>
       </w:r>
       <w:r>
         <w:rPr>
@@ -5670,19 +5529,10 @@
           <w:color w:val="1b1f23"/>
           <w:sz w:val="20"/>
         </w:rPr>
-        <w:t xml:space="preserve"> architecture.md</w:t>
+        <w:t xml:space="preserve">│   ├── architecture.md</w:t>
       </w:r>
       <w:r>
         <w:br/>
-      </w:r>
-      <w:r>
-        <w:rPr>
-          <w:rFonts w:ascii="Segoe UI Emoji" w:hAnsi="Segoe UI Emoji" w:eastAsia="Segoe UI Emoji" w:cs="Segoe UI Emoji"/>
-          <w:rFonts w:ascii="Consolas" w:hAnsi="Consolas"/>
-          <w:noProof/>
-          <w:sz w:val="20"/>
-        </w:rPr>
-        <w:t xml:space="preserve">│</w:t>
       </w:r>
       <w:r>
         <w:rPr>
@@ -5691,34 +5541,10 @@
           <w:color w:val="1b1f23"/>
           <w:sz w:val="20"/>
         </w:rPr>
-        <w:t xml:space="preserve">   </w:t>
-      </w:r>
-      <w:r>
-        <w:rPr>
-          <w:rFonts w:ascii="Segoe UI Emoji" w:hAnsi="Segoe UI Emoji" w:eastAsia="Segoe UI Emoji" w:cs="Segoe UI Emoji"/>
-          <w:rFonts w:ascii="Consolas" w:hAnsi="Consolas"/>
-          <w:noProof/>
-          <w:sz w:val="20"/>
-        </w:rPr>
-        <w:t xml:space="preserve">└</w:t>
-      </w:r>
-      <w:r>
-        <w:rPr>
-          <w:rFonts w:ascii="Segoe UI Emoji" w:hAnsi="Segoe UI Emoji" w:eastAsia="Segoe UI Emoji" w:cs="Segoe UI Emoji"/>
-          <w:rFonts w:ascii="Consolas" w:hAnsi="Consolas"/>
-          <w:noProof/>
-          <w:sz w:val="20"/>
-        </w:rPr>
-        <w:t xml:space="preserve">─</w:t>
-      </w:r>
-      <w:r>
-        <w:rPr>
-          <w:rFonts w:ascii="Segoe UI Emoji" w:hAnsi="Segoe UI Emoji" w:eastAsia="Segoe UI Emoji" w:cs="Segoe UI Emoji"/>
-          <w:rFonts w:ascii="Consolas" w:hAnsi="Consolas"/>
-          <w:noProof/>
-          <w:sz w:val="20"/>
-        </w:rPr>
-        <w:t xml:space="preserve">─</w:t>
+        <w:t xml:space="preserve">│   └── openxml-schema.md</w:t>
+      </w:r>
+      <w:r>
+        <w:br/>
       </w:r>
       <w:r>
         <w:rPr>
@@ -5727,37 +5553,10 @@
           <w:color w:val="1b1f23"/>
           <w:sz w:val="20"/>
         </w:rPr>
-        <w:t xml:space="preserve"> openxml-schema.md</w:t>
+        <w:t xml:space="preserve">├── src/</w:t>
       </w:r>
       <w:r>
         <w:br/>
-      </w:r>
-      <w:r>
-        <w:rPr>
-          <w:rFonts w:ascii="Segoe UI Emoji" w:hAnsi="Segoe UI Emoji" w:eastAsia="Segoe UI Emoji" w:cs="Segoe UI Emoji"/>
-          <w:rFonts w:ascii="Consolas" w:hAnsi="Consolas"/>
-          <w:noProof/>
-          <w:sz w:val="20"/>
-        </w:rPr>
-        <w:t xml:space="preserve">├</w:t>
-      </w:r>
-      <w:r>
-        <w:rPr>
-          <w:rFonts w:ascii="Segoe UI Emoji" w:hAnsi="Segoe UI Emoji" w:eastAsia="Segoe UI Emoji" w:cs="Segoe UI Emoji"/>
-          <w:rFonts w:ascii="Consolas" w:hAnsi="Consolas"/>
-          <w:noProof/>
-          <w:sz w:val="20"/>
-        </w:rPr>
-        <w:t xml:space="preserve">─</w:t>
-      </w:r>
-      <w:r>
-        <w:rPr>
-          <w:rFonts w:ascii="Segoe UI Emoji" w:hAnsi="Segoe UI Emoji" w:eastAsia="Segoe UI Emoji" w:cs="Segoe UI Emoji"/>
-          <w:rFonts w:ascii="Consolas" w:hAnsi="Consolas"/>
-          <w:noProof/>
-          <w:sz w:val="20"/>
-        </w:rPr>
-        <w:t xml:space="preserve">─</w:t>
       </w:r>
       <w:r>
         <w:rPr>
@@ -5766,19 +5565,10 @@
           <w:color w:val="1b1f23"/>
           <w:sz w:val="20"/>
         </w:rPr>
-        <w:t xml:space="preserve"> src/</w:t>
+        <w:t xml:space="preserve">│   ├── MarkSmith.Core/</w:t>
       </w:r>
       <w:r>
         <w:br/>
-      </w:r>
-      <w:r>
-        <w:rPr>
-          <w:rFonts w:ascii="Segoe UI Emoji" w:hAnsi="Segoe UI Emoji" w:eastAsia="Segoe UI Emoji" w:cs="Segoe UI Emoji"/>
-          <w:rFonts w:ascii="Consolas" w:hAnsi="Consolas"/>
-          <w:noProof/>
-          <w:sz w:val="20"/>
-        </w:rPr>
-        <w:t xml:space="preserve">│</w:t>
       </w:r>
       <w:r>
         <w:rPr>
@@ -5787,34 +5577,10 @@
           <w:color w:val="1b1f23"/>
           <w:sz w:val="20"/>
         </w:rPr>
-        <w:t xml:space="preserve">   </w:t>
-      </w:r>
-      <w:r>
-        <w:rPr>
-          <w:rFonts w:ascii="Segoe UI Emoji" w:hAnsi="Segoe UI Emoji" w:eastAsia="Segoe UI Emoji" w:cs="Segoe UI Emoji"/>
-          <w:rFonts w:ascii="Consolas" w:hAnsi="Consolas"/>
-          <w:noProof/>
-          <w:sz w:val="20"/>
-        </w:rPr>
-        <w:t xml:space="preserve">├</w:t>
-      </w:r>
-      <w:r>
-        <w:rPr>
-          <w:rFonts w:ascii="Segoe UI Emoji" w:hAnsi="Segoe UI Emoji" w:eastAsia="Segoe UI Emoji" w:cs="Segoe UI Emoji"/>
-          <w:rFonts w:ascii="Consolas" w:hAnsi="Consolas"/>
-          <w:noProof/>
-          <w:sz w:val="20"/>
-        </w:rPr>
-        <w:t xml:space="preserve">─</w:t>
-      </w:r>
-      <w:r>
-        <w:rPr>
-          <w:rFonts w:ascii="Segoe UI Emoji" w:hAnsi="Segoe UI Emoji" w:eastAsia="Segoe UI Emoji" w:cs="Segoe UI Emoji"/>
-          <w:rFonts w:ascii="Consolas" w:hAnsi="Consolas"/>
-          <w:noProof/>
-          <w:sz w:val="20"/>
-        </w:rPr>
-        <w:t xml:space="preserve">─</w:t>
+        <w:t xml:space="preserve">│   ├── MarkSmith.Desktop/</w:t>
+      </w:r>
+      <w:r>
+        <w:br/>
       </w:r>
       <w:r>
         <w:rPr>
@@ -5823,19 +5589,10 @@
           <w:color w:val="1b1f23"/>
           <w:sz w:val="20"/>
         </w:rPr>
-        <w:t xml:space="preserve"> MarkSmith.Core/</w:t>
+        <w:t xml:space="preserve">│   └── MarkSmith.Cli/</w:t>
       </w:r>
       <w:r>
         <w:br/>
-      </w:r>
-      <w:r>
-        <w:rPr>
-          <w:rFonts w:ascii="Segoe UI Emoji" w:hAnsi="Segoe UI Emoji" w:eastAsia="Segoe UI Emoji" w:cs="Segoe UI Emoji"/>
-          <w:rFonts w:ascii="Consolas" w:hAnsi="Consolas"/>
-          <w:noProof/>
-          <w:sz w:val="20"/>
-        </w:rPr>
-        <w:t xml:space="preserve">│</w:t>
       </w:r>
       <w:r>
         <w:rPr>
@@ -5844,34 +5601,10 @@
           <w:color w:val="1b1f23"/>
           <w:sz w:val="20"/>
         </w:rPr>
-        <w:t xml:space="preserve">   </w:t>
-      </w:r>
-      <w:r>
-        <w:rPr>
-          <w:rFonts w:ascii="Segoe UI Emoji" w:hAnsi="Segoe UI Emoji" w:eastAsia="Segoe UI Emoji" w:cs="Segoe UI Emoji"/>
-          <w:rFonts w:ascii="Consolas" w:hAnsi="Consolas"/>
-          <w:noProof/>
-          <w:sz w:val="20"/>
-        </w:rPr>
-        <w:t xml:space="preserve">├</w:t>
-      </w:r>
-      <w:r>
-        <w:rPr>
-          <w:rFonts w:ascii="Segoe UI Emoji" w:hAnsi="Segoe UI Emoji" w:eastAsia="Segoe UI Emoji" w:cs="Segoe UI Emoji"/>
-          <w:rFonts w:ascii="Consolas" w:hAnsi="Consolas"/>
-          <w:noProof/>
-          <w:sz w:val="20"/>
-        </w:rPr>
-        <w:t xml:space="preserve">─</w:t>
-      </w:r>
-      <w:r>
-        <w:rPr>
-          <w:rFonts w:ascii="Segoe UI Emoji" w:hAnsi="Segoe UI Emoji" w:eastAsia="Segoe UI Emoji" w:cs="Segoe UI Emoji"/>
-          <w:rFonts w:ascii="Consolas" w:hAnsi="Consolas"/>
-          <w:noProof/>
-          <w:sz w:val="20"/>
-        </w:rPr>
-        <w:t xml:space="preserve">─</w:t>
+        <w:t xml:space="preserve">└── tests/</w:t>
+      </w:r>
+      <w:r>
+        <w:br/>
       </w:r>
       <w:r>
         <w:rPr>
@@ -5880,19 +5613,10 @@
           <w:color w:val="1b1f23"/>
           <w:sz w:val="20"/>
         </w:rPr>
-        <w:t xml:space="preserve"> MarkSmith.Desktop/</w:t>
+        <w:t xml:space="preserve">    ├── DocxExportTests.cs</w:t>
       </w:r>
       <w:r>
         <w:br/>
-      </w:r>
-      <w:r>
-        <w:rPr>
-          <w:rFonts w:ascii="Segoe UI Emoji" w:hAnsi="Segoe UI Emoji" w:eastAsia="Segoe UI Emoji" w:cs="Segoe UI Emoji"/>
-          <w:rFonts w:ascii="Consolas" w:hAnsi="Consolas"/>
-          <w:noProof/>
-          <w:sz w:val="20"/>
-        </w:rPr>
-        <w:t xml:space="preserve">│</w:t>
       </w:r>
       <w:r>
         <w:rPr>
@@ -5901,178 +5625,7 @@
           <w:color w:val="1b1f23"/>
           <w:sz w:val="20"/>
         </w:rPr>
-        <w:t xml:space="preserve">   </w:t>
-      </w:r>
-      <w:r>
-        <w:rPr>
-          <w:rFonts w:ascii="Segoe UI Emoji" w:hAnsi="Segoe UI Emoji" w:eastAsia="Segoe UI Emoji" w:cs="Segoe UI Emoji"/>
-          <w:rFonts w:ascii="Consolas" w:hAnsi="Consolas"/>
-          <w:noProof/>
-          <w:sz w:val="20"/>
-        </w:rPr>
-        <w:t xml:space="preserve">└</w:t>
-      </w:r>
-      <w:r>
-        <w:rPr>
-          <w:rFonts w:ascii="Segoe UI Emoji" w:hAnsi="Segoe UI Emoji" w:eastAsia="Segoe UI Emoji" w:cs="Segoe UI Emoji"/>
-          <w:rFonts w:ascii="Consolas" w:hAnsi="Consolas"/>
-          <w:noProof/>
-          <w:sz w:val="20"/>
-        </w:rPr>
-        <w:t xml:space="preserve">─</w:t>
-      </w:r>
-      <w:r>
-        <w:rPr>
-          <w:rFonts w:ascii="Segoe UI Emoji" w:hAnsi="Segoe UI Emoji" w:eastAsia="Segoe UI Emoji" w:cs="Segoe UI Emoji"/>
-          <w:rFonts w:ascii="Consolas" w:hAnsi="Consolas"/>
-          <w:noProof/>
-          <w:sz w:val="20"/>
-        </w:rPr>
-        <w:t xml:space="preserve">─</w:t>
-      </w:r>
-      <w:r>
-        <w:rPr>
-          <w:rFonts w:ascii="Consolas" w:hAnsi="Consolas"/>
-          <w:noProof/>
-          <w:color w:val="1b1f23"/>
-          <w:sz w:val="20"/>
-        </w:rPr>
-        <w:t xml:space="preserve"> MarkSmith.Cli/</w:t>
-      </w:r>
-      <w:r>
-        <w:br/>
-      </w:r>
-      <w:r>
-        <w:rPr>
-          <w:rFonts w:ascii="Segoe UI Emoji" w:hAnsi="Segoe UI Emoji" w:eastAsia="Segoe UI Emoji" w:cs="Segoe UI Emoji"/>
-          <w:rFonts w:ascii="Consolas" w:hAnsi="Consolas"/>
-          <w:noProof/>
-          <w:sz w:val="20"/>
-        </w:rPr>
-        <w:t xml:space="preserve">└</w:t>
-      </w:r>
-      <w:r>
-        <w:rPr>
-          <w:rFonts w:ascii="Segoe UI Emoji" w:hAnsi="Segoe UI Emoji" w:eastAsia="Segoe UI Emoji" w:cs="Segoe UI Emoji"/>
-          <w:rFonts w:ascii="Consolas" w:hAnsi="Consolas"/>
-          <w:noProof/>
-          <w:sz w:val="20"/>
-        </w:rPr>
-        <w:t xml:space="preserve">─</w:t>
-      </w:r>
-      <w:r>
-        <w:rPr>
-          <w:rFonts w:ascii="Segoe UI Emoji" w:hAnsi="Segoe UI Emoji" w:eastAsia="Segoe UI Emoji" w:cs="Segoe UI Emoji"/>
-          <w:rFonts w:ascii="Consolas" w:hAnsi="Consolas"/>
-          <w:noProof/>
-          <w:sz w:val="20"/>
-        </w:rPr>
-        <w:t xml:space="preserve">─</w:t>
-      </w:r>
-      <w:r>
-        <w:rPr>
-          <w:rFonts w:ascii="Consolas" w:hAnsi="Consolas"/>
-          <w:noProof/>
-          <w:color w:val="1b1f23"/>
-          <w:sz w:val="20"/>
-        </w:rPr>
-        <w:t xml:space="preserve"> tests/</w:t>
-      </w:r>
-      <w:r>
-        <w:br/>
-      </w:r>
-      <w:r>
-        <w:rPr>
-          <w:rFonts w:ascii="Consolas" w:hAnsi="Consolas"/>
-          <w:noProof/>
-          <w:color w:val="1b1f23"/>
-          <w:sz w:val="20"/>
-        </w:rPr>
-        <w:t xml:space="preserve">    </w:t>
-      </w:r>
-      <w:r>
-        <w:rPr>
-          <w:rFonts w:ascii="Segoe UI Emoji" w:hAnsi="Segoe UI Emoji" w:eastAsia="Segoe UI Emoji" w:cs="Segoe UI Emoji"/>
-          <w:rFonts w:ascii="Consolas" w:hAnsi="Consolas"/>
-          <w:noProof/>
-          <w:sz w:val="20"/>
-        </w:rPr>
-        <w:t xml:space="preserve">├</w:t>
-      </w:r>
-      <w:r>
-        <w:rPr>
-          <w:rFonts w:ascii="Segoe UI Emoji" w:hAnsi="Segoe UI Emoji" w:eastAsia="Segoe UI Emoji" w:cs="Segoe UI Emoji"/>
-          <w:rFonts w:ascii="Consolas" w:hAnsi="Consolas"/>
-          <w:noProof/>
-          <w:sz w:val="20"/>
-        </w:rPr>
-        <w:t xml:space="preserve">─</w:t>
-      </w:r>
-      <w:r>
-        <w:rPr>
-          <w:rFonts w:ascii="Segoe UI Emoji" w:hAnsi="Segoe UI Emoji" w:eastAsia="Segoe UI Emoji" w:cs="Segoe UI Emoji"/>
-          <w:rFonts w:ascii="Consolas" w:hAnsi="Consolas"/>
-          <w:noProof/>
-          <w:sz w:val="20"/>
-        </w:rPr>
-        <w:t xml:space="preserve">─</w:t>
-      </w:r>
-      <w:r>
-        <w:rPr>
-          <w:rFonts w:ascii="Consolas" w:hAnsi="Consolas"/>
-          <w:noProof/>
-          <w:color w:val="1b1f23"/>
-          <w:sz w:val="20"/>
-        </w:rPr>
-        <w:t xml:space="preserve"> DocxExportTests.cs</w:t>
-      </w:r>
-      <w:r>
-        <w:br/>
-      </w:r>
-      <w:r>
-        <w:rPr>
-          <w:rFonts w:ascii="Consolas" w:hAnsi="Consolas"/>
-          <w:noProof/>
-          <w:color w:val="1b1f23"/>
-          <w:sz w:val="20"/>
-        </w:rPr>
-        <w:t xml:space="preserve">    </w:t>
-      </w:r>
-      <w:r>
-        <w:rPr>
-          <w:rFonts w:ascii="Segoe UI Emoji" w:hAnsi="Segoe UI Emoji" w:eastAsia="Segoe UI Emoji" w:cs="Segoe UI Emoji"/>
-          <w:rFonts w:ascii="Consolas" w:hAnsi="Consolas"/>
-          <w:noProof/>
-          <w:sz w:val="20"/>
-        </w:rPr>
-        <w:t xml:space="preserve">└</w:t>
-      </w:r>
-      <w:r>
-        <w:rPr>
-          <w:rFonts w:ascii="Segoe UI Emoji" w:hAnsi="Segoe UI Emoji" w:eastAsia="Segoe UI Emoji" w:cs="Segoe UI Emoji"/>
-          <w:rFonts w:ascii="Consolas" w:hAnsi="Consolas"/>
-          <w:noProof/>
-          <w:sz w:val="20"/>
-        </w:rPr>
-        <w:t xml:space="preserve">─</w:t>
-      </w:r>
-      <w:r>
-        <w:rPr>
-          <w:rFonts w:ascii="Segoe UI Emoji" w:hAnsi="Segoe UI Emoji" w:eastAsia="Segoe UI Emoji" w:cs="Segoe UI Emoji"/>
-          <w:rFonts w:ascii="Consolas" w:hAnsi="Consolas"/>
-          <w:noProof/>
-          <w:sz w:val="20"/>
-        </w:rPr>
-        <w:t xml:space="preserve">─</w:t>
-      </w:r>
-      <w:r>
-        <w:rPr>
-          <w:rFonts w:ascii="Consolas" w:hAnsi="Consolas"/>
-          <w:noProof/>
-          <w:color w:val="1b1f23"/>
-          <w:sz w:val="20"/>
-        </w:rPr>
-        <w:t xml:space="preserve"> ReverseImportTests.cs</w:t>
+        <w:t xml:space="preserve">    └── ReverseImportTests.cs</w:t>
       </w:r>
     </w:p>
     <w:p>
@@ -6126,29 +5679,13 @@
             <w:tcW w:w="5000" w:type="pct"/>
             <w:shd w:val="clear" w:color="auto" w:fill="D8E7F9"/>
             <w:tcMar>
-              <w:top w:w="100" w:type="dxa"/>
-              <w:left w:w="160" w:type="dxa"/>
-              <w:bottom w:w="100" w:type="dxa"/>
-              <w:right w:w="160" w:type="dxa"/>
+              <w:top w:w="160" w:type="dxa"/>
+              <w:left w:w="240" w:type="dxa"/>
+              <w:bottom w:w="160" w:type="dxa"/>
+              <w:right w:w="240" w:type="dxa"/>
             </w:tcMar>
           </w:tcPr>
           <w:p>
-            <w:r>
-              <w:rPr>
-                <w:rFonts w:ascii="Segoe UI Emoji" w:hAnsi="Segoe UI Emoji" w:eastAsia="Segoe UI Emoji" w:cs="Segoe UI Emoji"/>
-                <w:b/>
-                <w:color w:val="1b1f23"/>
-                <mc:AlternateContent>
-                  <mc:Choice Requires="w14">
-                    <w14:ligatures w14:val="standardContextual"/>
-                    <w14:numForm w14:val="oldStyle"/>
-                    <w14:numSpacing w14:val="proportional"/>
-                    <w14:cntxtAlts/>
-                  </mc:Choice>
-                </mc:AlternateContent>
-              </w:rPr>
-              <w:t xml:space="preserve">ℹ</w:t>
-            </w:r>
             <w:r>
               <w:rPr>
                 <w:b/>
@@ -6162,7 +5699,7 @@
                   </mc:Choice>
                 </mc:AlternateContent>
               </w:rPr>
-              <w:t xml:space="preserve">️ NOTE</w:t>
+              <w:t xml:space="preserve">ℹ️ NOTE</w:t>
             </w:r>
           </w:p>
           <w:p>
@@ -6208,10 +5745,10 @@
             <w:tcW w:w="5000" w:type="pct"/>
             <w:shd w:val="clear" w:color="auto" w:fill="DBECE0"/>
             <w:tcMar>
-              <w:top w:w="100" w:type="dxa"/>
-              <w:left w:w="160" w:type="dxa"/>
-              <w:bottom w:w="100" w:type="dxa"/>
-              <w:right w:w="160" w:type="dxa"/>
+              <w:top w:w="160" w:type="dxa"/>
+              <w:left w:w="240" w:type="dxa"/>
+              <w:bottom w:w="160" w:type="dxa"/>
+              <w:right w:w="240" w:type="dxa"/>
             </w:tcMar>
           </w:tcPr>
           <w:p>
@@ -6290,10 +5827,10 @@
             <w:tcW w:w="5000" w:type="pct"/>
             <w:shd w:val="clear" w:color="auto" w:fill="EBE3FA"/>
             <w:tcMar>
-              <w:top w:w="100" w:type="dxa"/>
-              <w:left w:w="160" w:type="dxa"/>
-              <w:bottom w:w="100" w:type="dxa"/>
-              <w:right w:w="160" w:type="dxa"/>
+              <w:top w:w="160" w:type="dxa"/>
+              <w:left w:w="240" w:type="dxa"/>
+              <w:bottom w:w="160" w:type="dxa"/>
+              <w:right w:w="240" w:type="dxa"/>
             </w:tcMar>
           </w:tcPr>
           <w:p>
@@ -6373,6 +5910,220 @@
         </w:tc>
       </w:tr>
     </w:tbl>
+    <w:tbl>
+      <w:tblPr>
+        <w:tblW w:w="5000" w:type="pct"/>
+        <w:tblBorders>
+          <w:top w:val="none"/>
+          <w:left w:val="single" w:color="BF8700" w:sz="30"/>
+          <w:bottom w:val="none"/>
+          <w:right w:val="none"/>
+          <w:insideH w:val="none"/>
+          <w:insideV w:val="none"/>
+        </w:tblBorders>
+      </w:tblPr>
+      <w:tblGrid>
+        <w:gridCol/>
+      </w:tblGrid>
+      <w:tr>
+        <w:trPr>
+          <w:cantSplit/>
+        </w:trPr>
+        <w:tc>
+          <w:tcPr>
+            <w:tcW w:w="5000" w:type="pct"/>
+            <w:shd w:val="clear" w:color="auto" w:fill="F5ECD6"/>
+            <w:tcMar>
+              <w:top w:w="160" w:type="dxa"/>
+              <w:left w:w="240" w:type="dxa"/>
+              <w:bottom w:w="160" w:type="dxa"/>
+              <w:right w:w="240" w:type="dxa"/>
+            </w:tcMar>
+          </w:tcPr>
+          <w:p>
+            <w:r>
+              <w:rPr>
+                <w:rFonts w:ascii="Segoe UI Emoji" w:hAnsi="Segoe UI Emoji" w:eastAsia="Segoe UI Emoji" w:cs="Segoe UI Emoji"/>
+                <w:b/>
+                <w:color w:val="1b1f23"/>
+                <mc:AlternateContent>
+                  <mc:Choice Requires="w14">
+                    <w14:ligatures w14:val="standardContextual"/>
+                    <w14:numForm w14:val="oldStyle"/>
+                    <w14:numSpacing w14:val="proportional"/>
+                    <w14:cntxtAlts/>
+                  </mc:Choice>
+                </mc:AlternateContent>
+              </w:rPr>
+              <w:t xml:space="preserve">⚠</w:t>
+            </w:r>
+            <w:r>
+              <w:rPr>
+                <w:b/>
+                <w:color w:val="121212"/>
+                <mc:AlternateContent>
+                  <mc:Choice Requires="w14">
+                    <w14:ligatures w14:val="standardContextual"/>
+                    <w14:numForm w14:val="oldStyle"/>
+                    <w14:numSpacing w14:val="proportional"/>
+                    <w14:cntxtAlts/>
+                  </mc:Choice>
+                </mc:AlternateContent>
+              </w:rPr>
+              <w:t xml:space="preserve">️ WARNING</w:t>
+            </w:r>
+          </w:p>
+          <w:p>
+            <w:r>
+              <w:rPr>
+                <w:color w:val="1b1f23"/>
+                <mc:AlternateContent>
+                  <mc:Choice Requires="w14">
+                    <w14:ligatures w14:val="standardContextual"/>
+                    <w14:numForm w14:val="oldStyle"/>
+                    <w14:numSpacing w14:val="proportional"/>
+                    <w14:cntxtAlts/>
+                  </mc:Choice>
+                </mc:AlternateContent>
+              </w:rPr>
+              <w:t xml:space="preserve">Legacy COM Word automation is vulnerable to server deadlocks and memory handle leaks under enterprise workloads.</w:t>
+            </w:r>
+          </w:p>
+        </w:tc>
+      </w:tr>
+    </w:tbl>
+    <w:tbl>
+      <w:tblPr>
+        <w:tblW w:w="5000" w:type="pct"/>
+        <w:tblBorders>
+          <w:top w:val="none"/>
+          <w:left w:val="single" w:color="CF222E" w:sz="30"/>
+          <w:bottom w:val="none"/>
+          <w:right w:val="none"/>
+          <w:insideH w:val="none"/>
+          <w:insideV w:val="none"/>
+        </w:tblBorders>
+      </w:tblPr>
+      <w:tblGrid>
+        <w:gridCol/>
+      </w:tblGrid>
+      <w:tr>
+        <w:trPr>
+          <w:cantSplit/>
+        </w:trPr>
+        <w:tc>
+          <w:tcPr>
+            <w:tcW w:w="5000" w:type="pct"/>
+            <w:shd w:val="clear" w:color="auto" w:fill="F7DCDE"/>
+            <w:tcMar>
+              <w:top w:w="160" w:type="dxa"/>
+              <w:left w:w="240" w:type="dxa"/>
+              <w:bottom w:w="160" w:type="dxa"/>
+              <w:right w:w="240" w:type="dxa"/>
+            </w:tcMar>
+          </w:tcPr>
+          <w:p>
+            <w:r>
+              <w:rPr>
+                <w:rFonts w:ascii="Segoe UI Emoji" w:hAnsi="Segoe UI Emoji" w:eastAsia="Segoe UI Emoji" w:cs="Segoe UI Emoji"/>
+                <w:b/>
+                <w:color w:val="1b1f23"/>
+                <mc:AlternateContent>
+                  <mc:Choice Requires="w14">
+                    <w14:ligatures w14:val="standardContextual"/>
+                    <w14:numForm w14:val="oldStyle"/>
+                    <w14:numSpacing w14:val="proportional"/>
+                    <w14:cntxtAlts/>
+                  </mc:Choice>
+                </mc:AlternateContent>
+              </w:rPr>
+              <w:t xml:space="preserve">🛑</w:t>
+            </w:r>
+            <w:r>
+              <w:rPr>
+                <w:b/>
+                <w:color w:val="121212"/>
+                <mc:AlternateContent>
+                  <mc:Choice Requires="w14">
+                    <w14:ligatures w14:val="standardContextual"/>
+                    <w14:numForm w14:val="oldStyle"/>
+                    <w14:numSpacing w14:val="proportional"/>
+                    <w14:cntxtAlts/>
+                  </mc:Choice>
+                </mc:AlternateContent>
+              </w:rPr>
+              <w:t xml:space="preserve"> CAUTION</w:t>
+            </w:r>
+          </w:p>
+          <w:p>
+            <w:r>
+              <w:rPr>
+                <w:color w:val="1b1f23"/>
+                <mc:AlternateContent>
+                  <mc:Choice Requires="w14">
+                    <w14:ligatures w14:val="standardContextual"/>
+                    <w14:numForm w14:val="oldStyle"/>
+                    <w14:numSpacing w14:val="proportional"/>
+                    <w14:cntxtAlts/>
+                  </mc:Choice>
+                </mc:AlternateContent>
+              </w:rPr>
+              <w:t xml:space="preserve">Never hardcode OpenXML relationship IDs (</w:t>
+            </w:r>
+            <w:r>
+              <w:rPr>
+                <w:rFonts w:ascii="Consolas" w:hAnsi="Consolas"/>
+                <w:noProof/>
+                <w:sz w:val="20"/>
+                <w:bdr w:val="single" w:color="auto" w:sz="4" w:space="1"/>
+                <w:shd w:val="clear" w:color="auto" w:fill="auto"/>
+                <w:color w:val="1b1f23"/>
+              </w:rPr>
+              <w:t xml:space="preserve">rId1</w:t>
+            </w:r>
+            <w:r>
+              <w:rPr>
+                <w:color w:val="1b1f23"/>
+                <mc:AlternateContent>
+                  <mc:Choice Requires="w14">
+                    <w14:ligatures w14:val="standardContextual"/>
+                    <w14:numForm w14:val="oldStyle"/>
+                    <w14:numSpacing w14:val="proportional"/>
+                    <w14:cntxtAlts/>
+                  </mc:Choice>
+                </mc:AlternateContent>
+              </w:rPr>
+              <w:t xml:space="preserve">, </w:t>
+            </w:r>
+            <w:r>
+              <w:rPr>
+                <w:rFonts w:ascii="Consolas" w:hAnsi="Consolas"/>
+                <w:noProof/>
+                <w:sz w:val="20"/>
+                <w:bdr w:val="single" w:color="auto" w:sz="4" w:space="1"/>
+                <w:shd w:val="clear" w:color="auto" w:fill="auto"/>
+                <w:color w:val="1b1f23"/>
+              </w:rPr>
+              <w:t xml:space="preserve">rId2</w:t>
+            </w:r>
+            <w:r>
+              <w:rPr>
+                <w:color w:val="1b1f23"/>
+                <mc:AlternateContent>
+                  <mc:Choice Requires="w14">
+                    <w14:ligatures w14:val="standardContextual"/>
+                    <w14:numForm w14:val="oldStyle"/>
+                    <w14:numSpacing w14:val="proportional"/>
+                    <w14:cntxtAlts/>
+                  </mc:Choice>
+                </mc:AlternateContent>
+              </w:rPr>
+              <w:t xml:space="preserve">) into generated document markup.</w:t>
+            </w:r>
+          </w:p>
+        </w:tc>
+      </w:tr>
+    </w:tbl>
     <w:p>
       <w:pPr>
         <w:pBdr>
@@ -6384,7 +6135,962 @@
       <w:pPr>
         <w:pStyle w:val="Heading1"/>
       </w:pPr>
-      <w:bookmarkStart w:name="H_nested_example" w:id="29"/>
+      <w:bookmarkStart w:name="H_gemini_3_8_frontier_reasoning_tra" w:id="29"/>
+      <w:r>
+        <w:rPr>
+          <mc:AlternateContent>
+            <mc:Choice Requires="w14">
+              <w14:ligatures w14:val="standardContextual"/>
+              <w14:numForm w14:val="oldStyle"/>
+              <w14:numSpacing w14:val="proportional"/>
+              <w14:cntxtAlts/>
+            </mc:Choice>
+          </mc:AlternateContent>
+        </w:rPr>
+        <w:t xml:space="preserve">Gemini 3.8 Frontier Reasoning Trace</w:t>
+      </w:r>
+      <w:bookmarkEnd w:id="29"/>
+    </w:p>
+    <w:p>
+      <w:pPr>
+        <w:pStyle w:val="Heading4"/>
+        <w:outlineLvl w:val="3"/>
+        <w15:collapsed w:val="true"/>
+      </w:pPr>
+      <w:r>
+        <w:rPr>
+          <w:b/>
+          <w:color w:val="1B1F23"/>
+          <mc:AlternateContent>
+            <mc:Choice Requires="w14">
+              <w14:ligatures w14:val="standardContextual"/>
+              <w14:numForm w14:val="oldStyle"/>
+              <w14:numSpacing w14:val="proportional"/>
+              <w14:cntxtAlts/>
+            </mc:Choice>
+          </mc:AlternateContent>
+        </w:rPr>
+        <w:t xml:space="preserve">Gemini 3.8 Deep Reasoning &amp; Architecture Synthesis</w:t>
+      </w:r>
+    </w:p>
+    <w:p>
+      <w:pPr>
+        <w:pStyle w:val="Heading3"/>
+      </w:pPr>
+      <w:bookmarkStart w:name="H_step_1_constraint_verification" w:id="30"/>
+      <w:r>
+        <w:rPr>
+          <mc:AlternateContent>
+            <mc:Choice Requires="w14">
+              <w14:ligatures w14:val="standardContextual"/>
+              <w14:numForm w14:val="oldStyle"/>
+              <w14:numSpacing w14:val="proportional"/>
+              <w14:cntxtAlts/>
+            </mc:Choice>
+          </mc:AlternateContent>
+        </w:rPr>
+        <w:t xml:space="preserve">Step 1: Constraint Verification</w:t>
+      </w:r>
+      <w:bookmarkEnd w:id="30"/>
+    </w:p>
+    <w:p>
+      <w:r>
+        <w:rPr>
+          <mc:AlternateContent>
+            <mc:Choice Requires="w14">
+              <w14:ligatures w14:val="standardContextual"/>
+              <w14:numForm w14:val="oldStyle"/>
+              <w14:numSpacing w14:val="proportional"/>
+              <w14:cntxtAlts/>
+            </mc:Choice>
+          </mc:AlternateContent>
+        </w:rPr>
+        <w:t xml:space="preserve">Analyzing multi-tenant OpenXML generation constraints. Memory budget: </w:t>
+      </w:r>
+      <m:oMath>
+        <m:r>
+          <m:t xml:space="preserve">O</m:t>
+        </m:r>
+        <m:r>
+          <m:t xml:space="preserve">(</m:t>
+        </m:r>
+        <m:r>
+          <m:t xml:space="preserve">1</m:t>
+        </m:r>
+        <m:r>
+          <m:t xml:space="preserve">)</m:t>
+        </m:r>
+      </m:oMath>
+      <w:r>
+        <w:rPr>
+          <mc:AlternateContent>
+            <mc:Choice Requires="w14">
+              <w14:ligatures w14:val="standardContextual"/>
+              <w14:numForm w14:val="oldStyle"/>
+              <w14:numSpacing w14:val="proportional"/>
+              <w14:cntxtAlts/>
+            </mc:Choice>
+          </mc:AlternateContent>
+        </w:rPr>
+        <w:t xml:space="preserve"> SAX allocation with streaming paragraph emission.</w:t>
+      </w:r>
+    </w:p>
+    <w:p>
+      <w:pPr>
+        <w:pStyle w:val="Heading3"/>
+      </w:pPr>
+      <w:bookmarkStart w:name="H_step_2_vector_geometry_optimizati" w:id="31"/>
+      <w:r>
+        <w:rPr>
+          <mc:AlternateContent>
+            <mc:Choice Requires="w14">
+              <w14:ligatures w14:val="standardContextual"/>
+              <w14:numForm w14:val="oldStyle"/>
+              <w14:numSpacing w14:val="proportional"/>
+              <w14:cntxtAlts/>
+            </mc:Choice>
+          </mc:AlternateContent>
+        </w:rPr>
+        <w:t xml:space="preserve">Step 2: Vector Geometry Optimization</w:t>
+      </w:r>
+      <w:bookmarkEnd w:id="31"/>
+    </w:p>
+    <w:p>
+      <w:r>
+        <w:rPr>
+          <mc:AlternateContent>
+            <mc:Choice Requires="w14">
+              <w14:ligatures w14:val="standardContextual"/>
+              <w14:numForm w14:val="oldStyle"/>
+              <w14:numSpacing w14:val="proportional"/>
+              <w14:cntxtAlts/>
+            </mc:Choice>
+          </mc:AlternateContent>
+        </w:rPr>
+        <w:t xml:space="preserve">Computing affine transforms for ShapeForge DrawingML geometry:</w:t>
+      </w:r>
+    </w:p>
+    <w:p>
+      <w:pPr>
+        <w:spacing w:before="120" w:after="120"/>
+        <w:jc w:val="center"/>
+      </w:pPr>
+      <m:oMath>
+        <m:d>
+          <m:dPr>
+            <m:begChr m:val="["/>
+            <m:endChr m:val="]"/>
+          </m:dPr>
+          <m:e>
+            <m:m>
+              <m:mPr>
+                <m:plcHide m:val="1"/>
+              </m:mPr>
+              <m:mr>
+                <m:e>
+                  <m:r>
+                    <m:t xml:space="preserve">x</m:t>
+                  </m:r>
+                  <m:r>
+                    <m:t xml:space="preserve">'</m:t>
+                  </m:r>
+                </m:e>
+              </m:mr>
+              <m:mr>
+                <m:e>
+                  <m:r>
+                    <m:t xml:space="preserve">y</m:t>
+                  </m:r>
+                  <m:r>
+                    <m:t xml:space="preserve">'</m:t>
+                  </m:r>
+                </m:e>
+              </m:mr>
+            </m:m>
+          </m:e>
+        </m:d>
+        <m:r>
+          <m:t xml:space="preserve">=</m:t>
+        </m:r>
+        <m:d>
+          <m:dPr>
+            <m:begChr m:val="["/>
+            <m:endChr m:val="]"/>
+          </m:dPr>
+          <m:e>
+            <m:m>
+              <m:mPr>
+                <m:plcHide m:val="1"/>
+              </m:mPr>
+              <m:mr>
+                <m:e>
+                  <m:r>
+                    <m:rPr>
+                      <m:sty m:val="p"/>
+                    </m:rPr>
+                    <m:t xml:space="preserve">cos</m:t>
+                  </m:r>
+                  <m:r>
+                    <m:t xml:space="preserve">θ</m:t>
+                  </m:r>
+                </m:e>
+                <m:e>
+                  <m:r>
+                    <m:t xml:space="preserve">-</m:t>
+                  </m:r>
+                  <m:r>
+                    <m:rPr>
+                      <m:sty m:val="p"/>
+                    </m:rPr>
+                    <m:t xml:space="preserve">sin</m:t>
+                  </m:r>
+                  <m:r>
+                    <m:t xml:space="preserve">θ</m:t>
+                  </m:r>
+                </m:e>
+              </m:mr>
+              <m:mr>
+                <m:e>
+                  <m:r>
+                    <m:rPr>
+                      <m:sty m:val="p"/>
+                    </m:rPr>
+                    <m:t xml:space="preserve">sin</m:t>
+                  </m:r>
+                  <m:r>
+                    <m:t xml:space="preserve">θ</m:t>
+                  </m:r>
+                </m:e>
+                <m:e>
+                  <m:r>
+                    <m:rPr>
+                      <m:sty m:val="p"/>
+                    </m:rPr>
+                    <m:t xml:space="preserve">cos</m:t>
+                  </m:r>
+                  <m:r>
+                    <m:t xml:space="preserve">θ</m:t>
+                  </m:r>
+                </m:e>
+              </m:mr>
+            </m:m>
+          </m:e>
+        </m:d>
+        <m:d>
+          <m:dPr>
+            <m:begChr m:val="["/>
+            <m:endChr m:val="]"/>
+          </m:dPr>
+          <m:e>
+            <m:m>
+              <m:mPr>
+                <m:plcHide m:val="1"/>
+              </m:mPr>
+              <m:mr>
+                <m:e>
+                  <m:r>
+                    <m:t xml:space="preserve">x</m:t>
+                  </m:r>
+                </m:e>
+              </m:mr>
+              <m:mr>
+                <m:e>
+                  <m:r>
+                    <m:t xml:space="preserve">y</m:t>
+                  </m:r>
+                </m:e>
+              </m:mr>
+            </m:m>
+          </m:e>
+        </m:d>
+      </m:oMath>
+    </w:p>
+    <w:p>
+      <w:pPr>
+        <w:pStyle w:val="Heading3"/>
+      </w:pPr>
+      <w:bookmarkStart w:name="H_step_3_schema_validation" w:id="32"/>
+      <w:r>
+        <w:rPr>
+          <mc:AlternateContent>
+            <mc:Choice Requires="w14">
+              <w14:ligatures w14:val="standardContextual"/>
+              <w14:numForm w14:val="oldStyle"/>
+              <w14:numSpacing w14:val="proportional"/>
+              <w14:cntxtAlts/>
+            </mc:Choice>
+          </mc:AlternateContent>
+        </w:rPr>
+        <w:t xml:space="preserve">Step 3: Schema Validation</w:t>
+      </w:r>
+      <w:bookmarkEnd w:id="32"/>
+    </w:p>
+    <w:p>
+      <w:r>
+        <w:rPr>
+          <mc:AlternateContent>
+            <mc:Choice Requires="w14">
+              <w14:ligatures w14:val="standardContextual"/>
+              <w14:numForm w14:val="oldStyle"/>
+              <w14:numSpacing w14:val="proportional"/>
+              <w14:cntxtAlts/>
+            </mc:Choice>
+          </mc:AlternateContent>
+        </w:rPr>
+        <w:t xml:space="preserve">Confirming presence of root namespace declarations: </w:t>
+      </w:r>
+      <w:r>
+        <w:rPr>
+          <w:rFonts w:ascii="Consolas" w:hAnsi="Consolas"/>
+          <w:noProof/>
+          <w:sz w:val="20"/>
+          <w:bdr w:val="single" w:color="auto" w:sz="4" w:space="1"/>
+          <w:shd w:val="clear" w:color="auto" w:fill="auto"/>
+        </w:rPr>
+        <w:t xml:space="preserve">w:</w:t>
+      </w:r>
+      <w:r>
+        <w:rPr>
+          <mc:AlternateContent>
+            <mc:Choice Requires="w14">
+              <w14:ligatures w14:val="standardContextual"/>
+              <w14:numForm w14:val="oldStyle"/>
+              <w14:numSpacing w14:val="proportional"/>
+              <w14:cntxtAlts/>
+            </mc:Choice>
+          </mc:AlternateContent>
+        </w:rPr>
+        <w:t xml:space="preserve">, </w:t>
+      </w:r>
+      <w:r>
+        <w:rPr>
+          <w:rFonts w:ascii="Consolas" w:hAnsi="Consolas"/>
+          <w:noProof/>
+          <w:sz w:val="20"/>
+          <w:bdr w:val="single" w:color="auto" w:sz="4" w:space="1"/>
+          <w:shd w:val="clear" w:color="auto" w:fill="auto"/>
+        </w:rPr>
+        <w:t xml:space="preserve">a:</w:t>
+      </w:r>
+      <w:r>
+        <w:rPr>
+          <mc:AlternateContent>
+            <mc:Choice Requires="w14">
+              <w14:ligatures w14:val="standardContextual"/>
+              <w14:numForm w14:val="oldStyle"/>
+              <w14:numSpacing w14:val="proportional"/>
+              <w14:cntxtAlts/>
+            </mc:Choice>
+          </mc:AlternateContent>
+        </w:rPr>
+        <w:t xml:space="preserve">, </w:t>
+      </w:r>
+      <w:r>
+        <w:rPr>
+          <w:rFonts w:ascii="Consolas" w:hAnsi="Consolas"/>
+          <w:noProof/>
+          <w:sz w:val="20"/>
+          <w:bdr w:val="single" w:color="auto" w:sz="4" w:space="1"/>
+          <w:shd w:val="clear" w:color="auto" w:fill="auto"/>
+        </w:rPr>
+        <w:t xml:space="preserve">wp:</w:t>
+      </w:r>
+      <w:r>
+        <w:rPr>
+          <mc:AlternateContent>
+            <mc:Choice Requires="w14">
+              <w14:ligatures w14:val="standardContextual"/>
+              <w14:numForm w14:val="oldStyle"/>
+              <w14:numSpacing w14:val="proportional"/>
+              <w14:cntxtAlts/>
+            </mc:Choice>
+          </mc:AlternateContent>
+        </w:rPr>
+        <w:t xml:space="preserve">, </w:t>
+      </w:r>
+      <w:r>
+        <w:rPr>
+          <w:rFonts w:ascii="Consolas" w:hAnsi="Consolas"/>
+          <w:noProof/>
+          <w:sz w:val="20"/>
+          <w:bdr w:val="single" w:color="auto" w:sz="4" w:space="1"/>
+          <w:shd w:val="clear" w:color="auto" w:fill="auto"/>
+        </w:rPr>
+        <w:t xml:space="preserve">pic:</w:t>
+      </w:r>
+      <w:r>
+        <w:rPr>
+          <mc:AlternateContent>
+            <mc:Choice Requires="w14">
+              <w14:ligatures w14:val="standardContextual"/>
+              <w14:numForm w14:val="oldStyle"/>
+              <w14:numSpacing w14:val="proportional"/>
+              <w14:cntxtAlts/>
+            </mc:Choice>
+          </mc:AlternateContent>
+        </w:rPr>
+        <w:t xml:space="preserve">, </w:t>
+      </w:r>
+      <w:r>
+        <w:rPr>
+          <w:rFonts w:ascii="Consolas" w:hAnsi="Consolas"/>
+          <w:noProof/>
+          <w:sz w:val="20"/>
+          <w:bdr w:val="single" w:color="auto" w:sz="4" w:space="1"/>
+          <w:shd w:val="clear" w:color="auto" w:fill="auto"/>
+        </w:rPr>
+        <w:t xml:space="preserve">m:</w:t>
+      </w:r>
+      <w:r>
+        <w:rPr>
+          <mc:AlternateContent>
+            <mc:Choice Requires="w14">
+              <w14:ligatures w14:val="standardContextual"/>
+              <w14:numForm w14:val="oldStyle"/>
+              <w14:numSpacing w14:val="proportional"/>
+              <w14:cntxtAlts/>
+            </mc:Choice>
+          </mc:AlternateContent>
+        </w:rPr>
+        <w:t xml:space="preserve">, </w:t>
+      </w:r>
+      <w:r>
+        <w:rPr>
+          <w:rFonts w:ascii="Consolas" w:hAnsi="Consolas"/>
+          <w:noProof/>
+          <w:sz w:val="20"/>
+          <w:bdr w:val="single" w:color="auto" w:sz="4" w:space="1"/>
+          <w:shd w:val="clear" w:color="auto" w:fill="auto"/>
+        </w:rPr>
+        <w:t xml:space="preserve">wpg:</w:t>
+      </w:r>
+      <w:r>
+        <w:rPr>
+          <mc:AlternateContent>
+            <mc:Choice Requires="w14">
+              <w14:ligatures w14:val="standardContextual"/>
+              <w14:numForm w14:val="oldStyle"/>
+              <w14:numSpacing w14:val="proportional"/>
+              <w14:cntxtAlts/>
+            </mc:Choice>
+          </mc:AlternateContent>
+        </w:rPr>
+        <w:t xml:space="preserve">, </w:t>
+      </w:r>
+      <w:r>
+        <w:rPr>
+          <w:rFonts w:ascii="Consolas" w:hAnsi="Consolas"/>
+          <w:noProof/>
+          <w:sz w:val="20"/>
+          <w:bdr w:val="single" w:color="auto" w:sz="4" w:space="1"/>
+          <w:shd w:val="clear" w:color="auto" w:fill="auto"/>
+        </w:rPr>
+        <w:t xml:space="preserve">wps:</w:t>
+      </w:r>
+      <w:r>
+        <w:rPr>
+          <mc:AlternateContent>
+            <mc:Choice Requires="w14">
+              <w14:ligatures w14:val="standardContextual"/>
+              <w14:numForm w14:val="oldStyle"/>
+              <w14:numSpacing w14:val="proportional"/>
+              <w14:cntxtAlts/>
+            </mc:Choice>
+          </mc:AlternateContent>
+        </w:rPr>
+        <w:t xml:space="preserve">, </w:t>
+      </w:r>
+      <w:r>
+        <w:rPr>
+          <w:rFonts w:ascii="Consolas" w:hAnsi="Consolas"/>
+          <w:noProof/>
+          <w:sz w:val="20"/>
+          <w:bdr w:val="single" w:color="auto" w:sz="4" w:space="1"/>
+          <w:shd w:val="clear" w:color="auto" w:fill="auto"/>
+        </w:rPr>
+        <w:t xml:space="preserve">w15:</w:t>
+      </w:r>
+      <w:r>
+        <w:rPr>
+          <mc:AlternateContent>
+            <mc:Choice Requires="w14">
+              <w14:ligatures w14:val="standardContextual"/>
+              <w14:numForm w14:val="oldStyle"/>
+              <w14:numSpacing w14:val="proportional"/>
+              <w14:cntxtAlts/>
+            </mc:Choice>
+          </mc:AlternateContent>
+        </w:rPr>
+        <w:t xml:space="preserve">. All required structures compiled.</w:t>
+      </w:r>
+    </w:p>
+    <w:p>
+      <w:pPr>
+        <w:pBdr>
+          <w:bottom w:val="wave" w:color="D1D5DA" w:sz="6" w:space="1"/>
+        </w:pBdr>
+      </w:pPr>
+    </w:p>
+    <w:p>
+      <w:pPr>
+        <w:pStyle w:val="Heading1"/>
+      </w:pPr>
+      <w:bookmarkStart w:name="H_code_interpreter_execution_card" w:id="33"/>
+      <w:r>
+        <w:rPr>
+          <mc:AlternateContent>
+            <mc:Choice Requires="w14">
+              <w14:ligatures w14:val="standardContextual"/>
+              <w14:numForm w14:val="oldStyle"/>
+              <w14:numSpacing w14:val="proportional"/>
+              <w14:cntxtAlts/>
+            </mc:Choice>
+          </mc:AlternateContent>
+        </w:rPr>
+        <w:t xml:space="preserve">Code Interpreter Execution Card</w:t>
+      </w:r>
+      <w:bookmarkEnd w:id="33"/>
+    </w:p>
+    <w:p>
+      <w:pPr>
+        <w:pStyle w:val="MSCode_output"/>
+        <w:keepLines/>
+        <w:pBdr>
+          <w:top w:val="single" w:color="D1D5DA" w:sz="4" w:space="4"/>
+          <w:left w:val="single" w:color="000000" w:sz="12" w:space="4"/>
+          <w:bottom w:val="single" w:color="D1D5DA" w:sz="4" w:space="4"/>
+          <w:right w:val="single" w:color="D1D5DA" w:sz="4" w:space="4"/>
+        </w:pBdr>
+        <w:shd w:val="clear" w:color="auto" w:fill="F6F8FA"/>
+        <w:wordWrap w:val="false"/>
+        <w:spacing w:before="60" w:after="60" w:line="240" w:lineRule="auto"/>
+      </w:pPr>
+      <w:r>
+        <w:rPr>
+          <w:rFonts w:ascii="Consolas" w:hAnsi="Consolas"/>
+          <w:noProof/>
+          <w:color w:val="f6f8fa"/>
+        </w:rPr>
+        <w:t xml:space="preserve">[MarkSmith Kernel]: Document compiled successfully in 38ms.</w:t>
+        <w:br/>
+        <w:t xml:space="preserve">[Diagnostics]: 0 schema violations, 14 vector shapes synthesized.</w:t>
+        <w:br/>
+        <w:t xml:space="preserve">[Memory Profile]: 18.2 MB heap allocation, O(1) streaming SAX pipeline.</w:t>
+      </w:r>
+    </w:p>
+    <w:p>
+      <w:pPr>
+        <w:pBdr>
+          <w:bottom w:val="wave" w:color="D1D5DA" w:sz="6" w:space="1"/>
+        </w:pBdr>
+      </w:pPr>
+    </w:p>
+    <w:p>
+      <w:pPr>
+        <w:pStyle w:val="Heading1"/>
+      </w:pPr>
+      <w:bookmarkStart w:name="H_multi_column_layout" w:id="34"/>
+      <w:r>
+        <w:rPr>
+          <mc:AlternateContent>
+            <mc:Choice Requires="w14">
+              <w14:ligatures w14:val="standardContextual"/>
+              <w14:numForm w14:val="oldStyle"/>
+              <w14:numSpacing w14:val="proportional"/>
+              <w14:cntxtAlts/>
+            </mc:Choice>
+          </mc:AlternateContent>
+        </w:rPr>
+        <w:t xml:space="preserve">Multi-Column Layout</w:t>
+      </w:r>
+      <w:bookmarkEnd w:id="34"/>
+    </w:p>
+    <w:p>
+      <w:pPr>
+        <w:sectPr>
+          <w:type w:val="continuous"/>
+          <w:cols w:equalWidth="true" w:space="720" w:num="2"/>
+        </w:sectPr>
+      </w:pPr>
+    </w:p>
+    <w:p>
+      <w:pPr>
+        <w:pStyle w:val="Heading3"/>
+      </w:pPr>
+      <w:r>
+        <w:rPr>
+          <mc:AlternateContent>
+            <mc:Choice Requires="w14">
+              <w14:ligatures w14:val="standardContextual"/>
+              <w14:numForm w14:val="oldStyle"/>
+              <w14:numSpacing w14:val="proportional"/>
+              <w14:cntxtAlts/>
+            </mc:Choice>
+          </mc:AlternateContent>
+        </w:rPr>
+        <w:t xml:space="preserve">Architecture Advantages</w:t>
+      </w:r>
+    </w:p>
+    <w:p>
+      <w:pPr>
+        <w:numPr>
+          <w:ilvl w:val="0"/>
+          <w:numId w:val="1"/>
+        </w:numPr>
+        <w:contextualSpacing/>
+      </w:pPr>
+      <w:r>
+        <w:rPr>
+          <w:b/>
+          <mc:AlternateContent>
+            <mc:Choice Requires="w14">
+              <w14:ligatures w14:val="standardContextual"/>
+              <w14:numForm w14:val="oldStyle"/>
+              <w14:numSpacing w14:val="proportional"/>
+              <w14:cntxtAlts/>
+            </mc:Choice>
+          </mc:AlternateContent>
+        </w:rPr>
+        <w:t xml:space="preserve">Pure .NET Core Engine</w:t>
+      </w:r>
+      <w:r>
+        <w:rPr>
+          <mc:AlternateContent>
+            <mc:Choice Requires="w14">
+              <w14:ligatures w14:val="standardContextual"/>
+              <w14:numForm w14:val="oldStyle"/>
+              <w14:numSpacing w14:val="proportional"/>
+              <w14:cntxtAlts/>
+            </mc:Choice>
+          </mc:AlternateContent>
+        </w:rPr>
+        <w:t xml:space="preserve">: Runs anywhere .NET 8 runs.</w:t>
+      </w:r>
+    </w:p>
+    <w:p>
+      <w:pPr>
+        <w:numPr>
+          <w:ilvl w:val="0"/>
+          <w:numId w:val="1"/>
+        </w:numPr>
+        <w:contextualSpacing/>
+      </w:pPr>
+      <w:r>
+        <w:rPr>
+          <w:b/>
+          <mc:AlternateContent>
+            <mc:Choice Requires="w14">
+              <w14:ligatures w14:val="standardContextual"/>
+              <w14:numForm w14:val="oldStyle"/>
+              <w14:numSpacing w14:val="proportional"/>
+              <w14:cntxtAlts/>
+            </mc:Choice>
+          </mc:AlternateContent>
+        </w:rPr>
+        <w:t xml:space="preserve">Mathematical Layout Solver</w:t>
+      </w:r>
+      <w:r>
+        <w:rPr>
+          <mc:AlternateContent>
+            <mc:Choice Requires="w14">
+              <w14:ligatures w14:val="standardContextual"/>
+              <w14:numForm w14:val="oldStyle"/>
+              <w14:numSpacing w14:val="proportional"/>
+              <w14:cntxtAlts/>
+            </mc:Choice>
+          </mc:AlternateContent>
+        </w:rPr>
+        <w:t xml:space="preserve">: Precise bounding box calculations.</w:t>
+      </w:r>
+    </w:p>
+    <w:p>
+      <w:pPr>
+        <w:numPr>
+          <w:ilvl w:val="0"/>
+          <w:numId w:val="1"/>
+        </w:numPr>
+        <w:contextualSpacing/>
+      </w:pPr>
+      <w:r>
+        <w:rPr>
+          <w:b/>
+          <mc:AlternateContent>
+            <mc:Choice Requires="w14">
+              <w14:ligatures w14:val="standardContextual"/>
+              <w14:numForm w14:val="oldStyle"/>
+              <w14:numSpacing w14:val="proportional"/>
+              <w14:cntxtAlts/>
+            </mc:Choice>
+          </mc:AlternateContent>
+        </w:rPr>
+        <w:t xml:space="preserve">Native OMML Equations</w:t>
+      </w:r>
+      <w:r>
+        <w:rPr>
+          <mc:AlternateContent>
+            <mc:Choice Requires="w14">
+              <w14:ligatures w14:val="standardContextual"/>
+              <w14:numForm w14:val="oldStyle"/>
+              <w14:numSpacing w14:val="proportional"/>
+              <w14:cntxtAlts/>
+            </mc:Choice>
+          </mc:AlternateContent>
+        </w:rPr>
+        <w:t xml:space="preserve">: Direct math editor integration.</w:t>
+      </w:r>
+    </w:p>
+    <w:p>
+      <w:pPr>
+        <w:pStyle w:val="Heading3"/>
+      </w:pPr>
+      <w:r>
+        <w:rPr>
+          <mc:AlternateContent>
+            <mc:Choice Requires="w14">
+              <w14:ligatures w14:val="standardContextual"/>
+              <w14:numForm w14:val="oldStyle"/>
+              <w14:numSpacing w14:val="proportional"/>
+              <w14:cntxtAlts/>
+            </mc:Choice>
+          </mc:AlternateContent>
+        </w:rPr>
+        <w:t xml:space="preserve">Enterprise Compliance</w:t>
+      </w:r>
+    </w:p>
+    <w:p>
+      <w:pPr>
+        <w:numPr>
+          <w:ilvl w:val="0"/>
+          <w:numId w:val="1"/>
+        </w:numPr>
+        <w:contextualSpacing/>
+      </w:pPr>
+      <w:r>
+        <w:rPr>
+          <w:b/>
+          <mc:AlternateContent>
+            <mc:Choice Requires="w14">
+              <w14:ligatures w14:val="standardContextual"/>
+              <w14:numForm w14:val="oldStyle"/>
+              <w14:numSpacing w14:val="proportional"/>
+              <w14:cntxtAlts/>
+            </mc:Choice>
+          </mc:AlternateContent>
+        </w:rPr>
+        <w:t xml:space="preserve">Zero-Installation Footprint</w:t>
+      </w:r>
+      <w:r>
+        <w:rPr>
+          <mc:AlternateContent>
+            <mc:Choice Requires="w14">
+              <w14:ligatures w14:val="standardContextual"/>
+              <w14:numForm w14:val="oldStyle"/>
+              <w14:numSpacing w14:val="proportional"/>
+              <w14:cntxtAlts/>
+            </mc:Choice>
+          </mc:AlternateContent>
+        </w:rPr>
+        <w:t xml:space="preserve">: No Microsoft Office license on server.</w:t>
+      </w:r>
+    </w:p>
+    <w:p>
+      <w:pPr>
+        <w:numPr>
+          <w:ilvl w:val="0"/>
+          <w:numId w:val="1"/>
+        </w:numPr>
+        <w:contextualSpacing/>
+      </w:pPr>
+      <w:r>
+        <w:rPr>
+          <w:b/>
+          <mc:AlternateContent>
+            <mc:Choice Requires="w14">
+              <w14:ligatures w14:val="standardContextual"/>
+              <w14:numForm w14:val="oldStyle"/>
+              <w14:numSpacing w14:val="proportional"/>
+              <w14:cntxtAlts/>
+            </mc:Choice>
+          </mc:AlternateContent>
+        </w:rPr>
+        <w:t xml:space="preserve">WCAG 2.1 AA Contrast</w:t>
+      </w:r>
+      <w:r>
+        <w:rPr>
+          <mc:AlternateContent>
+            <mc:Choice Requires="w14">
+              <w14:ligatures w14:val="standardContextual"/>
+              <w14:numForm w14:val="oldStyle"/>
+              <w14:numSpacing w14:val="proportional"/>
+              <w14:cntxtAlts/>
+            </mc:Choice>
+          </mc:AlternateContent>
+        </w:rPr>
+        <w:t xml:space="preserve">: Guaranteed legible text ratios.</w:t>
+      </w:r>
+    </w:p>
+    <w:p>
+      <w:pPr>
+        <w:numPr>
+          <w:ilvl w:val="0"/>
+          <w:numId w:val="1"/>
+        </w:numPr>
+        <w:contextualSpacing/>
+      </w:pPr>
+      <w:r>
+        <w:rPr>
+          <w:b/>
+          <mc:AlternateContent>
+            <mc:Choice Requires="w14">
+              <w14:ligatures w14:val="standardContextual"/>
+              <w14:numForm w14:val="oldStyle"/>
+              <w14:numSpacing w14:val="proportional"/>
+              <w14:cntxtAlts/>
+            </mc:Choice>
+          </mc:AlternateContent>
+        </w:rPr>
+        <w:t xml:space="preserve">DLP Protection</w:t>
+      </w:r>
+      <w:r>
+        <w:rPr>
+          <mc:AlternateContent>
+            <mc:Choice Requires="w14">
+              <w14:ligatures w14:val="standardContextual"/>
+              <w14:numForm w14:val="oldStyle"/>
+              <w14:numSpacing w14:val="proportional"/>
+              <w14:cntxtAlts/>
+            </mc:Choice>
+          </mc:AlternateContent>
+        </w:rPr>
+        <w:t xml:space="preserve">: Offline AST transformation.</w:t>
+      </w:r>
+    </w:p>
+    <w:p>
+      <w:pPr>
+        <w:sectPr>
+          <w:type w:val="continuous"/>
+          <w:cols w:equalWidth="true" w:num="1"/>
+        </w:sectPr>
+      </w:pPr>
+    </w:p>
+    <w:p>
+      <w:pPr>
+        <w:pBdr>
+          <w:bottom w:val="wave" w:color="D1D5DA" w:sz="6" w:space="1"/>
+        </w:pBdr>
+      </w:pPr>
+    </w:p>
+    <w:p>
+      <w:pPr>
+        <w:pStyle w:val="Heading1"/>
+      </w:pPr>
+      <w:bookmarkStart w:name="H_hyperlinked_research_citations" w:id="35"/>
+      <w:r>
+        <w:rPr>
+          <mc:AlternateContent>
+            <mc:Choice Requires="w14">
+              <w14:ligatures w14:val="standardContextual"/>
+              <w14:numForm w14:val="oldStyle"/>
+              <w14:numSpacing w14:val="proportional"/>
+              <w14:cntxtAlts/>
+            </mc:Choice>
+          </mc:AlternateContent>
+        </w:rPr>
+        <w:t xml:space="preserve">Hyperlinked Research Citations</w:t>
+      </w:r>
+      <w:bookmarkEnd w:id="35"/>
+    </w:p>
+    <w:p>
+      <w:r>
+        <w:rPr>
+          <mc:AlternateContent>
+            <mc:Choice Requires="w14">
+              <w14:ligatures w14:val="standardContextual"/>
+              <w14:numForm w14:val="oldStyle"/>
+              <w14:numSpacing w14:val="proportional"/>
+              <w14:cntxtAlts/>
+            </mc:Choice>
+          </mc:AlternateContent>
+        </w:rPr>
+        <w:t xml:space="preserve">MarkSmith leverages the OpenXML SDK for high-performance document generation</w:t>
+      </w:r>
+      <w:bookmarkStart w:name="_fnref_2" w:id="36"/>
+      <w:bookmarkEnd w:id="36"/>
+      <w:hyperlink w:history="true" w:anchor="_fn_2">
+        <w:r>
+          <w:rPr>
+            <w:color w:val="0563C1"/>
+            <w:vertAlign w:val="superscript"/>
+            <mc:AlternateContent>
+              <mc:Choice Requires="w14">
+                <w14:ligatures w14:val="standardContextual"/>
+                <w14:numForm w14:val="oldStyle"/>
+                <w14:numSpacing w14:val="proportional"/>
+                <w14:cntxtAlts/>
+              </mc:Choice>
+            </mc:AlternateContent>
+          </w:rPr>
+          <w:t xml:space="preserve">[2]</w:t>
+        </w:r>
+      </w:hyperlink>
+      <w:r>
+        <w:rPr>
+          <mc:AlternateContent>
+            <mc:Choice Requires="w14">
+              <w14:ligatures w14:val="standardContextual"/>
+              <w14:numForm w14:val="oldStyle"/>
+              <w14:numSpacing w14:val="proportional"/>
+              <w14:cntxtAlts/>
+            </mc:Choice>
+          </mc:AlternateContent>
+        </w:rPr>
+        <w:t xml:space="preserve">, eliminating the need for Office interop</w:t>
+      </w:r>
+      <w:bookmarkStart w:name="_fnref_3" w:id="37"/>
+      <w:bookmarkEnd w:id="37"/>
+      <w:hyperlink w:history="true" w:anchor="_fn_3">
+        <w:r>
+          <w:rPr>
+            <w:color w:val="0563C1"/>
+            <w:vertAlign w:val="superscript"/>
+            <mc:AlternateContent>
+              <mc:Choice Requires="w14">
+                <w14:ligatures w14:val="standardContextual"/>
+                <w14:numForm w14:val="oldStyle"/>
+                <w14:numSpacing w14:val="proportional"/>
+                <w14:cntxtAlts/>
+              </mc:Choice>
+            </mc:AlternateContent>
+          </w:rPr>
+          <w:t xml:space="preserve">[3]</w:t>
+        </w:r>
+      </w:hyperlink>
+      <w:r>
+        <w:rPr>
+          <mc:AlternateContent>
+            <mc:Choice Requires="w14">
+              <w14:ligatures w14:val="standardContextual"/>
+              <w14:numForm w14:val="oldStyle"/>
+              <w14:numSpacing w14:val="proportional"/>
+              <w14:cntxtAlts/>
+            </mc:Choice>
+          </mc:AlternateContent>
+        </w:rPr>
+        <w:t xml:space="preserve">.</w:t>
+      </w:r>
+    </w:p>
+    <w:p>
+      <w:pPr>
+        <w:pBdr>
+          <w:bottom w:val="wave" w:color="D1D5DA" w:sz="6" w:space="1"/>
+        </w:pBdr>
+      </w:pPr>
+    </w:p>
+    <w:p>
+      <w:pPr>
+        <w:pStyle w:val="Heading1"/>
+      </w:pPr>
+      <w:bookmarkStart w:name="H_nested_example" w:id="38"/>
       <w:r>
         <w:rPr>
           <mc:AlternateContent>
@@ -6398,7 +7104,7 @@
         </w:rPr>
         <w:t xml:space="preserve">Nested Example</w:t>
       </w:r>
-      <w:bookmarkEnd w:id="29"/>
+      <w:bookmarkEnd w:id="38"/>
     </w:p>
     <w:p>
       <w:pPr>
@@ -6409,7 +7115,7 @@
         <w:shd w:val="clear" w:color="auto" w:fill="F6F8FA"/>
         <w:ind w:left="360"/>
       </w:pPr>
-      <w:bookmarkStart w:name="H_quarterly_milestone_summary" w:id="30"/>
+      <w:bookmarkStart w:name="H_quarterly_milestone_summary" w:id="39"/>
       <w:r>
         <w:rPr>
           <mc:AlternateContent>
@@ -6423,7 +7129,7 @@
         </w:rPr>
         <w:t xml:space="preserve">Quarterly Milestone Summary</w:t>
       </w:r>
-      <w:bookmarkEnd w:id="30"/>
+      <w:bookmarkEnd w:id="39"/>
     </w:p>
     <w:p>
       <w:pPr>
@@ -6517,6 +7223,12 @@
           <w:insideH w:val="single" w:color="D1D5DA" w:sz="6"/>
           <w:insideV w:val="single" w:color="D1D5DA" w:sz="6"/>
         </w:tblBorders>
+        <w:tblCellMar>
+          <w:top w:w="120" w:type="dxa"/>
+          <w:bottom w:w="120" w:type="dxa"/>
+          <w:left w:w="180" w:type="dxa"/>
+          <w:right w:w="180" w:type="dxa"/>
+        </w:tblCellMar>
       </w:tblPr>
       <w:tblGrid>
         <w:gridCol/>
@@ -6818,7 +7530,112 @@
       </w:pPr>
     </w:p>
     <w:p>
-      <w:bookmarkStart w:name="_fn_1" w:id="32"/>
+      <w:pPr>
+        <w:pBdr>
+          <w:bottom w:val="wave" w:color="D1D5DA" w:sz="6" w:space="1"/>
+        </w:pBdr>
+      </w:pPr>
+    </w:p>
+    <w:p>
+      <w:pPr>
+        <w:pStyle w:val="Heading2"/>
+      </w:pPr>
+      <w:bookmarkStart w:name="H_references" w:id="40"/>
+      <w:r>
+        <w:rPr>
+          <mc:AlternateContent>
+            <mc:Choice Requires="w14">
+              <w14:ligatures w14:val="standardContextual"/>
+              <w14:numForm w14:val="oldStyle"/>
+              <w14:numSpacing w14:val="proportional"/>
+              <w14:cntxtAlts/>
+            </mc:Choice>
+          </mc:AlternateContent>
+        </w:rPr>
+        <w:t xml:space="preserve">References</w:t>
+      </w:r>
+      <w:bookmarkEnd w:id="40"/>
+    </w:p>
+    <w:p>
+      <w:pPr>
+        <w:numPr>
+          <w:ilvl w:val="0"/>
+          <w:numId w:val="4"/>
+        </w:numPr>
+        <w:contextualSpacing/>
+      </w:pPr>
+      <w:hyperlink r:id="R26fad0782a0e463f">
+        <w:r>
+          <w:rPr>
+            <w:color w:val="0563C1"/>
+            <w:u w:val="single"/>
+            <mc:AlternateContent>
+              <mc:Choice Requires="w14">
+                <w14:ligatures w14:val="standardContextual"/>
+                <w14:numForm w14:val="oldStyle"/>
+                <w14:numSpacing w14:val="proportional"/>
+                <w14:cntxtAlts/>
+              </mc:Choice>
+            </mc:AlternateContent>
+          </w:rPr>
+          <w:t xml:space="preserve">ECMA-376 Specification</w:t>
+        </w:r>
+      </w:hyperlink>
+    </w:p>
+    <w:p>
+      <w:pPr>
+        <w:numPr>
+          <w:ilvl w:val="0"/>
+          <w:numId w:val="4"/>
+        </w:numPr>
+        <w:contextualSpacing/>
+      </w:pPr>
+      <w:hyperlink r:id="Rebb4e2243e474fe5">
+        <w:r>
+          <w:rPr>
+            <w:color w:val="0563C1"/>
+            <w:u w:val="single"/>
+            <mc:AlternateContent>
+              <mc:Choice Requires="w14">
+                <w14:ligatures w14:val="standardContextual"/>
+                <w14:numForm w14:val="oldStyle"/>
+                <w14:numSpacing w14:val="proportional"/>
+                <w14:cntxtAlts/>
+              </mc:Choice>
+            </mc:AlternateContent>
+          </w:rPr>
+          <w:t xml:space="preserve">OpenXML SDK GitHub Repository</w:t>
+        </w:r>
+      </w:hyperlink>
+    </w:p>
+    <w:p>
+      <w:pPr>
+        <w:numPr>
+          <w:ilvl w:val="0"/>
+          <w:numId w:val="4"/>
+        </w:numPr>
+        <w:contextualSpacing/>
+      </w:pPr>
+      <w:hyperlink r:id="Re7844764dbd64fe8">
+        <w:r>
+          <w:rPr>
+            <w:color w:val="0563C1"/>
+            <w:u w:val="single"/>
+            <mc:AlternateContent>
+              <mc:Choice Requires="w14">
+                <w14:ligatures w14:val="standardContextual"/>
+                <w14:numForm w14:val="oldStyle"/>
+                <w14:numSpacing w14:val="proportional"/>
+                <w14:cntxtAlts/>
+              </mc:Choice>
+            </mc:AlternateContent>
+          </w:rPr>
+          <w:t xml:space="preserve">MarkSmith Official Documentation</w:t>
+        </w:r>
+      </w:hyperlink>
+    </w:p>
+    <w:p>
+      <w:bookmarkStart w:name="_fn_1" w:id="43"/>
       <w:hyperlink w:history="true" w:anchor="_fnref_1">
         <w:r>
           <w:rPr>
@@ -6836,7 +7653,7 @@
           <w:t xml:space="preserve">[1] </w:t>
         </w:r>
       </w:hyperlink>
-      <w:bookmarkEnd w:id="32"/>
+      <w:bookmarkEnd w:id="43"/>
       <w:r>
         <w:rPr>
           <mc:AlternateContent>
@@ -6850,8 +7667,8 @@
         </w:rPr>
         <w:t xml:space="preserve">This is the footnote text compiled into Word's native footnote collection.</w:t>
       </w:r>
-      <w:bookmarkStart w:name="_fnref_1" w:id="31"/>
-      <w:bookmarkEnd w:id="31"/>
+      <w:bookmarkStart w:name="_fnref_1" w:id="41"/>
+      <w:bookmarkEnd w:id="41"/>
       <w:hyperlink w:history="true" w:anchor="_fn_1">
         <w:r>
           <w:rPr>
@@ -6869,6 +7686,25 @@
           <w:t xml:space="preserve">[1]</w:t>
         </w:r>
       </w:hyperlink>
+      <w:bookmarkStart w:name="_fnref_2" w:id="42"/>
+      <w:bookmarkEnd w:id="42"/>
+      <w:hyperlink w:history="true" w:anchor="_fn_2">
+        <w:r>
+          <w:rPr>
+            <w:color w:val="0563C1"/>
+            <w:vertAlign w:val="superscript"/>
+            <mc:AlternateContent>
+              <mc:Choice Requires="w14">
+                <w14:ligatures w14:val="standardContextual"/>
+                <w14:numForm w14:val="oldStyle"/>
+                <w14:numSpacing w14:val="proportional"/>
+                <w14:cntxtAlts/>
+              </mc:Choice>
+            </mc:AlternateContent>
+          </w:rPr>
+          <w:t xml:space="preserve">[2]</w:t>
+        </w:r>
+      </w:hyperlink>
       <w:hyperlink w:history="true" w:anchor="_fnref_1">
         <w:r>
           <w:rPr>
@@ -6882,11 +7718,17 @@
               </mc:Choice>
             </mc:AlternateContent>
           </w:rPr>
-          <w:t xml:space="preserve"> </w:t>
+          <w:t xml:space="preserve"> ↩</w:t>
         </w:r>
+      </w:hyperlink>
+    </w:p>
+    <w:p>
+      <w:bookmarkStart w:name="_fn_2" w:id="45"/>
+      <w:hyperlink w:history="true" w:anchor="_fnref_2">
         <w:r>
           <w:rPr>
-            <w:rFonts w:ascii="Segoe UI Emoji" w:hAnsi="Segoe UI Emoji" w:eastAsia="Segoe UI Emoji" w:cs="Segoe UI Emoji"/>
+            <w:b/>
+            <w:color w:val="0563C1"/>
             <mc:AlternateContent>
               <mc:Choice Requires="w14">
                 <w14:ligatures w14:val="standardContextual"/>
@@ -6896,13 +7738,62 @@
               </mc:Choice>
             </mc:AlternateContent>
           </w:rPr>
-          <w:t xml:space="preserve">↩</w:t>
+          <w:t xml:space="preserve">[2] </w:t>
         </w:r>
       </w:hyperlink>
+      <w:bookmarkEnd w:id="45"/>
+      <w:r>
+        <w:rPr>
+          <mc:AlternateContent>
+            <mc:Choice Requires="w14">
+              <w14:ligatures w14:val="standardContextual"/>
+              <w14:numForm w14:val="oldStyle"/>
+              <w14:numSpacing w14:val="proportional"/>
+              <w14:cntxtAlts/>
+            </mc:Choice>
+          </mc:AlternateContent>
+        </w:rPr>
+        <w:t xml:space="preserve">Microsoft Knowledge Base: Considerations for server-side Automation of Office.</w:t>
+      </w:r>
+      <w:bookmarkStart w:name="_fnref_3" w:id="44"/>
+      <w:bookmarkEnd w:id="44"/>
+      <w:hyperlink w:history="true" w:anchor="_fn_3">
+        <w:r>
+          <w:rPr>
+            <w:color w:val="0563C1"/>
+            <w:vertAlign w:val="superscript"/>
+            <mc:AlternateContent>
+              <mc:Choice Requires="w14">
+                <w14:ligatures w14:val="standardContextual"/>
+                <w14:numForm w14:val="oldStyle"/>
+                <w14:numSpacing w14:val="proportional"/>
+                <w14:cntxtAlts/>
+              </mc:Choice>
+            </mc:AlternateContent>
+          </w:rPr>
+          <w:t xml:space="preserve">[3]</w:t>
+        </w:r>
+      </w:hyperlink>
+      <w:hyperlink w:history="true" w:anchor="_fnref_2">
+        <w:r>
+          <w:rPr>
+            <w:color w:val="0563C1"/>
+            <mc:AlternateContent>
+              <mc:Choice Requires="w14">
+                <w14:ligatures w14:val="standardContextual"/>
+                <w14:numForm w14:val="oldStyle"/>
+                <w14:numSpacing w14:val="proportional"/>
+                <w14:cntxtAlts/>
+              </mc:Choice>
+            </mc:AlternateContent>
+          </w:rPr>
+          <w:t xml:space="preserve"> ↩</w:t>
+        </w:r>
+      </w:hyperlink>
     </w:p>
     <w:sectPr>
-      <w:headerReference xmlns:r="http://schemas.openxmlformats.org/officeDocument/2006/relationships" w:type="default" r:id="R946883944b8a4db9"/>
-      <w:footerReference xmlns:r="http://schemas.openxmlformats.org/officeDocument/2006/relationships" w:type="default" r:id="R113eaec6fed348da"/>
+      <w:headerReference w:type="default" r:id="Rd76f00fb7d0648e5"/>
+      <w:footerReference w:type="default" r:id="R0170e8f2c034419e"/>
       <w:pgSz w:w="11906" w:h="16838"/>
       <w:pgMar w:top="1440" w:right="1440" w:bottom="1440" w:left="1440" w:header="576" w:footer="576" w:gutter="0"/>
     </w:sectPr>
@@ -7165,6 +8056,12 @@
   <w:num w:numId="3">
     <w:abstractNumId w:val="1"/>
     <w:lvlOverride w:ilvl="1">
+      <w:startOverride w:val="1"/>
+    </w:lvlOverride>
+  </w:num>
+  <w:num w:numId="4">
+    <w:abstractNumId w:val="1"/>
+    <w:lvlOverride w:ilvl="0">
       <w:startOverride w:val="1"/>
     </w:lvlOverride>
   </w:num>
@@ -7334,7 +8231,7 @@
 </file>
 
 <file path=customXml/item.xml><?xml version="1.0" encoding="utf-8"?>
-<marksmithSource schema="marksmith-source-v1" version="3.1.0.0" exportedUtc="2026-09-02T20:41:57.4123460Z" theme="GitHub Light" mermaidMode="1">
+<marksmithSource schema="marksmith-source-v1" version="3.1.0.0" exportedUtc="2026-09-03T02:16:04.4248315Z" theme="GitHub Light" mermaidMode="1">
   <markdown><![CDATA[# Massive Markdown Showcase
 A comprehensive demonstration of Markdown syntax and extensions compiled to native ECMA-376 Microsoft Word OpenXML by **MarkSmith**.
 ---
@@ -7539,6 +8436,60 @@
 > Everything here compiles to native Word elements — no blurred screenshot images.
 > [!IMPORTANT]
 > MarkSmith embeds the exact Markdown source in a private Custom XML part (`customXml/item1.xml`) for lossless round-tripping.
+> [!WARNING]
+> Legacy COM Word automation is vulnerable to server deadlocks and memory handle leaks under enterprise workloads.
+> [!CAUTION]
+> Never hardcode OpenXML relationship IDs (`rId1`, `rId2`) into generated document markup.
+---
+# Gemini 3.8 Frontier Reasoning Trace
+<details>
+<summary>Gemini 3.8 Deep Reasoning &amp; Architecture Synthesis</summary>
+### Step 1: Constraint Verification
+Analyzing multi-tenant OpenXML generation constraints. Memory budget: $O(1)$ SAX allocation with streaming paragraph emission.
+### Step 2: Vector Geometry Optimization
+Computing affine transforms for ShapeForge DrawingML geometry:
+$$
+\begin{bmatrix}
+x' \\
+y'
+\end{bmatrix}
+=
+\begin{bmatrix}
+\cos\theta & -\sin\theta \\
+\sin\theta & \cos\theta
+\end{bmatrix}
+\begin{bmatrix}
+x \\
+y
+\end{bmatrix}
+$$
+### Step 3: Schema Validation
+Confirming presence of root namespace declarations: `w:`, `a:`, `wp:`, `pic:`, `m:`, `wpg:`, `wps:`, `w15:`. All required structures compiled.
+</details>
+---
+# Code Interpreter Execution Card
+```output
+[MarkSmith Kernel]: Document compiled successfully in 38ms.
+[Diagnostics]: 0 schema violations, 14 vector shapes synthesized.
+[Memory Profile]: 18.2 MB heap allocation, O(1) streaming SAX pipeline.
+```
+---
+# Multi-Column Layout
+:::columns count="2"
+### Architecture Advantages
+- **Pure .NET Core Engine**: Runs anywhere .NET 8 runs.
+- **Mathematical Layout Solver**: Precise bounding box calculations.
+- **Native OMML Equations**: Direct math editor integration.
+### Enterprise Compliance
+- **Zero-Installation Footprint**: No Microsoft Office license on server.
+- **WCAG 2.1 AA Contrast**: Guaranteed legible text ratios.
+- **DLP Protection**: Offline AST transformation.
+:::
+---
+# Hyperlinked Research Citations
+MarkSmith leverages the OpenXML SDK for high-performance document generation[^1], eliminating the need for Office interop[^2].
+[^1]: ECMA-376 5th Edition: Office Open XML File Formats standard.
+[^2]: Microsoft Knowledge Base: Considerations for server-side Automation of Office.
 ---
 # Nested Example
 > ## Quarterly Milestone Summary
@@ -7552,6 +8503,11 @@
 > | Core Engine | 100% | Verified |
 > | ShapeForge | 100% | Verified |
 > | OMML Math | 100% | Verified |
+---
+## References
+1. [ECMA-376 Specification](https://www.ecma-international.org/publications-and-standards/standards/ecma-376/)
+2. [OpenXML SDK GitHub Repository](https://github.com/dotnet/Open-XML-SDK)
+3. [MarkSmith Official Documentation](https://onyachamp.com/marksmith.html)
 ]]></markdown>
 </marksmithSource>
 </file>
</xml_diff>

<commit_message>
feat: Add Executive KPI Dashboards (:::metrics) and Intelligent Proportional Column Solvers to showcase and comparison table
</commit_message>
<xml_diff>
--- a/media/massive-markdown-showcase.docx
+++ b/media/massive-markdown-showcase.docx
@@ -358,7 +358,7 @@
         </w:rPr>
         <w:t xml:space="preserve">, and a </w:t>
       </w:r>
-      <w:hyperlink r:id="R6a9579358f224a98">
+      <w:hyperlink r:id="R11bee901fabd4d8d">
         <w:r>
           <w:rPr>
             <w:color w:val="0563C1"/>
@@ -1699,11 +1699,11 @@
         </w:tblCellMar>
       </w:tblPr>
       <w:tblGrid>
-        <w:gridCol/>
-        <w:gridCol/>
-        <w:gridCol/>
-        <w:gridCol/>
-        <w:gridCol/>
+        <w:gridCol w:w="1724"/>
+        <w:gridCol w:w="1477"/>
+        <w:gridCol w:w="2216"/>
+        <w:gridCol w:w="2463"/>
+        <w:gridCol w:w="1480"/>
       </w:tblGrid>
       <w:tr>
         <w:trPr>
@@ -1712,6 +1712,7 @@
         </w:trPr>
         <w:tc>
           <w:tcPr>
+            <w:tcW w:w="1724" w:type="dxa"/>
             <w:shd w:val="clear" w:color="auto" w:fill="F6F8FA"/>
           </w:tcPr>
           <w:p>
@@ -1734,6 +1735,7 @@
         </w:tc>
         <w:tc>
           <w:tcPr>
+            <w:tcW w:w="1477" w:type="dxa"/>
             <w:shd w:val="clear" w:color="auto" w:fill="F6F8FA"/>
           </w:tcPr>
           <w:p>
@@ -1759,6 +1761,7 @@
         </w:tc>
         <w:tc>
           <w:tcPr>
+            <w:tcW w:w="2216" w:type="dxa"/>
             <w:shd w:val="clear" w:color="auto" w:fill="F6F8FA"/>
           </w:tcPr>
           <w:p>
@@ -1781,6 +1784,7 @@
         </w:tc>
         <w:tc>
           <w:tcPr>
+            <w:tcW w:w="2463" w:type="dxa"/>
             <w:shd w:val="clear" w:color="auto" w:fill="F6F8FA"/>
           </w:tcPr>
           <w:p>
@@ -1810,6 +1814,9 @@
           <w:cantSplit/>
         </w:trPr>
         <w:tc>
+          <w:tcPr>
+            <w:tcW w:w="1724" w:type="dxa"/>
+          </w:tcPr>
           <w:p>
             <w:r>
               <w:rPr>
@@ -1828,6 +1835,9 @@
           </w:p>
         </w:tc>
         <w:tc>
+          <w:tcPr>
+            <w:tcW w:w="1477" w:type="dxa"/>
+          </w:tcPr>
           <w:p>
             <w:pPr>
               <w:jc w:val="center"/>
@@ -1849,6 +1859,9 @@
           </w:p>
         </w:tc>
         <w:tc>
+          <w:tcPr>
+            <w:tcW w:w="2216" w:type="dxa"/>
+          </w:tcPr>
           <w:p>
             <w:r>
               <w:rPr>
@@ -1867,6 +1880,9 @@
           </w:p>
         </w:tc>
         <w:tc>
+          <w:tcPr>
+            <w:tcW w:w="2463" w:type="dxa"/>
+          </w:tcPr>
           <w:p>
             <w:pPr>
               <w:jc w:val="center"/>
@@ -1894,6 +1910,7 @@
         </w:trPr>
         <w:tc>
           <w:tcPr>
+            <w:tcW w:w="1724" w:type="dxa"/>
             <w:shd w:val="clear" w:color="auto" w:fill="F6F8FA"/>
           </w:tcPr>
           <w:p>
@@ -1915,6 +1932,7 @@
         </w:tc>
         <w:tc>
           <w:tcPr>
+            <w:tcW w:w="1477" w:type="dxa"/>
             <w:shd w:val="clear" w:color="auto" w:fill="F6F8FA"/>
           </w:tcPr>
           <w:p>
@@ -1939,6 +1957,7 @@
         </w:tc>
         <w:tc>
           <w:tcPr>
+            <w:tcW w:w="2216" w:type="dxa"/>
             <w:shd w:val="clear" w:color="auto" w:fill="F6F8FA"/>
           </w:tcPr>
           <w:p>
@@ -1960,6 +1979,7 @@
         </w:tc>
         <w:tc>
           <w:tcPr>
+            <w:tcW w:w="2463" w:type="dxa"/>
             <w:shd w:val="clear" w:color="auto" w:fill="F6F8FA"/>
           </w:tcPr>
           <w:p>
@@ -1988,6 +2008,9 @@
           <w:cantSplit/>
         </w:trPr>
         <w:tc>
+          <w:tcPr>
+            <w:tcW w:w="1724" w:type="dxa"/>
+          </w:tcPr>
           <w:p>
             <w:r>
               <w:rPr>
@@ -2006,6 +2029,9 @@
           </w:p>
         </w:tc>
         <w:tc>
+          <w:tcPr>
+            <w:tcW w:w="1477" w:type="dxa"/>
+          </w:tcPr>
           <w:p>
             <w:pPr>
               <w:jc w:val="center"/>
@@ -2027,6 +2053,9 @@
           </w:p>
         </w:tc>
         <w:tc>
+          <w:tcPr>
+            <w:tcW w:w="2216" w:type="dxa"/>
+          </w:tcPr>
           <w:p>
             <w:r>
               <w:rPr>
@@ -2045,6 +2074,9 @@
           </w:p>
         </w:tc>
         <w:tc>
+          <w:tcPr>
+            <w:tcW w:w="2463" w:type="dxa"/>
+          </w:tcPr>
           <w:p>
             <w:pPr>
               <w:jc w:val="center"/>
@@ -2072,6 +2104,7 @@
         </w:trPr>
         <w:tc>
           <w:tcPr>
+            <w:tcW w:w="1724" w:type="dxa"/>
             <w:shd w:val="clear" w:color="auto" w:fill="F6F8FA"/>
           </w:tcPr>
           <w:p>
@@ -2093,6 +2126,7 @@
         </w:tc>
         <w:tc>
           <w:tcPr>
+            <w:tcW w:w="1477" w:type="dxa"/>
             <w:shd w:val="clear" w:color="auto" w:fill="F6F8FA"/>
           </w:tcPr>
           <w:p>
@@ -2117,6 +2151,7 @@
         </w:tc>
         <w:tc>
           <w:tcPr>
+            <w:tcW w:w="2216" w:type="dxa"/>
             <w:shd w:val="clear" w:color="auto" w:fill="F6F8FA"/>
           </w:tcPr>
           <w:p>
@@ -2138,6 +2173,7 @@
         </w:tc>
         <w:tc>
           <w:tcPr>
+            <w:tcW w:w="2463" w:type="dxa"/>
             <w:shd w:val="clear" w:color="auto" w:fill="F6F8FA"/>
           </w:tcPr>
           <w:p>
@@ -2213,10 +2249,10 @@
         </w:tblCellMar>
       </w:tblPr>
       <w:tblGrid>
-        <w:gridCol/>
-        <w:gridCol/>
-        <w:gridCol/>
-        <w:gridCol/>
+        <w:gridCol w:w="2496"/>
+        <w:gridCol w:w="2912"/>
+        <w:gridCol w:w="2703"/>
+        <w:gridCol w:w="1249"/>
       </w:tblGrid>
       <w:tr>
         <w:trPr>
@@ -2225,6 +2261,7 @@
         </w:trPr>
         <w:tc>
           <w:tcPr>
+            <w:tcW w:w="2496" w:type="dxa"/>
             <w:shd w:val="clear" w:color="auto" w:fill="F6F8FA"/>
           </w:tcPr>
           <w:p>
@@ -2247,6 +2284,7 @@
         </w:tc>
         <w:tc>
           <w:tcPr>
+            <w:tcW w:w="2912" w:type="dxa"/>
             <w:shd w:val="clear" w:color="auto" w:fill="F6F8FA"/>
           </w:tcPr>
           <w:p>
@@ -2272,6 +2310,7 @@
         </w:tc>
         <w:tc>
           <w:tcPr>
+            <w:tcW w:w="2703" w:type="dxa"/>
             <w:shd w:val="clear" w:color="auto" w:fill="F6F8FA"/>
           </w:tcPr>
           <w:p>
@@ -2301,6 +2340,9 @@
           <w:cantSplit/>
         </w:trPr>
         <w:tc>
+          <w:tcPr>
+            <w:tcW w:w="2496" w:type="dxa"/>
+          </w:tcPr>
           <w:p>
             <w:r>
               <w:rPr>
@@ -2319,6 +2361,9 @@
           </w:p>
         </w:tc>
         <w:tc>
+          <w:tcPr>
+            <w:tcW w:w="2912" w:type="dxa"/>
+          </w:tcPr>
           <w:p>
             <w:pPr>
               <w:jc w:val="center"/>
@@ -2340,6 +2385,9 @@
           </w:p>
         </w:tc>
         <w:tc>
+          <w:tcPr>
+            <w:tcW w:w="2703" w:type="dxa"/>
+          </w:tcPr>
           <w:p>
             <w:pPr>
               <w:jc w:val="right"/>
@@ -2367,6 +2415,7 @@
         </w:trPr>
         <w:tc>
           <w:tcPr>
+            <w:tcW w:w="2496" w:type="dxa"/>
             <w:shd w:val="clear" w:color="auto" w:fill="F6F8FA"/>
           </w:tcPr>
           <w:p>
@@ -2388,6 +2437,7 @@
         </w:tc>
         <w:tc>
           <w:tcPr>
+            <w:tcW w:w="2912" w:type="dxa"/>
             <w:shd w:val="clear" w:color="auto" w:fill="F6F8FA"/>
           </w:tcPr>
           <w:p>
@@ -2412,6 +2462,7 @@
         </w:tc>
         <w:tc>
           <w:tcPr>
+            <w:tcW w:w="2703" w:type="dxa"/>
             <w:shd w:val="clear" w:color="auto" w:fill="F6F8FA"/>
           </w:tcPr>
           <w:p>
@@ -2440,6 +2491,9 @@
           <w:cantSplit/>
         </w:trPr>
         <w:tc>
+          <w:tcPr>
+            <w:tcW w:w="2496" w:type="dxa"/>
+          </w:tcPr>
           <w:p>
             <w:r>
               <w:rPr>
@@ -2458,6 +2512,9 @@
           </w:p>
         </w:tc>
         <w:tc>
+          <w:tcPr>
+            <w:tcW w:w="2912" w:type="dxa"/>
+          </w:tcPr>
           <w:p>
             <w:pPr>
               <w:jc w:val="center"/>
@@ -2479,6 +2536,9 @@
           </w:p>
         </w:tc>
         <w:tc>
+          <w:tcPr>
+            <w:tcW w:w="2703" w:type="dxa"/>
+          </w:tcPr>
           <w:p>
             <w:pPr>
               <w:jc w:val="right"/>
@@ -2517,21 +2577,216 @@
       <w:pPr>
         <w:pStyle w:val="Heading2"/>
       </w:pPr>
-      <w:bookmarkStart w:name="H_horizontal_rules" w:id="17"/>
-      <w:r>
-        <w:rPr>
-          <mc:AlternateContent>
-            <mc:Choice Requires="w14">
-              <w14:ligatures w14:val="standardContextual"/>
-              <w14:numForm w14:val="oldStyle"/>
-              <w14:numSpacing w14:val="proportional"/>
-              <w14:cntxtAlts/>
-            </mc:Choice>
-          </mc:AlternateContent>
-        </w:rPr>
-        <w:t xml:space="preserve">Horizontal Rules</w:t>
+      <w:bookmarkStart w:name="H_executive_metrics_kpi_dashboard" w:id="17"/>
+      <w:r>
+        <w:rPr>
+          <mc:AlternateContent>
+            <mc:Choice Requires="w14">
+              <w14:ligatures w14:val="standardContextual"/>
+              <w14:numForm w14:val="oldStyle"/>
+              <w14:numSpacing w14:val="proportional"/>
+              <w14:cntxtAlts/>
+            </mc:Choice>
+          </mc:AlternateContent>
+        </w:rPr>
+        <w:t xml:space="preserve">Executive Metrics &amp; KPI Dashboard</w:t>
       </w:r>
       <w:bookmarkEnd w:id="17"/>
+    </w:p>
+    <w:tbl>
+      <w:tblPr>
+        <w:tblW w:w="5000" w:type="pct"/>
+        <w:tblBorders>
+          <w:top w:val="none"/>
+          <w:left w:val="none"/>
+          <w:bottom w:val="none"/>
+          <w:right w:val="none"/>
+          <w:insideH w:val="none"/>
+          <w:insideV w:val="none"/>
+        </w:tblBorders>
+        <w:tblCellMar>
+          <w:top w:w="120" w:type="dxa"/>
+          <w:bottom w:w="120" w:type="dxa"/>
+          <w:left w:w="120" w:type="dxa"/>
+          <w:right w:w="120" w:type="dxa"/>
+        </w:tblCellMar>
+      </w:tblPr>
+      <w:tblGrid>
+        <w:gridCol w:w="2340"/>
+        <w:gridCol w:w="2340"/>
+        <w:gridCol w:w="2340"/>
+        <w:gridCol w:w="2340"/>
+      </w:tblGrid>
+      <w:tr>
+        <w:trPr>
+          <w:cantSplit/>
+        </w:trPr>
+        <w:tc>
+          <w:tcPr>
+            <w:tcW w:w="2340" w:type="dxa"/>
+            <w:shd w:val="clear" w:color="auto" w:fill="EBEBEB"/>
+            <w:tcBorders>
+              <w:top w:val="single" w:color="D1D5DA" w:sz="6"/>
+              <w:left w:val="single" w:color="D1D5DA" w:sz="6"/>
+              <w:bottom w:val="single" w:color="D1D5DA" w:sz="6"/>
+              <w:right w:val="single" w:color="D1D5DA" w:sz="6"/>
+            </w:tcBorders>
+            <w:tcMar>
+              <w:top w:w="180" w:type="dxa"/>
+              <w:bottom w:w="180" w:type="dxa"/>
+              <w:left w:w="200" w:type="dxa"/>
+              <w:right w:w="200" w:type="dxa"/>
+            </w:tcMar>
+          </w:tcPr>
+          <w:p>
+            <w:pPr>
+              <w:spacing w:before="0" w:after="40" w:line="240" w:lineRule="auto"/>
+            </w:pPr>
+            <w:r>
+              <w:rPr>
+                <w:b/>
+                <w:color w:val="000000"/>
+                <w:sz w:val="48"/>
+                <mc:AlternateContent>
+                  <mc:Choice Requires="w14">
+                    <w14:ligatures w14:val="standardContextual"/>
+                    <w14:numForm w14:val="oldStyle"/>
+                    <w14:numSpacing w14:val="proportional"/>
+                    <w14:cntxtAlts/>
+                  </mc:Choice>
+                </mc:AlternateContent>
+              </w:rPr>
+              <w:t xml:space="preserve">$14.2M** Annual Recurring Revenue (+48% YoY)</w:t>
+            </w:r>
+          </w:p>
+          <w:p/>
+        </w:tc>
+        <w:tc>
+          <w:tcPr>
+            <w:tcW w:w="2340" w:type="dxa"/>
+            <w:shd w:val="clear" w:color="auto" w:fill="EBEBEB"/>
+            <w:tcBorders>
+              <w:top w:val="single" w:color="D1D5DA" w:sz="6"/>
+              <w:left w:val="single" w:color="D1D5DA" w:sz="6"/>
+              <w:bottom w:val="single" w:color="D1D5DA" w:sz="6"/>
+              <w:right w:val="single" w:color="D1D5DA" w:sz="6"/>
+            </w:tcBorders>
+            <w:tcMar>
+              <w:top w:w="180" w:type="dxa"/>
+              <w:bottom w:w="180" w:type="dxa"/>
+              <w:left w:w="200" w:type="dxa"/>
+              <w:right w:w="200" w:type="dxa"/>
+            </w:tcMar>
+          </w:tcPr>
+          <w:p>
+            <w:pPr>
+              <w:spacing w:before="0" w:after="40" w:line="240" w:lineRule="auto"/>
+            </w:pPr>
+            <w:r>
+              <w:rPr>
+                <w:b/>
+                <w:color w:val="000000"/>
+                <w:sz w:val="48"/>
+                <mc:AlternateContent>
+                  <mc:Choice Requires="w14">
+                    <w14:ligatures w14:val="standardContextual"/>
+                    <w14:numForm w14:val="oldStyle"/>
+                    <w14:numSpacing w14:val="proportional"/>
+                    <w14:cntxtAlts/>
+                  </mc:Choice>
+                </mc:AlternateContent>
+              </w:rPr>
+              <w:t xml:space="preserve">99.995%** Enterprise SLA Uptime</w:t>
+            </w:r>
+          </w:p>
+          <w:p/>
+        </w:tc>
+        <w:tc>
+          <w:tcPr>
+            <w:tcW w:w="2340" w:type="dxa"/>
+            <w:shd w:val="clear" w:color="auto" w:fill="EBEBEB"/>
+            <w:tcBorders>
+              <w:top w:val="single" w:color="D1D5DA" w:sz="6"/>
+              <w:left w:val="single" w:color="D1D5DA" w:sz="6"/>
+              <w:bottom w:val="single" w:color="D1D5DA" w:sz="6"/>
+              <w:right w:val="single" w:color="D1D5DA" w:sz="6"/>
+            </w:tcBorders>
+            <w:tcMar>
+              <w:top w:w="180" w:type="dxa"/>
+              <w:bottom w:w="180" w:type="dxa"/>
+              <w:left w:w="200" w:type="dxa"/>
+              <w:right w:w="200" w:type="dxa"/>
+            </w:tcMar>
+          </w:tcPr>
+          <w:p>
+            <w:pPr>
+              <w:spacing w:before="0" w:after="40" w:line="240" w:lineRule="auto"/>
+            </w:pPr>
+            <w:r>
+              <w:rPr>
+                <w:b/>
+                <w:color w:val="000000"/>
+                <w:sz w:val="48"/>
+                <mc:AlternateContent>
+                  <mc:Choice Requires="w14">
+                    <w14:ligatures w14:val="standardContextual"/>
+                    <w14:numForm w14:val="oldStyle"/>
+                    <w14:numSpacing w14:val="proportional"/>
+                    <w14:cntxtAlts/>
+                  </mc:Choice>
+                </mc:AlternateContent>
+              </w:rPr>
+              <w:t xml:space="preserve">12ms** Median P99 Edge Latency</w:t>
+            </w:r>
+          </w:p>
+          <w:p/>
+        </w:tc>
+        <w:tc>
+          <w:tcPr>
+            <w:tcW w:w="2340" w:type="dxa"/>
+            <w:shd w:val="clear" w:color="auto" w:fill="EBEBEB"/>
+            <w:tcBorders>
+              <w:top w:val="single" w:color="D1D5DA" w:sz="6"/>
+              <w:left w:val="single" w:color="D1D5DA" w:sz="6"/>
+              <w:bottom w:val="single" w:color="D1D5DA" w:sz="6"/>
+              <w:right w:val="single" w:color="D1D5DA" w:sz="6"/>
+            </w:tcBorders>
+            <w:tcMar>
+              <w:top w:w="180" w:type="dxa"/>
+              <w:bottom w:w="180" w:type="dxa"/>
+              <w:left w:w="200" w:type="dxa"/>
+              <w:right w:w="200" w:type="dxa"/>
+            </w:tcMar>
+          </w:tcPr>
+          <w:p>
+            <w:pPr>
+              <w:spacing w:before="0" w:after="40" w:line="240" w:lineRule="auto"/>
+            </w:pPr>
+            <w:r>
+              <w:rPr>
+                <w:b/>
+                <w:color w:val="000000"/>
+                <w:sz w:val="48"/>
+                <mc:AlternateContent>
+                  <mc:Choice Requires="w14">
+                    <w14:ligatures w14:val="standardContextual"/>
+                    <w14:numForm w14:val="oldStyle"/>
+                    <w14:numSpacing w14:val="proportional"/>
+                    <w14:cntxtAlts/>
+                  </mc:Choice>
+                </mc:AlternateContent>
+              </w:rPr>
+              <w:t xml:space="preserve">0** Unhandled Schema Violations</w:t>
+            </w:r>
+          </w:p>
+          <w:p/>
+        </w:tc>
+      </w:tr>
+    </w:tbl>
+    <w:p>
+      <w:pPr>
+        <w:spacing w:after="160"/>
+      </w:pPr>
     </w:p>
     <w:p>
       <w:pPr>
@@ -2541,19 +2796,24 @@
       </w:pPr>
     </w:p>
     <w:p>
-      <w:r>
-        <w:rPr>
-          <mc:AlternateContent>
-            <mc:Choice Requires="w14">
-              <w14:ligatures w14:val="standardContextual"/>
-              <w14:numForm w14:val="oldStyle"/>
-              <w14:numSpacing w14:val="proportional"/>
-              <w14:cntxtAlts/>
-            </mc:Choice>
-          </mc:AlternateContent>
-        </w:rPr>
-        <w:t xml:space="preserve">Structured section separation.</w:t>
-      </w:r>
+      <w:pPr>
+        <w:pStyle w:val="Heading2"/>
+      </w:pPr>
+      <w:bookmarkStart w:name="H_horizontal_rules" w:id="18"/>
+      <w:r>
+        <w:rPr>
+          <mc:AlternateContent>
+            <mc:Choice Requires="w14">
+              <w14:ligatures w14:val="standardContextual"/>
+              <w14:numForm w14:val="oldStyle"/>
+              <w14:numSpacing w14:val="proportional"/>
+              <w14:cntxtAlts/>
+            </mc:Choice>
+          </mc:AlternateContent>
+        </w:rPr>
+        <w:t xml:space="preserve">Horizontal Rules</w:t>
+      </w:r>
+      <w:bookmarkEnd w:id="18"/>
     </w:p>
     <w:p>
       <w:pPr>
@@ -2563,6 +2823,21 @@
       </w:pPr>
     </w:p>
     <w:p>
+      <w:r>
+        <w:rPr>
+          <mc:AlternateContent>
+            <mc:Choice Requires="w14">
+              <w14:ligatures w14:val="standardContextual"/>
+              <w14:numForm w14:val="oldStyle"/>
+              <w14:numSpacing w14:val="proportional"/>
+              <w14:cntxtAlts/>
+            </mc:Choice>
+          </mc:AlternateContent>
+        </w:rPr>
+        <w:t xml:space="preserve">Structured section separation.</w:t>
+      </w:r>
+    </w:p>
+    <w:p>
       <w:pPr>
         <w:pBdr>
           <w:bottom w:val="wave" w:color="D1D5DA" w:sz="6" w:space="1"/>
@@ -2571,9 +2846,16 @@
     </w:p>
     <w:p>
       <w:pPr>
+        <w:pBdr>
+          <w:bottom w:val="wave" w:color="D1D5DA" w:sz="6" w:space="1"/>
+        </w:pBdr>
+      </w:pPr>
+    </w:p>
+    <w:p>
+      <w:pPr>
         <w:pStyle w:val="Heading2"/>
       </w:pPr>
-      <w:bookmarkStart w:name="H_emoji_keyboard_keys" w:id="18"/>
+      <w:bookmarkStart w:name="H_emoji_keyboard_keys" w:id="19"/>
       <w:r>
         <w:rPr>
           <mc:AlternateContent>
@@ -2587,7 +2869,7 @@
         </w:rPr>
         <w:t xml:space="preserve">Emoji &amp; Keyboard Keys</w:t>
       </w:r>
-      <w:bookmarkEnd w:id="18"/>
+      <w:bookmarkEnd w:id="19"/>
     </w:p>
     <w:p>
       <w:r>
@@ -2943,7 +3225,7 @@
       <w:pPr>
         <w:pStyle w:val="Heading2"/>
       </w:pPr>
-      <w:bookmarkStart w:name="H_footnotes" w:id="19"/>
+      <w:bookmarkStart w:name="H_footnotes" w:id="20"/>
       <w:r>
         <w:rPr>
           <mc:AlternateContent>
@@ -2957,7 +3239,7 @@
         </w:rPr>
         <w:t xml:space="preserve">Footnotes</w:t>
       </w:r>
-      <w:bookmarkEnd w:id="19"/>
+      <w:bookmarkEnd w:id="20"/>
     </w:p>
     <w:p>
       <w:r>
@@ -2973,8 +3255,8 @@
         </w:rPr>
         <w:t xml:space="preserve">Here's a sentence with a reference.</w:t>
       </w:r>
-      <w:bookmarkStart w:name="_fnref_1" w:id="20"/>
-      <w:bookmarkEnd w:id="20"/>
+      <w:bookmarkStart w:name="_fnref_1" w:id="21"/>
+      <w:bookmarkEnd w:id="21"/>
       <w:hyperlink w:history="true" w:anchor="_fn_1">
         <w:r>
           <w:rPr>
@@ -3004,7 +3286,7 @@
       <w:pPr>
         <w:pStyle w:val="Heading2"/>
       </w:pPr>
-      <w:bookmarkStart w:name="H_collapsible_section" w:id="21"/>
+      <w:bookmarkStart w:name="H_collapsible_section" w:id="22"/>
       <w:r>
         <w:rPr>
           <mc:AlternateContent>
@@ -3018,7 +3300,7 @@
         </w:rPr>
         <w:t xml:space="preserve">Collapsible Section</w:t>
       </w:r>
-      <w:bookmarkEnd w:id="21"/>
+      <w:bookmarkEnd w:id="22"/>
     </w:p>
     <w:p>
       <w:pPr>
@@ -3166,7 +3448,7 @@
       <w:pPr>
         <w:pStyle w:val="Heading1"/>
       </w:pPr>
-      <w:bookmarkStart w:name="H_mermaid_diagrams_shapeforgetm" w:id="22"/>
+      <w:bookmarkStart w:name="H_mermaid_diagrams_shapeforgetm" w:id="23"/>
       <w:r>
         <w:rPr>
           <mc:AlternateContent>
@@ -3180,13 +3462,13 @@
         </w:rPr>
         <w:t xml:space="preserve">Mermaid Diagrams (ShapeForge™)</w:t>
       </w:r>
-      <w:bookmarkEnd w:id="22"/>
+      <w:bookmarkEnd w:id="23"/>
     </w:p>
     <w:p>
       <w:pPr>
         <w:pStyle w:val="Heading2"/>
       </w:pPr>
-      <w:bookmarkStart w:name="H_architecture_flowchart" w:id="23"/>
+      <w:bookmarkStart w:name="H_architecture_flowchart" w:id="24"/>
       <w:r>
         <w:rPr>
           <mc:AlternateContent>
@@ -3200,7 +3482,7 @@
         </w:rPr>
         <w:t xml:space="preserve">Architecture Flowchart</w:t>
       </w:r>
-      <w:bookmarkEnd w:id="23"/>
+      <w:bookmarkEnd w:id="24"/>
     </w:p>
     <w:p>
       <w:pPr>
@@ -3791,7 +4073,7 @@
       <w:pPr>
         <w:pStyle w:val="Heading2"/>
       </w:pPr>
-      <w:bookmarkStart w:name="H_sequence_diagram" w:id="24"/>
+      <w:bookmarkStart w:name="H_sequence_diagram" w:id="25"/>
       <w:r>
         <w:rPr>
           <mc:AlternateContent>
@@ -3805,7 +4087,7 @@
         </w:rPr>
         <w:t xml:space="preserve">Sequence Diagram</w:t>
       </w:r>
-      <w:bookmarkEnd w:id="24"/>
+      <w:bookmarkEnd w:id="25"/>
     </w:p>
     <w:p>
       <w:pPr>
@@ -4952,7 +5234,7 @@
       <w:pPr>
         <w:pStyle w:val="Heading1"/>
       </w:pPr>
-      <w:bookmarkStart w:name="H_mathematical_equations_native_omm" w:id="25"/>
+      <w:bookmarkStart w:name="H_mathematical_equations_native_omm" w:id="26"/>
       <w:r>
         <w:rPr>
           <mc:AlternateContent>
@@ -4966,7 +5248,7 @@
         </w:rPr>
         <w:t xml:space="preserve">Mathematical Equations (Native OMML)</w:t>
       </w:r>
-      <w:bookmarkEnd w:id="25"/>
+      <w:bookmarkEnd w:id="26"/>
     </w:p>
     <w:p>
       <w:r>
@@ -5248,7 +5530,7 @@
       <w:pPr>
         <w:pStyle w:val="Heading1"/>
       </w:pPr>
-      <w:bookmarkStart w:name="H_ascii_architecture_diagram" w:id="26"/>
+      <w:bookmarkStart w:name="H_ascii_architecture_diagram" w:id="27"/>
       <w:r>
         <w:rPr>
           <mc:AlternateContent>
@@ -5262,7 +5544,7 @@
         </w:rPr>
         <w:t xml:space="preserve">ASCII Architecture Diagram</w:t>
       </w:r>
-      <w:bookmarkEnd w:id="26"/>
+      <w:bookmarkEnd w:id="27"/>
     </w:p>
     <w:p>
       <w:pPr>
@@ -5433,7 +5715,7 @@
       <w:pPr>
         <w:pStyle w:val="Heading1"/>
       </w:pPr>
-      <w:bookmarkStart w:name="H_project_tree_structure" w:id="27"/>
+      <w:bookmarkStart w:name="H_project_tree_structure" w:id="28"/>
       <w:r>
         <w:rPr>
           <mc:AlternateContent>
@@ -5447,7 +5729,7 @@
         </w:rPr>
         <w:t xml:space="preserve">Project Tree Structure</w:t>
       </w:r>
-      <w:bookmarkEnd w:id="27"/>
+      <w:bookmarkEnd w:id="28"/>
     </w:p>
     <w:p>
       <w:pPr>
@@ -5639,7 +5921,7 @@
       <w:pPr>
         <w:pStyle w:val="Heading1"/>
       </w:pPr>
-      <w:bookmarkStart w:name="H_callout_blocks" w:id="28"/>
+      <w:bookmarkStart w:name="H_callout_blocks" w:id="29"/>
       <w:r>
         <w:rPr>
           <mc:AlternateContent>
@@ -5653,7 +5935,7 @@
         </w:rPr>
         <w:t xml:space="preserve">Callout Blocks</w:t>
       </w:r>
-      <w:bookmarkEnd w:id="28"/>
+      <w:bookmarkEnd w:id="29"/>
     </w:p>
     <w:tbl>
       <w:tblPr>
@@ -6135,7 +6417,7 @@
       <w:pPr>
         <w:pStyle w:val="Heading1"/>
       </w:pPr>
-      <w:bookmarkStart w:name="H_gemini_3_8_frontier_reasoning_tra" w:id="29"/>
+      <w:bookmarkStart w:name="H_gemini_3_8_frontier_reasoning_tra" w:id="30"/>
       <w:r>
         <w:rPr>
           <mc:AlternateContent>
@@ -6149,7 +6431,7 @@
         </w:rPr>
         <w:t xml:space="preserve">Gemini 3.8 Frontier Reasoning Trace</w:t>
       </w:r>
-      <w:bookmarkEnd w:id="29"/>
+      <w:bookmarkEnd w:id="30"/>
     </w:p>
     <w:p>
       <w:pPr>
@@ -6177,7 +6459,7 @@
       <w:pPr>
         <w:pStyle w:val="Heading3"/>
       </w:pPr>
-      <w:bookmarkStart w:name="H_step_1_constraint_verification" w:id="30"/>
+      <w:bookmarkStart w:name="H_step_1_constraint_verification" w:id="31"/>
       <w:r>
         <w:rPr>
           <mc:AlternateContent>
@@ -6191,7 +6473,7 @@
         </w:rPr>
         <w:t xml:space="preserve">Step 1: Constraint Verification</w:t>
       </w:r>
-      <w:bookmarkEnd w:id="30"/>
+      <w:bookmarkEnd w:id="31"/>
     </w:p>
     <w:p>
       <w:r>
@@ -6239,7 +6521,7 @@
       <w:pPr>
         <w:pStyle w:val="Heading3"/>
       </w:pPr>
-      <w:bookmarkStart w:name="H_step_2_vector_geometry_optimizati" w:id="31"/>
+      <w:bookmarkStart w:name="H_step_2_vector_geometry_optimizati" w:id="32"/>
       <w:r>
         <w:rPr>
           <mc:AlternateContent>
@@ -6253,7 +6535,7 @@
         </w:rPr>
         <w:t xml:space="preserve">Step 2: Vector Geometry Optimization</w:t>
       </w:r>
-      <w:bookmarkEnd w:id="31"/>
+      <w:bookmarkEnd w:id="32"/>
     </w:p>
     <w:p>
       <w:r>
@@ -6409,7 +6691,7 @@
       <w:pPr>
         <w:pStyle w:val="Heading3"/>
       </w:pPr>
-      <w:bookmarkStart w:name="H_step_3_schema_validation" w:id="32"/>
+      <w:bookmarkStart w:name="H_step_3_schema_validation" w:id="33"/>
       <w:r>
         <w:rPr>
           <mc:AlternateContent>
@@ -6423,7 +6705,7 @@
         </w:rPr>
         <w:t xml:space="preserve">Step 3: Schema Validation</w:t>
       </w:r>
-      <w:bookmarkEnd w:id="32"/>
+      <w:bookmarkEnd w:id="33"/>
     </w:p>
     <w:p>
       <w:r>
@@ -6635,7 +6917,7 @@
       <w:pPr>
         <w:pStyle w:val="Heading1"/>
       </w:pPr>
-      <w:bookmarkStart w:name="H_code_interpreter_execution_card" w:id="33"/>
+      <w:bookmarkStart w:name="H_code_interpreter_execution_card" w:id="34"/>
       <w:r>
         <w:rPr>
           <mc:AlternateContent>
@@ -6649,7 +6931,7 @@
         </w:rPr>
         <w:t xml:space="preserve">Code Interpreter Execution Card</w:t>
       </w:r>
-      <w:bookmarkEnd w:id="33"/>
+      <w:bookmarkEnd w:id="34"/>
     </w:p>
     <w:p>
       <w:pPr>
@@ -6689,7 +6971,7 @@
       <w:pPr>
         <w:pStyle w:val="Heading1"/>
       </w:pPr>
-      <w:bookmarkStart w:name="H_multi_column_layout" w:id="34"/>
+      <w:bookmarkStart w:name="H_multi_column_layout" w:id="35"/>
       <w:r>
         <w:rPr>
           <mc:AlternateContent>
@@ -6703,7 +6985,7 @@
         </w:rPr>
         <w:t xml:space="preserve">Multi-Column Layout</w:t>
       </w:r>
-      <w:bookmarkEnd w:id="34"/>
+      <w:bookmarkEnd w:id="35"/>
     </w:p>
     <w:p>
       <w:pPr>
@@ -6984,7 +7266,7 @@
       <w:pPr>
         <w:pStyle w:val="Heading1"/>
       </w:pPr>
-      <w:bookmarkStart w:name="H_hyperlinked_research_citations" w:id="35"/>
+      <w:bookmarkStart w:name="H_hyperlinked_research_citations" w:id="36"/>
       <w:r>
         <w:rPr>
           <mc:AlternateContent>
@@ -6998,7 +7280,7 @@
         </w:rPr>
         <w:t xml:space="preserve">Hyperlinked Research Citations</w:t>
       </w:r>
-      <w:bookmarkEnd w:id="35"/>
+      <w:bookmarkEnd w:id="36"/>
     </w:p>
     <w:p>
       <w:r>
@@ -7014,8 +7296,8 @@
         </w:rPr>
         <w:t xml:space="preserve">MarkSmith leverages the OpenXML SDK for high-performance document generation</w:t>
       </w:r>
-      <w:bookmarkStart w:name="_fnref_2" w:id="36"/>
-      <w:bookmarkEnd w:id="36"/>
+      <w:bookmarkStart w:name="_fnref_2" w:id="37"/>
+      <w:bookmarkEnd w:id="37"/>
       <w:hyperlink w:history="true" w:anchor="_fn_2">
         <w:r>
           <w:rPr>
@@ -7046,8 +7328,8 @@
         </w:rPr>
         <w:t xml:space="preserve">, eliminating the need for Office interop</w:t>
       </w:r>
-      <w:bookmarkStart w:name="_fnref_3" w:id="37"/>
-      <w:bookmarkEnd w:id="37"/>
+      <w:bookmarkStart w:name="_fnref_3" w:id="38"/>
+      <w:bookmarkEnd w:id="38"/>
       <w:hyperlink w:history="true" w:anchor="_fn_3">
         <w:r>
           <w:rPr>
@@ -7090,7 +7372,7 @@
       <w:pPr>
         <w:pStyle w:val="Heading1"/>
       </w:pPr>
-      <w:bookmarkStart w:name="H_nested_example" w:id="38"/>
+      <w:bookmarkStart w:name="H_nested_example" w:id="39"/>
       <w:r>
         <w:rPr>
           <mc:AlternateContent>
@@ -7104,7 +7386,7 @@
         </w:rPr>
         <w:t xml:space="preserve">Nested Example</w:t>
       </w:r>
-      <w:bookmarkEnd w:id="38"/>
+      <w:bookmarkEnd w:id="39"/>
     </w:p>
     <w:p>
       <w:pPr>
@@ -7115,7 +7397,7 @@
         <w:shd w:val="clear" w:color="auto" w:fill="F6F8FA"/>
         <w:ind w:left="360"/>
       </w:pPr>
-      <w:bookmarkStart w:name="H_quarterly_milestone_summary" w:id="39"/>
+      <w:bookmarkStart w:name="H_quarterly_milestone_summary" w:id="40"/>
       <w:r>
         <w:rPr>
           <mc:AlternateContent>
@@ -7129,7 +7411,7 @@
         </w:rPr>
         <w:t xml:space="preserve">Quarterly Milestone Summary</w:t>
       </w:r>
-      <w:bookmarkEnd w:id="39"/>
+      <w:bookmarkEnd w:id="40"/>
     </w:p>
     <w:p>
       <w:pPr>
@@ -7231,10 +7513,10 @@
         </w:tblCellMar>
       </w:tblPr>
       <w:tblGrid>
-        <w:gridCol/>
-        <w:gridCol/>
-        <w:gridCol/>
-        <w:gridCol/>
+        <w:gridCol w:w="2941"/>
+        <w:gridCol w:w="2674"/>
+        <w:gridCol w:w="2139"/>
+        <w:gridCol w:w="1606"/>
       </w:tblGrid>
       <w:tr>
         <w:trPr>
@@ -7243,6 +7525,7 @@
         </w:trPr>
         <w:tc>
           <w:tcPr>
+            <w:tcW w:w="2941" w:type="dxa"/>
             <w:shd w:val="clear" w:color="auto" w:fill="F6F8FA"/>
           </w:tcPr>
           <w:p>
@@ -7265,6 +7548,7 @@
         </w:tc>
         <w:tc>
           <w:tcPr>
+            <w:tcW w:w="2674" w:type="dxa"/>
             <w:shd w:val="clear" w:color="auto" w:fill="F6F8FA"/>
           </w:tcPr>
           <w:p>
@@ -7290,6 +7574,7 @@
         </w:tc>
         <w:tc>
           <w:tcPr>
+            <w:tcW w:w="2139" w:type="dxa"/>
             <w:shd w:val="clear" w:color="auto" w:fill="F6F8FA"/>
           </w:tcPr>
           <w:p>
@@ -7319,6 +7604,9 @@
           <w:cantSplit/>
         </w:trPr>
         <w:tc>
+          <w:tcPr>
+            <w:tcW w:w="2941" w:type="dxa"/>
+          </w:tcPr>
           <w:p>
             <w:r>
               <w:rPr>
@@ -7337,6 +7625,9 @@
           </w:p>
         </w:tc>
         <w:tc>
+          <w:tcPr>
+            <w:tcW w:w="2674" w:type="dxa"/>
+          </w:tcPr>
           <w:p>
             <w:pPr>
               <w:jc w:val="center"/>
@@ -7358,6 +7649,9 @@
           </w:p>
         </w:tc>
         <w:tc>
+          <w:tcPr>
+            <w:tcW w:w="2139" w:type="dxa"/>
+          </w:tcPr>
           <w:p>
             <w:pPr>
               <w:jc w:val="center"/>
@@ -7385,6 +7679,7 @@
         </w:trPr>
         <w:tc>
           <w:tcPr>
+            <w:tcW w:w="2941" w:type="dxa"/>
             <w:shd w:val="clear" w:color="auto" w:fill="F6F8FA"/>
           </w:tcPr>
           <w:p>
@@ -7406,6 +7701,7 @@
         </w:tc>
         <w:tc>
           <w:tcPr>
+            <w:tcW w:w="2674" w:type="dxa"/>
             <w:shd w:val="clear" w:color="auto" w:fill="F6F8FA"/>
           </w:tcPr>
           <w:p>
@@ -7430,6 +7726,7 @@
         </w:tc>
         <w:tc>
           <w:tcPr>
+            <w:tcW w:w="2139" w:type="dxa"/>
             <w:shd w:val="clear" w:color="auto" w:fill="F6F8FA"/>
           </w:tcPr>
           <w:p>
@@ -7458,6 +7755,9 @@
           <w:cantSplit/>
         </w:trPr>
         <w:tc>
+          <w:tcPr>
+            <w:tcW w:w="2941" w:type="dxa"/>
+          </w:tcPr>
           <w:p>
             <w:r>
               <w:rPr>
@@ -7476,6 +7776,9 @@
           </w:p>
         </w:tc>
         <w:tc>
+          <w:tcPr>
+            <w:tcW w:w="2674" w:type="dxa"/>
+          </w:tcPr>
           <w:p>
             <w:pPr>
               <w:jc w:val="center"/>
@@ -7497,6 +7800,9 @@
           </w:p>
         </w:tc>
         <w:tc>
+          <w:tcPr>
+            <w:tcW w:w="2139" w:type="dxa"/>
+          </w:tcPr>
           <w:p>
             <w:pPr>
               <w:jc w:val="center"/>
@@ -7540,7 +7846,7 @@
       <w:pPr>
         <w:pStyle w:val="Heading2"/>
       </w:pPr>
-      <w:bookmarkStart w:name="H_references" w:id="40"/>
+      <w:bookmarkStart w:name="H_references" w:id="41"/>
       <w:r>
         <w:rPr>
           <mc:AlternateContent>
@@ -7554,7 +7860,7 @@
         </w:rPr>
         <w:t xml:space="preserve">References</w:t>
       </w:r>
-      <w:bookmarkEnd w:id="40"/>
+      <w:bookmarkEnd w:id="41"/>
     </w:p>
     <w:p>
       <w:pPr>
@@ -7564,7 +7870,7 @@
         </w:numPr>
         <w:contextualSpacing/>
       </w:pPr>
-      <w:hyperlink r:id="R26fad0782a0e463f">
+      <w:hyperlink r:id="R7f7282e8969b4a8d">
         <w:r>
           <w:rPr>
             <w:color w:val="0563C1"/>
@@ -7590,7 +7896,7 @@
         </w:numPr>
         <w:contextualSpacing/>
       </w:pPr>
-      <w:hyperlink r:id="Rebb4e2243e474fe5">
+      <w:hyperlink r:id="R195ca59da48f4ee8">
         <w:r>
           <w:rPr>
             <w:color w:val="0563C1"/>
@@ -7616,7 +7922,7 @@
         </w:numPr>
         <w:contextualSpacing/>
       </w:pPr>
-      <w:hyperlink r:id="Re7844764dbd64fe8">
+      <w:hyperlink r:id="R3d88de88c7694729">
         <w:r>
           <w:rPr>
             <w:color w:val="0563C1"/>
@@ -7635,7 +7941,7 @@
       </w:hyperlink>
     </w:p>
     <w:p>
-      <w:bookmarkStart w:name="_fn_1" w:id="43"/>
+      <w:bookmarkStart w:name="_fn_1" w:id="44"/>
       <w:hyperlink w:history="true" w:anchor="_fnref_1">
         <w:r>
           <w:rPr>
@@ -7653,7 +7959,7 @@
           <w:t xml:space="preserve">[1] </w:t>
         </w:r>
       </w:hyperlink>
-      <w:bookmarkEnd w:id="43"/>
+      <w:bookmarkEnd w:id="44"/>
       <w:r>
         <w:rPr>
           <mc:AlternateContent>
@@ -7667,8 +7973,8 @@
         </w:rPr>
         <w:t xml:space="preserve">This is the footnote text compiled into Word's native footnote collection.</w:t>
       </w:r>
-      <w:bookmarkStart w:name="_fnref_1" w:id="41"/>
-      <w:bookmarkEnd w:id="41"/>
+      <w:bookmarkStart w:name="_fnref_1" w:id="42"/>
+      <w:bookmarkEnd w:id="42"/>
       <w:hyperlink w:history="true" w:anchor="_fn_1">
         <w:r>
           <w:rPr>
@@ -7686,8 +7992,8 @@
           <w:t xml:space="preserve">[1]</w:t>
         </w:r>
       </w:hyperlink>
-      <w:bookmarkStart w:name="_fnref_2" w:id="42"/>
-      <w:bookmarkEnd w:id="42"/>
+      <w:bookmarkStart w:name="_fnref_2" w:id="43"/>
+      <w:bookmarkEnd w:id="43"/>
       <w:hyperlink w:history="true" w:anchor="_fn_2">
         <w:r>
           <w:rPr>
@@ -7723,7 +8029,7 @@
       </w:hyperlink>
     </w:p>
     <w:p>
-      <w:bookmarkStart w:name="_fn_2" w:id="45"/>
+      <w:bookmarkStart w:name="_fn_2" w:id="46"/>
       <w:hyperlink w:history="true" w:anchor="_fnref_2">
         <w:r>
           <w:rPr>
@@ -7741,22 +8047,22 @@
           <w:t xml:space="preserve">[2] </w:t>
         </w:r>
       </w:hyperlink>
+      <w:bookmarkEnd w:id="46"/>
+      <w:r>
+        <w:rPr>
+          <mc:AlternateContent>
+            <mc:Choice Requires="w14">
+              <w14:ligatures w14:val="standardContextual"/>
+              <w14:numForm w14:val="oldStyle"/>
+              <w14:numSpacing w14:val="proportional"/>
+              <w14:cntxtAlts/>
+            </mc:Choice>
+          </mc:AlternateContent>
+        </w:rPr>
+        <w:t xml:space="preserve">Microsoft Knowledge Base: Considerations for server-side Automation of Office.</w:t>
+      </w:r>
+      <w:bookmarkStart w:name="_fnref_3" w:id="45"/>
       <w:bookmarkEnd w:id="45"/>
-      <w:r>
-        <w:rPr>
-          <mc:AlternateContent>
-            <mc:Choice Requires="w14">
-              <w14:ligatures w14:val="standardContextual"/>
-              <w14:numForm w14:val="oldStyle"/>
-              <w14:numSpacing w14:val="proportional"/>
-              <w14:cntxtAlts/>
-            </mc:Choice>
-          </mc:AlternateContent>
-        </w:rPr>
-        <w:t xml:space="preserve">Microsoft Knowledge Base: Considerations for server-side Automation of Office.</w:t>
-      </w:r>
-      <w:bookmarkStart w:name="_fnref_3" w:id="44"/>
-      <w:bookmarkEnd w:id="44"/>
       <w:hyperlink w:history="true" w:anchor="_fn_3">
         <w:r>
           <w:rPr>
@@ -7792,8 +8098,8 @@
       </w:hyperlink>
     </w:p>
     <w:sectPr>
-      <w:headerReference w:type="default" r:id="Rd76f00fb7d0648e5"/>
-      <w:footerReference w:type="default" r:id="R0170e8f2c034419e"/>
+      <w:headerReference w:type="default" r:id="R038bbb3ed99144c2"/>
+      <w:footerReference w:type="default" r:id="R2a6836c7c6fd4a46"/>
       <w:pgSz w:w="11906" w:h="16838"/>
       <w:pgMar w:top="1440" w:right="1440" w:bottom="1440" w:left="1440" w:header="576" w:footer="576" w:gutter="0"/>
     </w:sectPr>
@@ -8231,7 +8537,7 @@
 </file>
 
 <file path=customXml/item.xml><?xml version="1.0" encoding="utf-8"?>
-<marksmithSource schema="marksmith-source-v1" version="3.1.0.0" exportedUtc="2026-09-03T02:16:04.4248315Z" theme="GitHub Light" mermaidMode="1">
+<marksmithSource schema="marksmith-source-v1" version="3.1.0.0" exportedUtc="2026-09-04T03:57:18.3103703Z" theme="GitHub Light" mermaidMode="1">
   <markdown><![CDATA[# Massive Markdown Showcase
 A comprehensive demonstration of Markdown syntax and extensions compiled to native ECMA-376 Microsoft Word OpenXML by **MarkSmith**.
 ---
@@ -8321,6 +8627,14 @@
 | Apple | Orange | Banana |
 | Cat | Dog | Mouse |
 | One | Two | Three |
+---
+## Executive Metrics & KPI Dashboard
+:::metrics cols=4
+- **$14.2M** Annual Recurring Revenue (+48% YoY)
+- **99.995%** Enterprise SLA Uptime
+- **12ms** Median P99 Edge Latency
+- **0** Unhandled Schema Violations
+:::
 ---
 ## Horizontal Rules
 ---

</xml_diff>

<commit_message>
fix(media): replace the black word-gauntlet capture with the real screenshot
media/word-gauntlet.png was a 3,233-byte, 1440x753 frame of solid black -- a
failed capture that has been live on marksmith.html since 9ec66cd, under alt
text promising "equations, code and a complex table". Anyone loading the page
saw a black rectangle where the strongest proof of the engine should be.

Replaced with the canonical 395,421-byte capture from marksmith main
(2674x1871): the two-page OpenXML Gauntlet spread showing rendered OMML
equations, the syntax-highlighted Rust block and the nested layout table.

Also picks up the current massive-markdown-showcase.docx export.
</commit_message>
<xml_diff>
--- a/media/massive-markdown-showcase.docx
+++ b/media/massive-markdown-showcase.docx
@@ -358,7 +358,7 @@
         </w:rPr>
         <w:t xml:space="preserve">, and a </w:t>
       </w:r>
-      <w:hyperlink r:id="R11bee901fabd4d8d">
+      <w:hyperlink r:id="R442472aeea064876">
         <w:r>
           <w:rPr>
             <w:color w:val="0563C1"/>
@@ -1693,8 +1693,8 @@
         </w:tblBorders>
         <w:tblCellMar>
           <w:top w:w="120" w:type="dxa"/>
+          <w:left w:w="180" w:type="dxa"/>
           <w:bottom w:w="120" w:type="dxa"/>
-          <w:left w:w="180" w:type="dxa"/>
           <w:right w:w="180" w:type="dxa"/>
         </w:tblCellMar>
       </w:tblPr>
@@ -2243,8 +2243,8 @@
         </w:tblBorders>
         <w:tblCellMar>
           <w:top w:w="120" w:type="dxa"/>
+          <w:left w:w="180" w:type="dxa"/>
           <w:bottom w:w="120" w:type="dxa"/>
-          <w:left w:w="180" w:type="dxa"/>
           <w:right w:w="180" w:type="dxa"/>
         </w:tblCellMar>
       </w:tblPr>
@@ -2606,8 +2606,8 @@
         </w:tblBorders>
         <w:tblCellMar>
           <w:top w:w="120" w:type="dxa"/>
+          <w:left w:w="120" w:type="dxa"/>
           <w:bottom w:w="120" w:type="dxa"/>
-          <w:left w:w="120" w:type="dxa"/>
           <w:right w:w="120" w:type="dxa"/>
         </w:tblCellMar>
       </w:tblPr>
@@ -2633,8 +2633,8 @@
             </w:tcBorders>
             <w:tcMar>
               <w:top w:w="180" w:type="dxa"/>
+              <w:left w:w="200" w:type="dxa"/>
               <w:bottom w:w="180" w:type="dxa"/>
-              <w:left w:w="200" w:type="dxa"/>
               <w:right w:w="200" w:type="dxa"/>
             </w:tcMar>
           </w:tcPr>
@@ -2673,8 +2673,8 @@
             </w:tcBorders>
             <w:tcMar>
               <w:top w:w="180" w:type="dxa"/>
+              <w:left w:w="200" w:type="dxa"/>
               <w:bottom w:w="180" w:type="dxa"/>
-              <w:left w:w="200" w:type="dxa"/>
               <w:right w:w="200" w:type="dxa"/>
             </w:tcMar>
           </w:tcPr>
@@ -2713,8 +2713,8 @@
             </w:tcBorders>
             <w:tcMar>
               <w:top w:w="180" w:type="dxa"/>
+              <w:left w:w="200" w:type="dxa"/>
               <w:bottom w:w="180" w:type="dxa"/>
-              <w:left w:w="200" w:type="dxa"/>
               <w:right w:w="200" w:type="dxa"/>
             </w:tcMar>
           </w:tcPr>
@@ -2753,8 +2753,8 @@
             </w:tcBorders>
             <w:tcMar>
               <w:top w:w="180" w:type="dxa"/>
+              <w:left w:w="200" w:type="dxa"/>
               <w:bottom w:w="180" w:type="dxa"/>
-              <w:left w:w="200" w:type="dxa"/>
               <w:right w:w="200" w:type="dxa"/>
             </w:tcMar>
           </w:tcPr>
@@ -3305,7 +3305,7 @@
     <w:p>
       <w:pPr>
         <w:pStyle w:val="Heading4"/>
-        <w:outlineLvl w:val="3"/>
+        <w:outlineLvl w:val="8"/>
         <w15:collapsed w:val="true"/>
       </w:pPr>
       <w:r>
@@ -6436,7 +6436,7 @@
     <w:p>
       <w:pPr>
         <w:pStyle w:val="Heading4"/>
-        <w:outlineLvl w:val="3"/>
+        <w:outlineLvl w:val="8"/>
         <w15:collapsed w:val="true"/>
       </w:pPr>
       <w:r>
@@ -7507,8 +7507,8 @@
         </w:tblBorders>
         <w:tblCellMar>
           <w:top w:w="120" w:type="dxa"/>
+          <w:left w:w="180" w:type="dxa"/>
           <w:bottom w:w="120" w:type="dxa"/>
-          <w:left w:w="180" w:type="dxa"/>
           <w:right w:w="180" w:type="dxa"/>
         </w:tblCellMar>
       </w:tblPr>
@@ -7870,7 +7870,7 @@
         </w:numPr>
         <w:contextualSpacing/>
       </w:pPr>
-      <w:hyperlink r:id="R7f7282e8969b4a8d">
+      <w:hyperlink r:id="Re0d3e6876fb14118">
         <w:r>
           <w:rPr>
             <w:color w:val="0563C1"/>
@@ -7896,7 +7896,7 @@
         </w:numPr>
         <w:contextualSpacing/>
       </w:pPr>
-      <w:hyperlink r:id="R195ca59da48f4ee8">
+      <w:hyperlink r:id="Rf84cbffde20743b1">
         <w:r>
           <w:rPr>
             <w:color w:val="0563C1"/>
@@ -7922,7 +7922,7 @@
         </w:numPr>
         <w:contextualSpacing/>
       </w:pPr>
-      <w:hyperlink r:id="R3d88de88c7694729">
+      <w:hyperlink r:id="R3f6daac4e2bb4c67">
         <w:r>
           <w:rPr>
             <w:color w:val="0563C1"/>
@@ -7942,23 +7942,21 @@
     </w:p>
     <w:p>
       <w:bookmarkStart w:name="_fn_1" w:id="44"/>
-      <w:hyperlink w:history="true" w:anchor="_fnref_1">
-        <w:r>
-          <w:rPr>
-            <w:b/>
-            <w:color w:val="0563C1"/>
-            <mc:AlternateContent>
-              <mc:Choice Requires="w14">
-                <w14:ligatures w14:val="standardContextual"/>
-                <w14:numForm w14:val="oldStyle"/>
-                <w14:numSpacing w14:val="proportional"/>
-                <w14:cntxtAlts/>
-              </mc:Choice>
-            </mc:AlternateContent>
-          </w:rPr>
-          <w:t xml:space="preserve">[1] </w:t>
-        </w:r>
-      </w:hyperlink>
+      <w:r>
+        <w:rPr>
+          <w:b/>
+          <w:color w:val="1B1F23"/>
+          <mc:AlternateContent>
+            <mc:Choice Requires="w14">
+              <w14:ligatures w14:val="standardContextual"/>
+              <w14:numForm w14:val="oldStyle"/>
+              <w14:numSpacing w14:val="proportional"/>
+              <w14:cntxtAlts/>
+            </mc:Choice>
+          </mc:AlternateContent>
+        </w:rPr>
+        <w:t xml:space="preserve">[1] </w:t>
+      </w:r>
       <w:bookmarkEnd w:id="44"/>
       <w:r>
         <w:rPr>
@@ -8030,23 +8028,21 @@
     </w:p>
     <w:p>
       <w:bookmarkStart w:name="_fn_2" w:id="46"/>
-      <w:hyperlink w:history="true" w:anchor="_fnref_2">
-        <w:r>
-          <w:rPr>
-            <w:b/>
-            <w:color w:val="0563C1"/>
-            <mc:AlternateContent>
-              <mc:Choice Requires="w14">
-                <w14:ligatures w14:val="standardContextual"/>
-                <w14:numForm w14:val="oldStyle"/>
-                <w14:numSpacing w14:val="proportional"/>
-                <w14:cntxtAlts/>
-              </mc:Choice>
-            </mc:AlternateContent>
-          </w:rPr>
-          <w:t xml:space="preserve">[2] </w:t>
-        </w:r>
-      </w:hyperlink>
+      <w:r>
+        <w:rPr>
+          <w:b/>
+          <w:color w:val="1B1F23"/>
+          <mc:AlternateContent>
+            <mc:Choice Requires="w14">
+              <w14:ligatures w14:val="standardContextual"/>
+              <w14:numForm w14:val="oldStyle"/>
+              <w14:numSpacing w14:val="proportional"/>
+              <w14:cntxtAlts/>
+            </mc:Choice>
+          </mc:AlternateContent>
+        </w:rPr>
+        <w:t xml:space="preserve">[2] </w:t>
+      </w:r>
       <w:bookmarkEnd w:id="46"/>
       <w:r>
         <w:rPr>
@@ -8098,8 +8094,8 @@
       </w:hyperlink>
     </w:p>
     <w:sectPr>
-      <w:headerReference w:type="default" r:id="R038bbb3ed99144c2"/>
-      <w:footerReference w:type="default" r:id="R2a6836c7c6fd4a46"/>
+      <w:headerReference w:type="default" r:id="R6d95d6f6cf39495e"/>
+      <w:footerReference w:type="default" r:id="R57ad755f9e5c4e2c"/>
       <w:pgSz w:w="11906" w:h="16838"/>
       <w:pgMar w:top="1440" w:right="1440" w:bottom="1440" w:left="1440" w:header="576" w:footer="576" w:gutter="0"/>
     </w:sectPr>
@@ -8537,7 +8533,7 @@
 </file>
 
 <file path=customXml/item.xml><?xml version="1.0" encoding="utf-8"?>
-<marksmithSource schema="marksmith-source-v1" version="3.1.0.0" exportedUtc="2026-09-04T03:57:18.3103703Z" theme="GitHub Light" mermaidMode="1">
+<marksmithSource schema="marksmith-source-v1" version="3.1.0.0" exportedUtc="2026-09-06T08:21:32.8071289Z" theme="GitHub Light" mermaidMode="1">
   <markdown><![CDATA[# Massive Markdown Showcase
 A comprehensive demonstration of Markdown syntax and extensions compiled to native ECMA-376 Microsoft Word OpenXML by **MarkSmith**.
 ---

</xml_diff>